<commit_message>
fix(p4): rebuild MIR blinded docx — stale since b339893 (5 manuscript commits behind)
Manuscript had AI voice revisions (e71e583), ORCID/author block (f008c11, 55744b4),
R1 sensitivity + TODO fixes (c1ca209), conceptual model updates (851f1f3).
Blinded docx now reflects current p4_singapore_en_clean.md state.

https://claude.ai/code/session_01GMFmEtt6FYiJ4MKzBNCLqb
</commit_message>
<xml_diff>
--- a/p4/submission/mir_package/01_manuscript_blinded.docx
+++ b/p4/submission/mir_package/01_manuscript_blinded.docx
@@ -2,7 +2,7 @@
 <file path=word/document.xml><?xml version="1.0" encoding="utf-8"?>
 <w:document xmlns:w="http://schemas.openxmlformats.org/wordprocessingml/2006/main" xmlns:m="http://schemas.openxmlformats.org/officeDocument/2006/math" xmlns:r="http://schemas.openxmlformats.org/officeDocument/2006/relationships" xmlns:o="urn:schemas-microsoft-com:office:office" xmlns:v="urn:schemas-microsoft-com:vml" xmlns:w10="urn:schemas-microsoft-com:office:word" xmlns:a="http://schemas.openxmlformats.org/drawingml/2006/main" xmlns:pic="http://schemas.openxmlformats.org/drawingml/2006/picture" xmlns:wp="http://schemas.openxmlformats.org/drawingml/2006/wordprocessingDrawing">
   <w:body>
-    <w:bookmarkStart w:id="109" w:name="X07c3a2f9ec246b5120b9b19625fb58c0a5f9521"/>
+    <w:bookmarkStart w:id="107" w:name="X07c3a2f9ec246b5120b9b19625fb58c0a5f9521"/>
     <w:p>
       <w:pPr>
         <w:pStyle w:val="Heading1"/>
@@ -10,62 +10,6 @@
       <w:r>
         <w:t xml:space="preserve">Technological Capability, Digital Adoption, and the Internationalization–Performance Relationship: A Firm-Level Study of Singapore</w:t>
       </w:r>
-    </w:p>
-    <w:p>
-      <w:pPr>
-        <w:pStyle w:val="FirstParagraph"/>
-      </w:pPr>
-      <w:r>
-        <w:rPr>
-          <w:bCs/>
-          <w:b/>
-        </w:rPr>
-        <w:t xml:space="preserve">Phan Anh Tu</w:t>
-      </w:r>
-      <w:r>
-        <w:t xml:space="preserve"> </w:t>
-      </w:r>
-      <w:r>
-        <w:rPr>
-          <w:iCs/>
-          <w:i/>
-        </w:rPr>
-        <w:t xml:space="preserve">(Corresponding author)</w:t>
-      </w:r>
-      <w:r>
-        <w:t xml:space="preserve"> </w:t>
-      </w:r>
-      <w:r>
-        <w:t xml:space="preserve">· College of Economics, Can Tho University ·</w:t>
-      </w:r>
-      <w:r>
-        <w:t xml:space="preserve"> </w:t>
-      </w:r>
-      <w:hyperlink r:id="rId20">
-        <w:r>
-          <w:rPr>
-            <w:rStyle w:val="Hyperlink"/>
-          </w:rPr>
-          <w:t xml:space="preserve">patu@ctu.edu.vn</w:t>
-        </w:r>
-      </w:hyperlink>
-      <w:r>
-        <w:t xml:space="preserve"> </w:t>
-      </w:r>
-      <w:r>
-        <w:t xml:space="preserve">· ORCID:</w:t>
-      </w:r>
-      <w:r>
-        <w:t xml:space="preserve"> </w:t>
-      </w:r>
-      <w:hyperlink r:id="rId21">
-        <w:r>
-          <w:rPr>
-            <w:rStyle w:val="Hyperlink"/>
-          </w:rPr>
-          <w:t xml:space="preserve">0000-0003-0667-3137</w:t>
-        </w:r>
-      </w:hyperlink>
     </w:p>
     <w:p>
       <w:r>
@@ -151,7 +95,7 @@
         </w:pict>
       </w:r>
     </w:p>
-    <w:bookmarkStart w:id="22" w:name="abstract"/>
+    <w:bookmarkStart w:id="20" w:name="abstract"/>
     <w:p>
       <w:pPr>
         <w:pStyle w:val="Heading2"/>
@@ -194,23 +138,160 @@
         <w:t xml:space="preserve">internationalization–performance relationship; digital adoption; technological capability; export intensity; labour productivity; Singapore</w:t>
       </w:r>
     </w:p>
+    <w:bookmarkEnd w:id="20"/>
+    <w:bookmarkStart w:id="25" w:name="Xe3d0fc0bea9a42ce7605565d0964033d7f6ee47"/>
+    <w:p>
+      <w:pPr>
+        <w:pStyle w:val="Heading2"/>
+      </w:pPr>
+      <w:r>
+        <w:t xml:space="preserve">1 Introduction</w:t>
+      </w:r>
+    </w:p>
+    <w:bookmarkStart w:id="21" w:name="Xe5b26b80b1cffd635bf6d81ca2944b40daaf62d"/>
+    <w:p>
+      <w:pPr>
+        <w:pStyle w:val="Heading3"/>
+      </w:pPr>
+      <w:r>
+        <w:t xml:space="preserve">1.1 Background and motivation</w:t>
+      </w:r>
+    </w:p>
+    <w:p>
+      <w:pPr>
+        <w:pStyle w:val="FirstParagraph"/>
+      </w:pPr>
+      <w:r>
+        <w:t xml:space="preserve">Singapore is an analytically valuable setting for revisiting the internationalization–performance relationship because it combines high digital maturity with firm-level heterogeneity in export intensity. The classic I–P literature explains nonlinearity through a trade-off between the scale and learning benefits of international expansion and the rising coordination costs of operating across markets, with the inverted-U emerging as the modal empirical pattern in the broader literature (Marano et al. 2016). However, much of this literature was developed in pre-digital or transitional-digital settings, where institutional and infrastructural conditions differ substantially from those of digitally advanced economies (Peng 2003; Peng et al. 2008) and may not fully capture how the I–P curve behaves when firms operate in a digitally advanced institutional environment. These conditions are empirically grounded in contemporaneous assessments: Singapore ranked 2nd globally in the StartupBlink Innovators Business Environment Index 2026 (score 99.145 out of 100; 1st in Asia Pacific), 4th in the Global Startup Ecosystem Index 2025 (up from 5th in 2024, with ecosystem growth of 44.9% against a top-20 average of 28.5%), and 3rd in the United Nations e-Government Survey 2024, while the Smart Nation 2.0 initiative (launched 2024) formalizes digital trust infrastructure and technology-enabled growth as explicit national policy priorities (GovTech Singapore, 2024; StartupBlink, 2025, 2026).</w:t>
+      </w:r>
+      <w:r>
+        <w:t xml:space="preserve"> </w:t>
+      </w:r>
+      <w:r>
+        <w:t xml:space="preserve">In such contexts, the relevant question is not simply whether firms still exhibit the conventional inverted-U, but whether digital maturity changes the export range over which the right-side decline becomes empirically visible. If mature digital infrastructure attenuates communication, transaction, and information frictions, then the coordination-cost mechanism underlying the classic inverted-U may be weakened, delayed, or pushed toward sparsely populated levels of export intensity. This possibility is especially important in environments where firms engage with digital interfaces and transaction systems at scale, because such technologies can alter both the cost and speed of cross-border coordination (Bharadwaj et al. 2013; Verhoef et al. 2021).</w:t>
+      </w:r>
+      <w:r>
+        <w:t xml:space="preserve"> </w:t>
+      </w:r>
+      <w:r>
+        <w:t xml:space="preserve">This combination creates what we term a</w:t>
+      </w:r>
+      <w:r>
+        <w:t xml:space="preserve"> </w:t>
+      </w:r>
+      <w:r>
+        <w:rPr>
+          <w:iCs/>
+          <w:i/>
+        </w:rPr>
+        <w:t xml:space="preserve">digital saturation paradox</w:t>
+      </w:r>
+      <w:r>
+        <w:t xml:space="preserve">: in an environment where Tier 1–2 digital interfaces (websites, electronic payment systems) are already widely diffused, these tools function as hygiene factors for domestic operations rather than differentiating assets. This near-universal Tier 1–2 diffusion is enabled by Singapore's nationally deployed Digital Public Infrastructure — encompassing digital identity systems, payment rails, and data-exchange platforms — which the World Bank (2025a) identifies as the foundational enabling layer for firm-level digital adoption in advanced economies. Consistent with this, the Singapore sample reveals that 82% of firms report zero exports, while only 3% exceed 50% foreign sales to total sales — a striking domestic orientation despite the economy's mature digital infrastructure. As a result, the productivity returns to foundational digital adoption should not be expected to manifest uniformly across all firms; instead, they should become measurable primarily when firms face the intensified coordination and transaction demands of cross-border activity. Singapore therefore serves not merely as a convenient empirical backdrop, but as an analytically ideal stress test — an environment in which the conditional logic of foundational digital adoption is most legible precisely because domestic saturation removes the uniform-premium effect and leaves only the export-contingent signal.</w:t>
+      </w:r>
+      <w:r>
+        <w:t xml:space="preserve"> </w:t>
+      </w:r>
+      <w:r>
+        <w:t xml:space="preserve">A second motivation concerns construct clarity. In digitally advanced settings, firms may differ not only in deeper technological capability rooted in learning, innovation, and absorptive capacity, but also in the extent to which they adopt basic digital interfaces and transaction-enabling systems. These two domains should not be collapsed into a single umbrella construct, because technological capability reflects firm-internal capability depth grounded in resource-based and absorptive-capacity logic (Barney 1991; Cohen &amp; Levinthal 1990; Lall 1992), whereas digital adoption reflects participation in digitally enabled transactions and interfaces that may be more contingent on the surrounding digital ecosystem (Bharadwaj et al. 2013; Verhoef et al. 2021).</w:t>
+      </w:r>
+    </w:p>
+    <w:bookmarkEnd w:id="21"/>
+    <w:bookmarkStart w:id="22" w:name="X2961a496af63dca26d6e29b654ead2e696c6fdd"/>
+    <w:p>
+      <w:pPr>
+        <w:pStyle w:val="Heading3"/>
+      </w:pPr>
+      <w:r>
+        <w:t xml:space="preserve">1.2 Research gap</w:t>
+      </w:r>
+    </w:p>
+    <w:p>
+      <w:pPr>
+        <w:pStyle w:val="FirstParagraph"/>
+      </w:pPr>
+      <w:r>
+        <w:t xml:space="preserve">Three gaps motivate this study. First, prior research has often bundled digitalization-related firm attributes into broad umbrella constructs, making it difficult to distinguish firm-internal technological capability from more basic forms of digital adoption. This matters because the two domains imply different mechanisms of advantage: technological capability concerns learning, innovation, and absorptive depth within the firm, whereas foundational digital adoption concerns the use of digital interfaces and transaction-enabling systems that may matter differently across stages of internationalization.</w:t>
+      </w:r>
+      <w:r>
+        <w:t xml:space="preserve"> </w:t>
+      </w:r>
+      <w:r>
+        <w:t xml:space="preserve">Second, although work on digital internationalization has generated important conceptual advances, firm-level evidence remains limited on how basic digital adoption relates to export intensity within a single digitally advanced institutional environment. In particular, the literature still offers limited evidence on whether foundational digital tools matter uniformly across firms or become more relevant only when cross-border coordination demands intensify. Focusing on Tier 1–2 adoption — the most widely diffused and comparable digital layer — is therefore a deliberate design choice: if even these foundational tools exhibit export-contingent productivity associations, higher-tier technologies (automation, integrated ERP, AI-enabled systems) should produce even stronger differentiation, making this the most conservative and replicable test of the conditional digital adoption hypothesis.</w:t>
+      </w:r>
+      <w:r>
+        <w:t xml:space="preserve"> </w:t>
+      </w:r>
+      <w:r>
+        <w:t xml:space="preserve">Third, the nonlinear internationalization–performance literature has documented inverted-U patterns extensively, but the interpretation of such patterns in a digitally advanced setting remains under-specified. In a case such as Singapore, the unresolved issue is not whether one setting can establish a general boundary condition for all digitally mature economies, but how firm-level evidence from that setting should be interpreted relative to the conventional nonlinear literature. This study addresses that issue by examining whether the right-side decline of the curve is clearly identifiable within the export-intensity range actually occupied by firms in Singapore and by separating technological capability from foundational digital adoption in the same empirical framework.</w:t>
+      </w:r>
+    </w:p>
     <w:bookmarkEnd w:id="22"/>
-    <w:bookmarkStart w:id="27" w:name="Xe3d0fc0bea9a42ce7605565d0964033d7f6ee47"/>
+    <w:bookmarkStart w:id="23" w:name="X494b14dde48fd709c427dcfac91526fdde5ec7e"/>
+    <w:p>
+      <w:pPr>
+        <w:pStyle w:val="Heading3"/>
+      </w:pPr>
+      <w:r>
+        <w:t xml:space="preserve">1.3 Contribution</w:t>
+      </w:r>
+    </w:p>
+    <w:p>
+      <w:pPr>
+        <w:pStyle w:val="FirstParagraph"/>
+      </w:pPr>
+      <w:r>
+        <w:t xml:space="preserve">This study makes one primary contribution and two supporting contributions. Its primary contribution is to show that foundational digital adoption (DAI) functions as a conditional scaling resource rather than a uniform productivity premium in a digitally advanced economy: the productivity association of Tier 1–2 digital adoption is weak across most of the export-intensity distribution and becomes more positive only in the high-export tail, where cross-border coordination demands are densest. This within-context evidence from Singapore supports a contingent digital complementarity mechanism — DAI as a scaling lever whose value is realised under export-intensity conditions rather than as a broad firm-level capability advantage. The evidence for this mechanism (H3: positive quadratic DAI×FSTS² interaction, β=+3.119, p=.005) is the most distinctive empirical finding and the one least anticipated by prior literature.</w:t>
+      </w:r>
+      <w:r>
+        <w:t xml:space="preserve"> </w:t>
+      </w:r>
+      <w:r>
+        <w:t xml:space="preserve">The first supporting contribution qualifies the conventional nonlinear I–P literature. Within the observed export-intensity range, the fitted quadratic is more defensibly read as predominantly positive with mild curvature than as a formally established inverted-U: the implied turning point lies near FSTS=88.6%, in a sparsely populated upper tail, and the Lind–Mehlum test does not formally confirm a right-side decline at conventional thresholds. In a digitally mature economy where Tier 1–2 coordination tools are widely diffused, this is an informative positive null — consistent with the saturation hypothesis — rather than an anomaly. The study therefore qualifies rather than overturns the nonlinear I–P literature.</w:t>
+      </w:r>
+      <w:r>
+        <w:t xml:space="preserve"> </w:t>
+      </w:r>
+      <w:r>
+        <w:t xml:space="preserve">The second supporting contribution is construct clarification. The analysis distinguishes technological capability (TCI) from foundational digital adoption (DAI), separating firm-internal capability depth from digitally enabled interfaces and transaction mechanisms. This distinction matters because the two constructs are associated with firm performance through different empirical patterns: TCI shows a more stable direct productivity association, whereas DAI shows a contingent export-intensity-dependent pattern. The §4.5 R1 indicator-sensitivity diagnostic further clarifies that the Tier-1+2 composition of DAI — combining website presence with two-way electronic-payment intensity — is what generates the discriminatory power across the export-intensity range; a Tier-1-only restriction substantially weakens the quadratic interaction, indicating that the empirical legibility of the conditional-scaling mechanism depends on the institutional availability of Tier-2 transaction-enabling infrastructure (see §5.1 for the construct-boundary discussion).</w:t>
+      </w:r>
+    </w:p>
+    <w:bookmarkEnd w:id="23"/>
+    <w:bookmarkStart w:id="24" w:name="Xdd618d9602139b0eee88c4277e195c55d104c48"/>
+    <w:p>
+      <w:pPr>
+        <w:pStyle w:val="Heading3"/>
+      </w:pPr>
+      <w:r>
+        <w:t xml:space="preserve">1.4 Roadmap</w:t>
+      </w:r>
+    </w:p>
+    <w:p>
+      <w:pPr>
+        <w:pStyle w:val="FirstParagraph"/>
+      </w:pPr>
+      <w:r>
+        <w:t xml:space="preserve">Section 2 develops the theoretical framework and four hypotheses. Section 3 describes data and methods. Section 4 reports results. Section 5 discusses theoretical and managerial implications. Section 6 concludes. Section 7 acknowledges limitations and future research directions.</w:t>
+      </w:r>
+    </w:p>
+    <w:bookmarkEnd w:id="24"/>
+    <w:bookmarkEnd w:id="25"/>
+    <w:bookmarkStart w:id="37" w:name="X8bf20a63f0decf7b16e99d564b9958ec4fbbb23"/>
     <w:p>
       <w:pPr>
         <w:pStyle w:val="Heading2"/>
       </w:pPr>
       <w:r>
-        <w:t xml:space="preserve">1 Introduction</w:t>
-      </w:r>
-    </w:p>
-    <w:bookmarkStart w:id="23" w:name="Xe5b26b80b1cffd635bf6d81ca2944b40daaf62d"/>
+        <w:t xml:space="preserve">2 Theory and Hypotheses</w:t>
+      </w:r>
+    </w:p>
+    <w:bookmarkStart w:id="26" w:name="X9497e0c582d29cdf214e76507e8fbbcc0b6d410"/>
     <w:p>
       <w:pPr>
         <w:pStyle w:val="Heading3"/>
       </w:pPr>
       <w:r>
-        <w:t xml:space="preserve">1.1 Background and motivation</w:t>
+        <w:t xml:space="preserve">2.1 The internationalization–performance relationship</w:t>
       </w:r>
     </w:p>
     <w:p>
@@ -218,48 +299,23 @@
         <w:pStyle w:val="FirstParagraph"/>
       </w:pPr>
       <w:r>
-        <w:t xml:space="preserve">Singapore is an analytically valuable setting for revisiting the internationalization–performance relationship because it combines high digital maturity with firm-level heterogeneity in export intensity. The classic I–P literature explains nonlinearity through a trade-off between the scale and learning benefits of international expansion and the rising coordination costs of operating across markets, with the inverted-U emerging as the modal empirical pattern in the broader literature (Marano et al. 2016). However, much of this literature was developed in pre-digital or transitional-digital settings, where institutional and infrastructural conditions differ substantially from those of digitally advanced economies (Peng 2003; Peng et al. 2008) and may not fully capture how the I–P curve behaves when firms operate in a digitally advanced institutional environment. These conditions are empirically grounded in contemporaneous assessments: Singapore ranked 2nd globally in the StartupBlink Innovators Business Environment Index 2026 (score 99.145 out of 100; 1st in Asia Pacific), 4th in the Global Startup Ecosystem Index 2025 (up from 5th in 2024, with ecosystem growth of 44.9% against a top-20 average of 28.5%), and 3rd in the United Nations e-Government Survey 2024, while the Smart Nation 2.0 initiative (launched 2024) formalizes digital trust infrastructure and technology-enabled growth as explicit national policy priorities (GovTech Singapore, 2024; StartupBlink, 2025, 2026).</w:t>
-      </w:r>
-      <w:r>
-        <w:t xml:space="preserve"> </w:t>
-      </w:r>
-      <w:r>
-        <w:t xml:space="preserve">In such contexts, the relevant question is not simply whether firms still exhibit the conventional inverted-U, but whether digital maturity changes the export range over which the right-side decline becomes empirically visible. If mature digital infrastructure attenuates communication, transaction, and information frictions, then the coordination-cost mechanism underlying the classic inverted-U may be weakened, delayed, or pushed toward sparsely populated levels of export intensity. This possibility is especially important in environments where firms engage with digital interfaces and transaction systems at scale, because such technologies can alter both the cost and speed of cross-border coordination (Bharadwaj et al. 2013; Verhoef et al. 2021).</w:t>
-      </w:r>
-      <w:r>
-        <w:t xml:space="preserve"> </w:t>
-      </w:r>
-      <w:r>
-        <w:t xml:space="preserve">This combination creates what we term a</w:t>
-      </w:r>
-      <w:r>
-        <w:t xml:space="preserve"> </w:t>
-      </w:r>
-      <w:r>
-        <w:rPr>
-          <w:iCs/>
-          <w:i/>
-        </w:rPr>
-        <w:t xml:space="preserve">digital saturation paradox</w:t>
-      </w:r>
-      <w:r>
-        <w:t xml:space="preserve">: in an environment where Tier 1–2 digital interfaces (websites, electronic payment systems) are already widely diffused, these tools function as hygiene factors for domestic operations rather than differentiating assets. This near-universal Tier 1–2 diffusion is enabled by Singapore's nationally deployed Digital Public Infrastructure — encompassing digital identity systems, payment rails, and data-exchange platforms — which the World Bank (2025a) identifies as the foundational enabling layer for firm-level digital adoption in advanced economies. Consistent with this, the Singapore sample reveals that 82% of firms report zero exports, while only 3% exceed 50% foreign sales to total sales — a striking domestic orientation despite the economy's mature digital infrastructure. As a result, the productivity returns to foundational digital adoption should not be expected to manifest uniformly across all firms; instead, they should become measurable primarily when firms face the intensified coordination and transaction demands of cross-border activity. Singapore therefore serves not merely as a convenient empirical backdrop, but as an analytically ideal stress test — an environment in which the conditional logic of foundational digital adoption is most legible precisely because domestic saturation removes the uniform-premium effect and leaves only the export-contingent signal.</w:t>
-      </w:r>
-      <w:r>
-        <w:t xml:space="preserve"> </w:t>
-      </w:r>
-      <w:r>
-        <w:t xml:space="preserve">A second motivation concerns construct clarity. In digitally advanced settings, firms may differ not only in deeper technological capability rooted in learning, innovation, and absorptive capacity, but also in the extent to which they adopt basic digital interfaces and transaction-enabling systems. These two domains should not be collapsed into a single umbrella construct, because technological capability reflects firm-internal capability depth grounded in resource-based and absorptive-capacity logic (Barney 1991; Cohen &amp; Levinthal 1990; Lall 1992), whereas digital adoption reflects participation in digitally enabled transactions and interfaces that may be more contingent on the surrounding digital ecosystem (Bharadwaj et al. 2013; Verhoef et al. 2021).</w:t>
-      </w:r>
-    </w:p>
-    <w:bookmarkEnd w:id="23"/>
-    <w:bookmarkStart w:id="24" w:name="X2961a496af63dca26d6e29b654ead2e696c6fdd"/>
+        <w:t xml:space="preserve">The I–P literature has produced extensive evidence of nonlinear relationships between the degree of internationalization and firm performance. Hitt et al. (1997) introduced the inverted-U logic: initial internationalization yields scale and learning benefits, but at high export intensities firms encounter cognitive and coordination ceilings that erode the returns to further expansion. Contractor et al. (2003) extended this logic to a three-stage S-curve, and Lu and Beamish (2004) refined the inverted-U with attention to firm size and age effects. The modal pattern across this literature is an inverted-U with a turning point in the 30%–60% foreign-sales-to-total-sales (FSTS) range (Marano et al. 2016).</w:t>
+      </w:r>
+      <w:r>
+        <w:t xml:space="preserve"> </w:t>
+      </w:r>
+      <w:r>
+        <w:t xml:space="preserve">An important implication of the nonlinear I–P literature is that the visibility of an inverted-U depends not only on theory but also on where firms actually lie in the observed distribution of internationalization intensity. If firms operate in a setting where digital infrastructure and transaction systems reduce some coordination frictions, the right-side decline may become harder to detect within the export range most firms occupy, even if coordination costs do not disappear in principle. Singapore is therefore analytically useful not because it can by itself establish a general boundary condition for digitally mature economies, but because it provides a within-context case for examining how the conventional I–P logic appears when firms operate in a digitally advanced institutional environment.</w:t>
+      </w:r>
+    </w:p>
+    <w:bookmarkEnd w:id="26"/>
+    <w:bookmarkStart w:id="27" w:name="X58009fa5124754b9d12ae223bf3908d651fea58"/>
     <w:p>
       <w:pPr>
         <w:pStyle w:val="Heading3"/>
       </w:pPr>
       <w:r>
-        <w:t xml:space="preserve">1.2 Research gap</w:t>
+        <w:t xml:space="preserve">2.2 Two distinct constructs: TCI and DAI</w:t>
       </w:r>
     </w:p>
     <w:p>
@@ -267,29 +323,38 @@
         <w:pStyle w:val="FirstParagraph"/>
       </w:pPr>
       <w:r>
-        <w:t xml:space="preserve">Three gaps motivate this study. First, prior research has often bundled digitalization-related firm attributes into broad umbrella constructs, making it difficult to distinguish firm-internal technological capability from more basic forms of digital adoption. This matters because the two domains imply different mechanisms of advantage: technological capability concerns learning, innovation, and absorptive depth within the firm, whereas foundational digital adoption concerns the use of digital interfaces and transaction-enabling systems that may matter differently across stages of internationalization.</w:t>
-      </w:r>
-      <w:r>
-        <w:t xml:space="preserve"> </w:t>
-      </w:r>
-      <w:r>
-        <w:t xml:space="preserve">Second, although work on digital internationalization has generated important conceptual advances, firm-level evidence remains limited on how basic digital adoption relates to export intensity within a single digitally advanced institutional environment. In particular, the literature still offers limited evidence on whether foundational digital tools matter uniformly across firms or become more relevant only when cross-border coordination demands intensify. Focusing on Tier 1–2 adoption — the most widely diffused and comparable digital layer — is therefore a deliberate design choice: if even these foundational tools exhibit export-contingent productivity associations, higher-tier technologies (automation, integrated ERP, AI-enabled systems) should produce even stronger differentiation, making this the most conservative and replicable test of the conditional digital adoption hypothesis.</w:t>
-      </w:r>
-      <w:r>
-        <w:t xml:space="preserve"> </w:t>
-      </w:r>
-      <w:r>
-        <w:t xml:space="preserve">Third, the nonlinear internationalization–performance literature has documented inverted-U patterns extensively, but the interpretation of such patterns in a digitally advanced setting remains under-specified. In a case such as Singapore, the unresolved issue is not whether one setting can establish a general boundary condition for all digitally mature economies, but how firm-level evidence from that setting should be interpreted relative to the conventional nonlinear literature. This study addresses that issue by examining whether the right-side decline of the curve is clearly identifiable within the export-intensity range actually occupied by firms in Singapore and by separating technological capability from foundational digital adoption in the same empirical framework.</w:t>
-      </w:r>
-    </w:p>
-    <w:bookmarkEnd w:id="24"/>
-    <w:bookmarkStart w:id="25" w:name="X494b14dde48fd709c427dcfac91526fdde5ec7e"/>
+        <w:t xml:space="preserve">A recurring problem in the digital international business literature is the tendency to collapse technologically heterogeneous firm attributes into a single umbrella construct, thereby blurring the distinction between internal capability depth and digitally enabled market participation (Verhoef et al. 2021). This study departs from that practice by distinguishing a Technological Capability Index (TCI), anchored in the Lall–Cohen-Levinthal capability tradition (Cohen &amp; Levinthal 1990; Lall 1992), from a Digital Adoption Index (DAI), anchored in the Bharadwaj–Verhoef digitalization tradition (Bharadwaj et al. 2013; Verhoef et al. 2021).</w:t>
+      </w:r>
+      <w:r>
+        <w:t xml:space="preserve"> </w:t>
+      </w:r>
+      <w:r>
+        <w:t xml:space="preserve">The distinction is theoretically necessary because the two constructs refer to different domains of firm advantage. TCI captures internal capability stocks related to innovation, learning, and technology absorption, drawing on the absorptive-capacity logic of Cohen and Levinthal (1990) and the technological-capability tradition of Lall (1992). DAI, by contrast, captures the firm’s uptake of digital interfaces and transaction-enabling mechanisms (Bharadwaj et al. 2013), reflecting a more environmentally contingent form of firm advantage that depends on the maturity of the surrounding digital ecosystem (Verhoef et al. 2021).</w:t>
+      </w:r>
+      <w:r>
+        <w:t xml:space="preserve"> </w:t>
+      </w:r>
+      <w:r>
+        <w:t xml:space="preserve">Equally important, the label “digital adoption” is more defensible than “digital capability” in the present empirical setting because the WBES indicators available here map primarily onto basic digital presence and digital transaction usage rather than deeper digitally integrated organizational processes. In the Verhoef et al. (2021) hierarchy, website presence (c22b) corresponds most closely to Tier 1 digitization, while electronic-payment intensity on the customer and supplier sides (k33, k38) corresponds to Tier 2 digitalization. Our DAI composite therefore captures the foundational digital layer upon which higher-order digital capabilities may be built, but it cannot directly observe Tier 3 process integration (e.g., ERP, CRM, digitally integrated supply chains) or Tier 4 digital dynamic capability (e.g., AI deployment, platform orchestration, reconfiguration capability). Given this measurement boundary, retaining a broad “digital capability” label would overstate what the underlying indicators can legitimately support, whereas the DAI label improves construct validity by aligning the variable name with the actual content domain of the observed measures. Methodologically, the two constructs satisfy the Coltman et al. (2008) four-criterion test for formative (as opposed to reflective) measurement. Separately, combining TCI and DAI into a single composite would violate the principle that constructs with different hypothesised nomological nets should remain analytically distinct.</w:t>
+      </w:r>
+    </w:p>
+    <w:bookmarkEnd w:id="27"/>
+    <w:bookmarkStart w:id="32" w:name="Xfeb3205642325e47f2817bab2cc060c9f999b02"/>
     <w:p>
       <w:pPr>
         <w:pStyle w:val="Heading3"/>
       </w:pPr>
       <w:r>
-        <w:t xml:space="preserve">1.3 Contribution</w:t>
+        <w:t xml:space="preserve">2.3 Hypothesis development</w:t>
+      </w:r>
+    </w:p>
+    <w:bookmarkStart w:id="28" w:name="X9de0e934912487c2b2355f424516474f67bf4ef"/>
+    <w:p>
+      <w:pPr>
+        <w:pStyle w:val="Heading4"/>
+      </w:pPr>
+      <w:r>
+        <w:t xml:space="preserve">2.3.1 TCI direct effect on productivity</w:t>
       </w:r>
     </w:p>
     <w:p>
@@ -297,29 +362,23 @@
         <w:pStyle w:val="FirstParagraph"/>
       </w:pPr>
       <w:r>
-        <w:t xml:space="preserve">This study makes one primary contribution and two supporting contributions. Its primary contribution is to show that foundational digital adoption (DAI) functions as a conditional scaling resource rather than a uniform productivity premium in a digitally advanced economy: the productivity association of Tier 1–2 digital adoption is weak across most of the export-intensity distribution and becomes more positive only in the high-export tail, where cross-border coordination demands are densest. This within-context evidence from Singapore supports a contingent digital complementarity mechanism — DAI as a scaling lever whose value is realised under export-intensity conditions rather than as a broad firm-level capability advantage. The evidence for this mechanism (H3: positive quadratic DAI×FSTS² interaction, β=+3.119, p=.005) is the most distinctive empirical finding and the one least anticipated by prior literature.</w:t>
-      </w:r>
-      <w:r>
-        <w:t xml:space="preserve"> </w:t>
-      </w:r>
-      <w:r>
-        <w:t xml:space="preserve">The first supporting contribution qualifies the conventional nonlinear I–P literature. Within the observed export-intensity range, the fitted quadratic is more defensibly read as predominantly positive with mild curvature than as a formally established inverted-U: the implied turning point lies near FSTS=88.6%, in a sparsely populated upper tail, and the Lind–Mehlum test does not formally confirm a right-side decline at conventional thresholds. In a digitally mature economy where Tier 1–2 coordination tools are widely diffused, this is an informative positive null — consistent with the saturation hypothesis — rather than an anomaly. The study therefore qualifies rather than overturns the nonlinear I–P literature.</w:t>
-      </w:r>
-      <w:r>
-        <w:t xml:space="preserve"> </w:t>
-      </w:r>
-      <w:r>
-        <w:t xml:space="preserve">The second supporting contribution is construct clarification. The analysis distinguishes technological capability (TCI) from foundational digital adoption (DAI), separating firm-internal capability depth from digitally enabled interfaces and transaction mechanisms. This distinction matters because the two constructs are associated with firm performance through different empirical patterns: TCI shows a more stable direct productivity association, whereas DAI shows a contingent export-intensity-dependent pattern. The §4.5 R1 indicator-sensitivity diagnostic further clarifies that the Tier-1+2 composition of DAI — combining website presence with two-way electronic-payment intensity — is what generates the discriminatory power across the export-intensity range; a Tier-1-only restriction substantially weakens the quadratic interaction, indicating that the empirical legibility of the conditional-scaling mechanism depends on the institutional availability of Tier-2 transaction-enabling infrastructure (see §5.1 for the construct-boundary discussion).</w:t>
-      </w:r>
-    </w:p>
-    <w:bookmarkEnd w:id="25"/>
-    <w:bookmarkStart w:id="26" w:name="Xdd618d9602139b0eee88c4277e195c55d104c48"/>
-    <w:p>
-      <w:pPr>
-        <w:pStyle w:val="Heading3"/>
-      </w:pPr>
-      <w:r>
-        <w:t xml:space="preserve">1.4 Roadmap</w:t>
+        <w:t xml:space="preserve">Following the Lall (1992) capability tradition and the Cohen and Levinthal (1990) absorptive-capacity logic, firms with deeper technological capability should produce more output per unit of labour input regardless of internationalization stage. Technological capability reflects firm-internal investments in R&amp;D, innovation, foreign technology licensing, and quality certification — all of which are associated with a higher productivity floor, reflected in operational efficiency, product quality, and learning routines (Avenyo et al. 2021; Krammer et al. 2018). We therefore hypothesize:</w:t>
+      </w:r>
+      <w:r>
+        <w:t xml:space="preserve"> </w:t>
+      </w:r>
+      <w:r>
+        <w:t xml:space="preserve">Hypothesis 1 (H1). In Singapore's advanced-economy context, when firms invest more deeply in R&amp;D, innovation, technology licensing, and quality certification, labour productivity is higher because technological capability raises the firm's operational efficiency and learning routines (Lall 1992; Cohen &amp; Levinthal 1990), before any additional moderation of the I–P curve shape is considered.</w:t>
+      </w:r>
+    </w:p>
+    <w:bookmarkEnd w:id="28"/>
+    <w:bookmarkStart w:id="29" w:name="Xd77aef7f084e33ec0dd33a50710ed9d88a5bd5f"/>
+    <w:p>
+      <w:pPr>
+        <w:pStyle w:val="Heading4"/>
+      </w:pPr>
+      <w:r>
+        <w:t xml:space="preserve">2.3.2 TCI moderation of the I–P relationship</w:t>
       </w:r>
     </w:p>
     <w:p>
@@ -327,27 +386,23 @@
         <w:pStyle w:val="FirstParagraph"/>
       </w:pPr>
       <w:r>
-        <w:t xml:space="preserve">Section 2 develops the theoretical framework and four hypotheses. Section 3 describes data and methods. Section 4 reports results. Section 5 discusses theoretical and managerial implications. Section 6 concludes. Section 7 acknowledges limitations and future research directions.</w:t>
-      </w:r>
-    </w:p>
-    <w:bookmarkEnd w:id="26"/>
-    <w:bookmarkEnd w:id="27"/>
-    <w:bookmarkStart w:id="39" w:name="X8bf20a63f0decf7b16e99d564b9958ec4fbbb23"/>
-    <w:p>
-      <w:pPr>
-        <w:pStyle w:val="Heading2"/>
-      </w:pPr>
-      <w:r>
-        <w:t xml:space="preserve">2 Theory and Hypotheses</w:t>
-      </w:r>
-    </w:p>
-    <w:bookmarkStart w:id="28" w:name="X9497e0c582d29cdf214e76507e8fbbcc0b6d410"/>
-    <w:p>
-      <w:pPr>
-        <w:pStyle w:val="Heading3"/>
-      </w:pPr>
-      <w:r>
-        <w:t xml:space="preserve">2.1 The internationalization–performance relationship</w:t>
+        <w:t xml:space="preserve">A subtler prediction concerns whether technological capability alters the shape of the internationalization–performance relationship rather than simply raising average productivity. From a non-location-bound firm-specific advantage perspective, technological capability may travel across markets without requiring the same degree of adaptation as context-dependent coordination tools. This suggests that its most stable empirical role may lie in its direct association with productivity, while any moderation of the FSTS–performance relationship is less certain and should be treated as an empirical question rather than presumed ex ante.</w:t>
+      </w:r>
+      <w:r>
+        <w:t xml:space="preserve"> </w:t>
+      </w:r>
+      <w:r>
+        <w:t xml:space="preserve">Whether technological capability (TCI) also moderates the internationalization–performance relationship is treated as an open empirical question and assessed in a supplementary specification rather than as a hypothesized moderation channel. Consequently, this paper formally states H1, H2, and H3 only; a TCI moderation hypothesis is not posited for the Singapore context, where the advanced-economy setting and near-universal digital diffusion do not generate the institutional heterogeneity that would support a confident ex-ante prediction about TCI-contingent I–P curvature. The present paper's H2 and H3 are accordingly numbered consecutively after H1: H2 captures the conditional (non-uniform) DAI–productivity association, and H3 captures the export-intensity-contingent moderation of DAI on the I–P relationship.</w:t>
+      </w:r>
+    </w:p>
+    <w:bookmarkEnd w:id="29"/>
+    <w:bookmarkStart w:id="30" w:name="Xca797cdf899e8025c95598929e8214dfe008510"/>
+    <w:p>
+      <w:pPr>
+        <w:pStyle w:val="Heading4"/>
+      </w:pPr>
+      <w:r>
+        <w:t xml:space="preserve">2.3.3 DAI direct effect on productivity</w:t>
       </w:r>
     </w:p>
     <w:p>
@@ -355,128 +410,17 @@
         <w:pStyle w:val="FirstParagraph"/>
       </w:pPr>
       <w:r>
-        <w:t xml:space="preserve">The I–P literature has produced extensive evidence of nonlinear relationships between the degree of internationalization and firm performance. Hitt et al. (1997) introduced the inverted-U logic: initial internationalization yields scale and learning benefits, but at high export intensities firms encounter cognitive and coordination ceilings that erode the returns to further expansion. Contractor et al. (2003) extended this logic to a three-stage S-curve, and Lu and Beamish (2004) refined the inverted-U with attention to firm size and age effects. The modal pattern across this literature is an inverted-U with a turning point in the 30%–60% foreign-sales-to-total-sales (FSTS) range (Marano et al. 2016).</w:t>
-      </w:r>
-      <w:r>
-        <w:t xml:space="preserve"> </w:t>
-      </w:r>
-      <w:r>
-        <w:t xml:space="preserve">An important implication of the nonlinear I–P literature is that the visibility of an inverted-U depends not only on theory but also on where firms actually lie in the observed distribution of internationalization intensity. If firms operate in a setting where digital infrastructure and transaction systems reduce some coordination frictions, the right-side decline may become harder to detect within the export range most firms occupy, even if coordination costs do not disappear in principle. Singapore is therefore analytically useful not because it can by itself establish a general boundary condition for digitally mature economies, but because it provides a within-context case for examining how the conventional I–P logic appears when firms operate in a digitally advanced institutional environment.</w:t>
-      </w:r>
-    </w:p>
-    <w:bookmarkEnd w:id="28"/>
-    <w:bookmarkStart w:id="29" w:name="X58009fa5124754b9d12ae223bf3908d651fea58"/>
-    <w:p>
-      <w:pPr>
-        <w:pStyle w:val="Heading3"/>
-      </w:pPr>
-      <w:r>
-        <w:t xml:space="preserve">2.2 Two distinct constructs: TCI and DAI</w:t>
-      </w:r>
-    </w:p>
-    <w:p>
-      <w:pPr>
-        <w:pStyle w:val="FirstParagraph"/>
-      </w:pPr>
-      <w:r>
-        <w:t xml:space="preserve">A recurring problem in the digital international business literature is the tendency to collapse technologically heterogeneous firm attributes into a single umbrella construct, thereby blurring the distinction between internal capability depth and digitally enabled market participation (Verhoef et al. 2021). This study departs from that practice by distinguishing a Technological Capability Index (TCI), anchored in the Lall–Cohen-Levinthal capability tradition (Cohen &amp; Levinthal 1990; Lall 1992), from a Digital Adoption Index (DAI), anchored in the Bharadwaj–Verhoef digitalization tradition (Bharadwaj et al. 2013; Verhoef et al. 2021).</w:t>
-      </w:r>
-      <w:r>
-        <w:t xml:space="preserve"> </w:t>
-      </w:r>
-      <w:r>
-        <w:t xml:space="preserve">The distinction is theoretically necessary because the two constructs refer to different domains of firm advantage. TCI captures internal capability stocks related to innovation, learning, and technology absorption, drawing on the absorptive-capacity logic of Cohen and Levinthal (1990) and the technological-capability tradition of Lall (1992). DAI, by contrast, captures the firm’s uptake of digital interfaces and transaction-enabling mechanisms (Bharadwaj et al. 2013), reflecting a more environmentally contingent form of firm advantage that depends on the maturity of the surrounding digital ecosystem (Verhoef et al. 2021).</w:t>
-      </w:r>
-      <w:r>
-        <w:t xml:space="preserve"> </w:t>
-      </w:r>
-      <w:r>
-        <w:t xml:space="preserve">Equally important, the label “digital adoption” is more defensible than “digital capability” in the present empirical setting because the WBES indicators available here map primarily onto basic digital presence and digital transaction usage rather than deeper digitally integrated organizational processes. In the Verhoef et al. (2021) hierarchy, website presence (c22b) corresponds most closely to Tier 1 digitization, while electronic-payment intensity on the customer and supplier sides (k33, k38) corresponds to Tier 2 digitalization. Our DAI composite therefore captures the foundational digital layer upon which higher-order digital capabilities may be built, but it cannot directly observe Tier 3 process integration (e.g., ERP, CRM, digitally integrated supply chains) or Tier 4 digital dynamic capability (e.g., AI deployment, platform orchestration, reconfiguration capability). Given this measurement boundary, retaining a broad “digital capability” label would overstate what the underlying indicators can legitimately support, whereas the DAI label improves construct validity by aligning the variable name with the actual content domain of the observed measures. Methodologically, the two constructs satisfy the Coltman et al. (2008) four-criterion test for formative (as opposed to reflective) measurement. Separately, combining TCI and DAI into a single composite would violate the principle that constructs with different hypothesised nomological nets should remain analytically distinct.</w:t>
-      </w:r>
-    </w:p>
-    <w:bookmarkEnd w:id="29"/>
-    <w:bookmarkStart w:id="34" w:name="Xfeb3205642325e47f2817bab2cc060c9f999b02"/>
-    <w:p>
-      <w:pPr>
-        <w:pStyle w:val="Heading3"/>
-      </w:pPr>
-      <w:r>
-        <w:t xml:space="preserve">2.3 Hypothesis development</w:t>
-      </w:r>
-    </w:p>
-    <w:bookmarkStart w:id="30" w:name="X9de0e934912487c2b2355f424516474f67bf4ef"/>
-    <w:p>
-      <w:pPr>
-        <w:pStyle w:val="Heading4"/>
-      </w:pPr>
-      <w:r>
-        <w:t xml:space="preserve">2.3.1 TCI direct effect on productivity</w:t>
-      </w:r>
-    </w:p>
-    <w:p>
-      <w:pPr>
-        <w:pStyle w:val="FirstParagraph"/>
-      </w:pPr>
-      <w:r>
-        <w:t xml:space="preserve">Following the Lall (1992) capability tradition and the Cohen and Levinthal (1990) absorptive-capacity logic, firms with deeper technological capability should produce more output per unit of labour input regardless of internationalization stage. Technological capability reflects firm-internal investments in R&amp;D, innovation, foreign technology licensing, and quality certification — all of which are associated with a higher productivity floor, reflected in operational efficiency, product quality, and learning routines (Avenyo et al. 2021; Krammer et al. 2018). We therefore hypothesize:</w:t>
-      </w:r>
-      <w:r>
-        <w:t xml:space="preserve"> </w:t>
-      </w:r>
-      <w:r>
-        <w:t xml:space="preserve">Hypothesis 1 (H1). In Singapore's advanced-economy context, when firms invest more deeply in R&amp;D, innovation, technology licensing, and quality certification, labour productivity is higher because technological capability raises the firm's operational efficiency and learning routines (Lall 1992; Cohen &amp; Levinthal 1990), before any additional moderation of the I–P curve shape is considered.</w:t>
+        <w:t xml:space="preserve">Digital adoption is associated with firm performance through faster information flows, lower transaction frictions, and more efficient digital exchange, but such associations are unlikely to be uniform across firms. In the present empirical setting, the available indicators capture foundational digital interfaces and transaction-enabling mechanisms rather than deeper digitally integrated organizational capabilities. Their productivity relevance is therefore not expected to appear as a large, unconditional firm-wide premium, but as an association whose strength may depend on the scale at which firms actually use those digital channels.</w:t>
+      </w:r>
+      <w:r>
+        <w:t xml:space="preserve"> </w:t>
+      </w:r>
+      <w:r>
+        <w:t xml:space="preserve">Hypothesis 2 (H2). In Singapore, when firms adopt foundational digital interfaces and transaction-enabling mechanisms (Tier 1–2), the productivity association of DAI is conditional rather than uniform across firms, because the marginal return to basic digital adoption depends on the scale at which those digital channels are actually used (Bharadwaj et al. 2013; Verhoef et al. 2021), until a level of export intensity is reached at which cross-border coordination demands generate measurable returns.</w:t>
       </w:r>
     </w:p>
     <w:bookmarkEnd w:id="30"/>
-    <w:bookmarkStart w:id="31" w:name="Xd77aef7f084e33ec0dd33a50710ed9d88a5bd5f"/>
-    <w:p>
-      <w:pPr>
-        <w:pStyle w:val="Heading4"/>
-      </w:pPr>
-      <w:r>
-        <w:t xml:space="preserve">2.3.2 TCI moderation of the I–P relationship</w:t>
-      </w:r>
-    </w:p>
-    <w:p>
-      <w:pPr>
-        <w:pStyle w:val="FirstParagraph"/>
-      </w:pPr>
-      <w:r>
-        <w:t xml:space="preserve">A subtler prediction concerns whether technological capability alters the shape of the internationalization–performance relationship rather than simply raising average productivity. From a non-location-bound firm-specific advantage perspective, technological capability may travel across markets without requiring the same degree of adaptation as context-dependent coordination tools. This suggests that its most stable empirical role may lie in its direct association with productivity, while any moderation of the FSTS–performance relationship is less certain and should be treated as an empirical question rather than presumed ex ante.</w:t>
-      </w:r>
-      <w:r>
-        <w:t xml:space="preserve"> </w:t>
-      </w:r>
-      <w:r>
-        <w:t xml:space="preserve">Whether technological capability (TCI) also moderates the internationalization–performance relationship is treated as an open empirical question and assessed in a supplementary specification rather than as a hypothesized moderation channel. Consequently, this paper formally states H1, H2, and H3 only; a TCI moderation hypothesis is not posited for the Singapore context, where the advanced-economy setting and near-universal digital diffusion do not generate the institutional heterogeneity that would support a confident ex-ante prediction about TCI-contingent I–P curvature. The present paper's H2 and H3 are accordingly numbered consecutively after H1: H2 captures the conditional (non-uniform) DAI–productivity association, and H3 captures the export-intensity-contingent moderation of DAI on the I–P relationship.</w:t>
-      </w:r>
-    </w:p>
-    <w:bookmarkEnd w:id="31"/>
-    <w:bookmarkStart w:id="32" w:name="Xca797cdf899e8025c95598929e8214dfe008510"/>
-    <w:p>
-      <w:pPr>
-        <w:pStyle w:val="Heading4"/>
-      </w:pPr>
-      <w:r>
-        <w:t xml:space="preserve">2.3.3 DAI direct effect on productivity</w:t>
-      </w:r>
-    </w:p>
-    <w:p>
-      <w:pPr>
-        <w:pStyle w:val="FirstParagraph"/>
-      </w:pPr>
-      <w:r>
-        <w:t xml:space="preserve">Digital adoption is associated with firm performance through faster information flows, lower transaction frictions, and more efficient digital exchange, but such associations are unlikely to be uniform across firms. In the present empirical setting, the available indicators capture foundational digital interfaces and transaction-enabling mechanisms rather than deeper digitally integrated organizational capabilities. Their productivity relevance is therefore not expected to appear as a large, unconditional firm-wide premium, but as an association whose strength may depend on the scale at which firms actually use those digital channels.</w:t>
-      </w:r>
-      <w:r>
-        <w:t xml:space="preserve"> </w:t>
-      </w:r>
-      <w:r>
-        <w:t xml:space="preserve">Hypothesis 2 (H2). In Singapore, when firms adopt foundational digital interfaces and transaction-enabling mechanisms (Tier 1–2), the productivity association of DAI is conditional rather than uniform across firms, because the marginal return to basic digital adoption depends on the scale at which those digital channels are actually used (Bharadwaj et al. 2013; Verhoef et al. 2021), until a level of export intensity is reached at which cross-border coordination demands generate measurable returns.</w:t>
-      </w:r>
-    </w:p>
-    <w:bookmarkEnd w:id="32"/>
-    <w:bookmarkStart w:id="33" w:name="Xb90d981e4efafb918608a9cc7d37012dec59e7b"/>
+    <w:bookmarkStart w:id="31" w:name="Xb90d981e4efafb918608a9cc7d37012dec59e7b"/>
     <w:p>
       <w:pPr>
         <w:pStyle w:val="Heading4"/>
@@ -662,9 +606,9 @@
         <w:t xml:space="preserve">Hypothesis 3 (H3). In Singapore, when firms operate at higher export intensity, the association between digital adoption (DAI) and firm performance becomes more positive because foundational digital tools reduce cross-border coordination costs super-linearly rather than proportionally (coordination platform mechanism: Stallkamp &amp; Schotter 2021; Barney 1991), with the amplification effect becoming detectable only beyond the export-intensity threshold at which transaction volume justifies intensive use of digital interfaces and electronic-payment systems.</w:t>
       </w:r>
     </w:p>
-    <w:bookmarkEnd w:id="33"/>
-    <w:bookmarkEnd w:id="34"/>
-    <w:bookmarkStart w:id="38" w:name="X120be97a373b91b5bab21d44e9895db7ca01e76"/>
+    <w:bookmarkEnd w:id="31"/>
+    <w:bookmarkEnd w:id="32"/>
+    <w:bookmarkStart w:id="36" w:name="X120be97a373b91b5bab21d44e9895db7ca01e76"/>
     <w:p>
       <w:pPr>
         <w:pStyle w:val="Heading3"/>
@@ -690,18 +634,18 @@
           <wp:inline>
             <wp:extent cx="5753100" cy="3978568"/>
             <wp:effectExtent b="0" l="0" r="0" t="0"/>
-            <wp:docPr descr="Figure 1: Conceptual model — TCI and DAI moderating the I–P relationship (Singapore)" title="" id="36" name="Picture"/>
+            <wp:docPr descr="Figure 1: Conceptual model — TCI and DAI moderating the I–P relationship (Singapore)" title="" id="34" name="Picture"/>
             <a:graphic>
               <a:graphicData uri="http://schemas.openxmlformats.org/drawingml/2006/picture">
                 <pic:pic>
                   <pic:nvPicPr>
-                    <pic:cNvPr descr="figures/p4_singapore/figure_1_conceptual_model.png" id="37" name="Picture"/>
+                    <pic:cNvPr descr="figures/p4_singapore/figure_1_conceptual_model.png" id="35" name="Picture"/>
                     <pic:cNvPicPr>
                       <a:picLocks noChangeArrowheads="1" noChangeAspect="1"/>
                     </pic:cNvPicPr>
                   </pic:nvPicPr>
                   <pic:blipFill>
-                    <a:blip r:embed="rId35"/>
+                    <a:blip r:embed="rId33"/>
                     <a:stretch>
                       <a:fillRect/>
                     </a:stretch>
@@ -764,9 +708,9 @@
         <w:t xml:space="preserve">Solid arrows represent hypothesised direct effects; dashed arrows represent moderating and conditional effects. The independent variable — internationalisation intensity (FSTS, FSTS²_c) — is placed at left; the dependent variable — ln(labour productivity) — is placed at right. H1 (inverted-U tendency with support-constrained turning point ~88.6% FSTS, bootstrap CI [53%, 253%]) is grounded in coordination-cost theory (Hitt et al., 1997); the right-side decline is not formally identified within the observed FSTS range — a theoretically informative result under the saturation framework (Lind–Mehlum p = .303). H1-TCI: technological capability (TCI_z, RBV: Barney, 1991) enters as a direct level-shift to firm performance. H2: DAI (Tier-1+2: website + e-payment) exhibits a non-uniform positive direct effect, varying across export intensity. H3: DAI amplifies I→P performance returns at high FSTS — the primary contingency hypothesis (coordination platform mechanism: Stallkamp &amp; Schotter, 2021; Dynamic Capabilities: Teece, 2007). The Heckman two-step IMR sensitivity check controls exporter selection bias but is not displayed in the figure. (+) denotes positive association. Control variables (ln firm size, age, foreign ownership, sector FE) are included in all empirical models. Note: H3 amplification test conducted on exporters-only subsample (n ≈ 84; power ≈ 16% — corroborating signal, not independent identification). ICRV context: Singapore — Advanced I. Data: WBES 2023; N = 623.</w:t>
       </w:r>
     </w:p>
-    <w:bookmarkEnd w:id="38"/>
-    <w:bookmarkEnd w:id="39"/>
-    <w:bookmarkStart w:id="48" w:name="X167a2da0345881bf36eef0606d50b1063a572d3"/>
+    <w:bookmarkEnd w:id="36"/>
+    <w:bookmarkEnd w:id="37"/>
+    <w:bookmarkStart w:id="46" w:name="X167a2da0345881bf36eef0606d50b1063a572d3"/>
     <w:p>
       <w:pPr>
         <w:pStyle w:val="Heading2"/>
@@ -775,7 +719,7 @@
         <w:t xml:space="preserve">3 Methods</w:t>
       </w:r>
     </w:p>
-    <w:bookmarkStart w:id="40" w:name="X7539fb3dc2f98232f41138bc75cab658563f4ee"/>
+    <w:bookmarkStart w:id="38" w:name="X7539fb3dc2f98232f41138bc75cab658563f4ee"/>
     <w:p>
       <w:pPr>
         <w:pStyle w:val="Heading3"/>
@@ -810,53 +754,53 @@
         <w:t xml:space="preserve">The Singapore DAI distribution reveals high saturation: website presence is reported by approximately 67% of firms, and Tier-2 e-payment adoption (customer- and supplier-side) is widespread relative to less digitally mature institutional settings. This saturation pattern at the advanced-economy ceiling of the digital-infrastructure spectrum has two empirically relevant implications. First, the near-universal diffusion of Tier-1 digital presence removes the discriminatory power that the website indicator alone could carry in less digitally mature settings, so the empirical signal must be drawn from the Tier-2 transaction-enabling layer (e-payment intensity on both customer and supplier sides) to identify the conditional-scaling mechanism — a measurement implication that is borne out in the §4.5 R1 robustness diagnostic, where reducing DAI to Tier-1 alone substantially weakens the quadratic interaction. Second, in transitional-economy settings where Tier-1 digital adoption has diffused widely while Tier-2 transaction-enabling infrastructure remains institutionally bounded, the same construct measured at Tier-1 only would not be expected to produce a comparable positive quadratic interaction; instead it would be more plausibly read as construct-tier obsolescence than as evidence on the conditional-scaling mechanism (see §5.1 for the construct-boundary discussion). The Lind–Mehlum equivalence test result (p = .303) reported in §4.2 should therefore be interpreted in conjunction with the Tier-1+2 construct composition and the high domestic-orientation distribution of the Singapore sample, not as a stand-alone null on the inverted-U logic. Figure 3 [see Figures section] illustrates the predicted I–P curve and the sparse upper-tail region where the turning point is implied.</w:t>
       </w:r>
     </w:p>
+    <w:bookmarkEnd w:id="38"/>
+    <w:bookmarkStart w:id="43" w:name="Xbcf9f12e79107fa2c089aaf13fc6c4fb773f1c2"/>
+    <w:p>
+      <w:pPr>
+        <w:pStyle w:val="Heading3"/>
+      </w:pPr>
+      <w:r>
+        <w:t xml:space="preserve">3.2 Variables</w:t>
+      </w:r>
+    </w:p>
+    <w:bookmarkStart w:id="39" w:name="X7e58563e31c3ad002492190dd8d5308423faaad"/>
+    <w:p>
+      <w:pPr>
+        <w:pStyle w:val="Heading4"/>
+      </w:pPr>
+      <w:r>
+        <w:t xml:space="preserve">3.2.1 Dependent variable</w:t>
+      </w:r>
+    </w:p>
+    <w:p>
+      <w:pPr>
+        <w:pStyle w:val="FirstParagraph"/>
+      </w:pPr>
+      <w:r>
+        <w:t xml:space="preserve">Firm performance is operationalized as labour productivity, measured as the natural logarithm of annual sales divided by the number of full-time employees. This measure is constructed from WBES annual sales and employment items and follows the productivity-as-performance approach used in prior firm-level international business research. Because all firms belong to the same 2023 cross-section, sales are expressed in nominal 2023 Singapore dollars, with any common price-level effect absorbed by the intercept. To reduce sensitivity to outliers, the dependent variable is winsorized at the 1st and 99th percentiles.</w:t>
+      </w:r>
+    </w:p>
+    <w:bookmarkEnd w:id="39"/>
+    <w:bookmarkStart w:id="40" w:name="X2cdc78afcfd9a4441a0b7b899a2b559f49a455a"/>
+    <w:p>
+      <w:pPr>
+        <w:pStyle w:val="Heading4"/>
+      </w:pPr>
+      <w:r>
+        <w:t xml:space="preserve">3.2.2 Focal independent variable</w:t>
+      </w:r>
+    </w:p>
+    <w:p>
+      <w:pPr>
+        <w:pStyle w:val="FirstParagraph"/>
+      </w:pPr>
+      <w:r>
+        <w:t xml:space="preserve">The focal internationalization variable is FSTS, defined as the proportion of annual sales derived from direct exports and rescaled to the [0,1] interval. FSTS is mean-centered before squaring in order to mitigate multicollinearity between the linear and quadratic terms (Aiken &amp; West 1991). In the final specifications, variance inflation factors remain below 3, indicating that multicollinearity is not a material concern (O’Brien 2007).</w:t>
+      </w:r>
+    </w:p>
     <w:bookmarkEnd w:id="40"/>
-    <w:bookmarkStart w:id="45" w:name="Xbcf9f12e79107fa2c089aaf13fc6c4fb773f1c2"/>
-    <w:p>
-      <w:pPr>
-        <w:pStyle w:val="Heading3"/>
-      </w:pPr>
-      <w:r>
-        <w:t xml:space="preserve">3.2 Variables</w:t>
-      </w:r>
-    </w:p>
-    <w:bookmarkStart w:id="41" w:name="X7e58563e31c3ad002492190dd8d5308423faaad"/>
-    <w:p>
-      <w:pPr>
-        <w:pStyle w:val="Heading4"/>
-      </w:pPr>
-      <w:r>
-        <w:t xml:space="preserve">3.2.1 Dependent variable</w:t>
-      </w:r>
-    </w:p>
-    <w:p>
-      <w:pPr>
-        <w:pStyle w:val="FirstParagraph"/>
-      </w:pPr>
-      <w:r>
-        <w:t xml:space="preserve">Firm performance is operationalized as labour productivity, measured as the natural logarithm of annual sales divided by the number of full-time employees. This measure is constructed from WBES annual sales and employment items and follows the productivity-as-performance approach used in prior firm-level international business research. Because all firms belong to the same 2023 cross-section, sales are expressed in nominal 2023 Singapore dollars, with any common price-level effect absorbed by the intercept. To reduce sensitivity to outliers, the dependent variable is winsorized at the 1st and 99th percentiles.</w:t>
-      </w:r>
-    </w:p>
-    <w:bookmarkEnd w:id="41"/>
-    <w:bookmarkStart w:id="42" w:name="X2cdc78afcfd9a4441a0b7b899a2b559f49a455a"/>
-    <w:p>
-      <w:pPr>
-        <w:pStyle w:val="Heading4"/>
-      </w:pPr>
-      <w:r>
-        <w:t xml:space="preserve">3.2.2 Focal independent variable</w:t>
-      </w:r>
-    </w:p>
-    <w:p>
-      <w:pPr>
-        <w:pStyle w:val="FirstParagraph"/>
-      </w:pPr>
-      <w:r>
-        <w:t xml:space="preserve">The focal internationalization variable is FSTS, defined as the proportion of annual sales derived from direct exports and rescaled to the [0,1] interval. FSTS is mean-centered before squaring in order to mitigate multicollinearity between the linear and quadratic terms (Aiken &amp; West 1991). In the final specifications, variance inflation factors remain below 3, indicating that multicollinearity is not a material concern (O’Brien 2007).</w:t>
-      </w:r>
-    </w:p>
-    <w:bookmarkEnd w:id="42"/>
-    <w:bookmarkStart w:id="43" w:name="X5885cfa65cddf1d15b27f59176f9dbae5a8c10a"/>
+    <w:bookmarkStart w:id="41" w:name="X5885cfa65cddf1d15b27f59176f9dbae5a8c10a"/>
     <w:p>
       <w:pPr>
         <w:pStyle w:val="Heading4"/>
@@ -915,27 +859,27 @@
         <w:t xml:space="preserve">, PART C) and are consistent with the §1.3 supporting contribution on construct-tier specificity.</w:t>
       </w:r>
     </w:p>
+    <w:bookmarkEnd w:id="41"/>
+    <w:bookmarkStart w:id="42" w:name="X7f318314f3a5164dbb5d2e2bfe8bd11c34b488e"/>
+    <w:p>
+      <w:pPr>
+        <w:pStyle w:val="Heading4"/>
+      </w:pPr>
+      <w:r>
+        <w:t xml:space="preserve">3.2.4 Controls</w:t>
+      </w:r>
+    </w:p>
+    <w:p>
+      <w:pPr>
+        <w:pStyle w:val="FirstParagraph"/>
+      </w:pPr>
+      <w:r>
+        <w:t xml:space="preserve">The models include firm size, firm age, foreign ownership, and broad sector fixed effects as controls. Firm size is measured as the natural logarithm of the number of full-time employees, firm age is calculated from year of establishment, and foreign ownership is coded as an indicator for at least 10% foreign equity. Broad sector indicators distinguish manufacturing, retail, and other services and absorb sector-level heterogeneity in productivity, export propensity, and technology-adoption norms. Manager experience, originally motivated by the upper-echelons framework (Hambrick &amp; Mason 1984) and initially considered as a control, was dropped after variance-inflation diagnostics indicated problematic collinearity with firm size.</w:t>
+      </w:r>
+    </w:p>
+    <w:bookmarkEnd w:id="42"/>
     <w:bookmarkEnd w:id="43"/>
-    <w:bookmarkStart w:id="44" w:name="X7f318314f3a5164dbb5d2e2bfe8bd11c34b488e"/>
-    <w:p>
-      <w:pPr>
-        <w:pStyle w:val="Heading4"/>
-      </w:pPr>
-      <w:r>
-        <w:t xml:space="preserve">3.2.4 Controls</w:t>
-      </w:r>
-    </w:p>
-    <w:p>
-      <w:pPr>
-        <w:pStyle w:val="FirstParagraph"/>
-      </w:pPr>
-      <w:r>
-        <w:t xml:space="preserve">The models include firm size, firm age, foreign ownership, and broad sector fixed effects as controls. Firm size is measured as the natural logarithm of the number of full-time employees, firm age is calculated from year of establishment, and foreign ownership is coded as an indicator for at least 10% foreign equity. Broad sector indicators distinguish manufacturing, retail, and other services and absorb sector-level heterogeneity in productivity, export propensity, and technology-adoption norms. Manager experience, originally motivated by the upper-echelons framework (Hambrick &amp; Mason 1984) and initially considered as a control, was dropped after variance-inflation diagnostics indicated problematic collinearity with firm size.</w:t>
-      </w:r>
-    </w:p>
-    <w:bookmarkEnd w:id="44"/>
-    <w:bookmarkEnd w:id="45"/>
-    <w:bookmarkStart w:id="46" w:name="X84482d10811f20e2a246857c008316fafc15eb6"/>
+    <w:bookmarkStart w:id="44" w:name="X84482d10811f20e2a246857c008316fafc15eb6"/>
     <w:p>
       <w:pPr>
         <w:pStyle w:val="Heading3"/>
@@ -998,181 +942,181 @@
         <w:t xml:space="preserve">a credible exclusion restriction can produce more biased estimates than the OLS baseline it is intended to correct. A reduced-form inverse-Mills-ratio sensitivity diagnostic for selection at the extensive margin of exporting is reported in §3.4 below for transparency, but is not treated as the primary specification. The associational nature of the OLS estimates is therefore acknowledged upfront, and inferential claims are bounded to within-context associations rather than causal effects.</w:t>
       </w:r>
     </w:p>
+    <w:bookmarkEnd w:id="44"/>
+    <w:bookmarkStart w:id="45" w:name="X4758c326240d97a48e7d79456dba8f6cc5c46be"/>
+    <w:p>
+      <w:pPr>
+        <w:pStyle w:val="Heading3"/>
+      </w:pPr>
+      <w:r>
+        <w:t xml:space="preserve">3.4 Boundary conditions and identification scope</w:t>
+      </w:r>
+    </w:p>
+    <w:p>
+      <w:pPr>
+        <w:pStyle w:val="FirstParagraph"/>
+      </w:pPr>
+      <w:r>
+        <w:t xml:space="preserve">This subsection consolidates the methodological boundary conditions that constrain the inferential reach of the OLS specification, so that the §4 results can be presented without recurrent caveats and the §5 discussion can focus on substantive interpretation rather than on re-litigating identification concerns. Four boundary conditions are demarcated.</w:t>
+      </w:r>
+    </w:p>
+    <w:p>
+      <w:pPr>
+        <w:pStyle w:val="BodyText"/>
+      </w:pPr>
+      <w:r>
+        <w:rPr>
+          <w:iCs/>
+          <w:i/>
+        </w:rPr>
+        <w:t xml:space="preserve">(i) Sample-support boundary and upper-tail thinness.</w:t>
+      </w:r>
+      <w:r>
+        <w:t xml:space="preserve"> </w:t>
+      </w:r>
+      <w:r>
+        <w:t xml:space="preserve">The analytic sample (N = 623 full, 617 with all controls) is representative of Singapore's SME sector under the WBES sampling frame. Within this frame, 82 % of firms report zero exports, only 18 % report any positive export intensity, and only 3 % exceed 50 % FSTS. The implication for inference is that the curvature parameters in the quadratic FSTS specification are identified primarily through the participation contrast between FSTS = 0 and FSTS &gt; 0, with limited support in the upper tail of export intensity. The fitted turning point near FSTS ≈ 88.6 % falls in a sparsely populated region of the data, and the 95 % bootstrap confidence interval is wide ([53 %, 253 %]) even though an inverted-U shape is recovered in 96.3 % of resamples. The wide confidence interval [53%, 253%] reflects sparse upper-tail support (only 3% of firms exceed 50% FSTS); this is a support-constrained estimate and should be interpreted as indicating saturation rather than as a precise threshold value. The conventional inverted-U interpretation is therefore not formally identified within the supported data range, and the §4 results are interpreted under this support-aware framing.</w:t>
+      </w:r>
+    </w:p>
+    <w:p>
+      <w:pPr>
+        <w:pStyle w:val="BodyText"/>
+      </w:pPr>
+      <w:r>
+        <w:rPr>
+          <w:iCs/>
+          <w:i/>
+        </w:rPr>
+        <w:t xml:space="preserve">(ii) Exporters-only subsample and power-bounded interaction inference.</w:t>
+      </w:r>
+      <w:r>
+        <w:t xml:space="preserve"> </w:t>
+      </w:r>
+      <w:r>
+        <w:t xml:space="preserve">The exporters-only subsample (FSTS &gt; 0, N = 84) is the natural setting in which to read the intensity-margin coordination-cost mechanism, but is substantially underpowered for detecting the small effect-size moderation block (f² ≈ 0.018). At α = .05 with one numerator degree of freedom, achieving 80 % power requires N ≳ 430; power at N = 84 is approximately 16 %. Three inferential bounds therefore apply: (a)</w:t>
+      </w:r>
+      <w:r>
+        <w:t xml:space="preserve"> </w:t>
+      </w:r>
+      <w:r>
+        <w:rPr>
+          <w:iCs/>
+          <w:i/>
+        </w:rPr>
+        <w:t xml:space="preserve">What cannot be concluded</w:t>
+      </w:r>
+      <w:r>
+        <w:t xml:space="preserve">: the intensity-margin DAI mechanism cannot be confirmed in the exporter-only subsample (N = 84, power ≈ 16%) — we are underpowered to detect interaction effects of β &lt; 1.5 standard deviations; (b)</w:t>
+      </w:r>
+      <w:r>
+        <w:t xml:space="preserve"> </w:t>
+      </w:r>
+      <w:r>
+        <w:rPr>
+          <w:iCs/>
+          <w:i/>
+        </w:rPr>
+        <w:t xml:space="preserve">Methodological remedy</w:t>
+      </w:r>
+      <w:r>
+        <w:t xml:space="preserve">: panel data or an exporter oversampling design with N ≥ 300 would enable intensity-margin inference; (c) power requirements for interaction testing follow Leon (2004). Null DAI moderation results in the exporters-only specification therefore should not be interpreted as evidence against the conditional-scaling mechanism; conversely, the positive joint F-test reported in the R5 exporters-only specification (F = 6.32, p = .003, β = +2.821) is a stronger positive signal than the marginal sample size would ordinarily support, and is read here as a high-prior-strength signal consistent with the full-sample amplification mechanism rather than as a stand-alone identifying test.</w:t>
+      </w:r>
+    </w:p>
+    <w:p>
+      <w:pPr>
+        <w:pStyle w:val="BodyText"/>
+      </w:pPr>
+      <w:r>
+        <w:rPr>
+          <w:iCs/>
+          <w:i/>
+        </w:rPr>
+        <w:t xml:space="preserve">(iii) Lind–Mehlum equivalence framing of the upper-tail decline.</w:t>
+      </w:r>
+      <w:r>
+        <w:t xml:space="preserve"> </w:t>
+      </w:r>
+      <w:r>
+        <w:t xml:space="preserve">The Lind–Mehlum (2010) test does not formally reject monotonicity at conventional thresholds (p = .303 in the baseline pooled specification) — but the appropriate reading of this null is not "the inverted-U fails", because the test is conditioned on dense support around the turning point, which the §3.4(i) sample-support boundary establishes is absent here. Read against the saturation hypothesis developed in §1.1, the Lind–Mehlum null is a</w:t>
+      </w:r>
+      <w:r>
+        <w:t xml:space="preserve"> </w:t>
+      </w:r>
+      <w:r>
+        <w:rPr>
+          <w:iCs/>
+          <w:i/>
+        </w:rPr>
+        <w:t xml:space="preserve">theoretically informative absence-of-decline</w:t>
+      </w:r>
+      <w:r>
+        <w:t xml:space="preserve"> </w:t>
+      </w:r>
+      <w:r>
+        <w:t xml:space="preserve">in the right tail: if foundational digital infrastructure is sufficiently mature to absorb the coordination-cost saturation that produces the conventional inverted-U right-side decline, the appropriate empirical signature is precisely the</w:t>
+      </w:r>
+      <w:r>
+        <w:t xml:space="preserve"> </w:t>
+      </w:r>
+      <w:r>
+        <w:rPr>
+          <w:iCs/>
+          <w:i/>
+        </w:rPr>
+        <w:t xml:space="preserve">non-rejection</w:t>
+      </w:r>
+      <w:r>
+        <w:t xml:space="preserve"> </w:t>
+      </w:r>
+      <w:r>
+        <w:t xml:space="preserve">of monotonicity in the upper tail. This equivalence-framed reading is consistent with both the descriptive evidence (the right tail does not slope sharply downward) and the theoretical commitment in §1.1 (Tier-2 digital infrastructure absorbs the coordination-cost mechanism that generates the inverted-U in less digitally mature settings). The Lind–Mehlum p = .303 is therefore a</w:t>
+      </w:r>
+      <w:r>
+        <w:t xml:space="preserve"> </w:t>
+      </w:r>
+      <w:r>
+        <w:rPr>
+          <w:iCs/>
+          <w:i/>
+        </w:rPr>
+        <w:t xml:space="preserve">positive theoretical signal</w:t>
+      </w:r>
+      <w:r>
+        <w:t xml:space="preserve"> </w:t>
+      </w:r>
+      <w:r>
+        <w:t xml:space="preserve">under the saturation framework, not a methodological failure.</w:t>
+      </w:r>
+    </w:p>
+    <w:p>
+      <w:pPr>
+        <w:pStyle w:val="BodyText"/>
+      </w:pPr>
+      <w:r>
+        <w:rPr>
+          <w:iCs/>
+          <w:i/>
+        </w:rPr>
+        <w:t xml:space="preserve">(iv) Heckman selection sensitivity and absence of an exclusion restriction.</w:t>
+      </w:r>
+      <w:r>
+        <w:t xml:space="preserve"> </w:t>
+      </w:r>
+      <w:r>
+        <w:t xml:space="preserve">No instrument satisfying the exclusion restriction for export participation is available in the single-wave WBES Singapore design. A reduced-form sensitivity check estimates a first-stage probit of export participation on observable firm characteristics (age, log size, sector fixed effects, WBES sampling stratum) and adds the resulting inverse Mills ratio (IMR) as a covariate to the M8 specification. The IMR coefficient (β = 0.264, SE = 0.138, t = 1.92, p = .055) is just above the .05 threshold, indicating mild selection at the extensive margin of export participation. The key DAI × FSTS² interaction (H3 amplification) and the TCI coefficient are not materially altered (|Δ| &lt; 0.02 in each case), confirming that the conditional-scaling mechanism is robust to this selection adjustment. Consistent with Wolfolds and Siegel (2019), the OLS estimates are reported as the primary specification with the caveat that selection on unobservables cannot be fully excluded from the single-wave cross-sectional design.</w:t>
+      </w:r>
+    </w:p>
+    <w:p>
+      <w:pPr>
+        <w:pStyle w:val="BodyText"/>
+      </w:pPr>
+      <w:r>
+        <w:t xml:space="preserve">Read together, these four boundary conditions establish that (a) the upper-tail inverted-U decline is not formally identified within the supported data range — but is not expected to be identified, given the saturation framework; (b) the exporters-only specification provides a high-prior-strength corroborating signal rather than an independent identifying test; (c) the Lind–Mehlum null is a theoretically informative positive signal under the saturation hypothesis, not a methodological failure; and (d) the H3 amplification mechanism is robust to the Heckman sensitivity diagnostic. The §4 results below are reported on this consolidated identification scope, and §5 interprets the substantive findings without further re-litigation of these boundary conditions.</w:t>
+      </w:r>
+    </w:p>
+    <w:bookmarkEnd w:id="45"/>
     <w:bookmarkEnd w:id="46"/>
-    <w:bookmarkStart w:id="47" w:name="X4758c326240d97a48e7d79456dba8f6cc5c46be"/>
-    <w:p>
-      <w:pPr>
-        <w:pStyle w:val="Heading3"/>
-      </w:pPr>
-      <w:r>
-        <w:t xml:space="preserve">3.4 Boundary conditions and identification scope</w:t>
-      </w:r>
-    </w:p>
-    <w:p>
-      <w:pPr>
-        <w:pStyle w:val="FirstParagraph"/>
-      </w:pPr>
-      <w:r>
-        <w:t xml:space="preserve">This subsection consolidates the methodological boundary conditions that constrain the inferential reach of the OLS specification, so that the §4 results can be presented without recurrent caveats and the §5 discussion can focus on substantive interpretation rather than on re-litigating identification concerns. Four boundary conditions are demarcated.</w:t>
-      </w:r>
-    </w:p>
-    <w:p>
-      <w:pPr>
-        <w:pStyle w:val="BodyText"/>
-      </w:pPr>
-      <w:r>
-        <w:rPr>
-          <w:iCs/>
-          <w:i/>
-        </w:rPr>
-        <w:t xml:space="preserve">(i) Sample-support boundary and upper-tail thinness.</w:t>
-      </w:r>
-      <w:r>
-        <w:t xml:space="preserve"> </w:t>
-      </w:r>
-      <w:r>
-        <w:t xml:space="preserve">The analytic sample (N = 623 full, 617 with all controls) is representative of Singapore's SME sector under the WBES sampling frame. Within this frame, 82 % of firms report zero exports, only 18 % report any positive export intensity, and only 3 % exceed 50 % FSTS. The implication for inference is that the curvature parameters in the quadratic FSTS specification are identified primarily through the participation contrast between FSTS = 0 and FSTS &gt; 0, with limited support in the upper tail of export intensity. The fitted turning point near FSTS ≈ 88.6 % falls in a sparsely populated region of the data, and the 95 % bootstrap confidence interval is wide ([53 %, 253 %]) even though an inverted-U shape is recovered in 96.3 % of resamples. The wide confidence interval [53%, 253%] reflects sparse upper-tail support (only 3% of firms exceed 50% FSTS); this is a support-constrained estimate and should be interpreted as indicating saturation rather than as a precise threshold value. The conventional inverted-U interpretation is therefore not formally identified within the supported data range, and the §4 results are interpreted under this support-aware framing.</w:t>
-      </w:r>
-    </w:p>
-    <w:p>
-      <w:pPr>
-        <w:pStyle w:val="BodyText"/>
-      </w:pPr>
-      <w:r>
-        <w:rPr>
-          <w:iCs/>
-          <w:i/>
-        </w:rPr>
-        <w:t xml:space="preserve">(ii) Exporters-only subsample and power-bounded interaction inference.</w:t>
-      </w:r>
-      <w:r>
-        <w:t xml:space="preserve"> </w:t>
-      </w:r>
-      <w:r>
-        <w:t xml:space="preserve">The exporters-only subsample (FSTS &gt; 0, N = 84) is the natural setting in which to read the intensity-margin coordination-cost mechanism, but is substantially underpowered for detecting the small effect-size moderation block (f² ≈ 0.018). At α = .05 with one numerator degree of freedom, achieving 80 % power requires N ≳ 430; power at N = 84 is approximately 16 %. Three inferential bounds therefore apply: (a)</w:t>
-      </w:r>
-      <w:r>
-        <w:t xml:space="preserve"> </w:t>
-      </w:r>
-      <w:r>
-        <w:rPr>
-          <w:iCs/>
-          <w:i/>
-        </w:rPr>
-        <w:t xml:space="preserve">What cannot be concluded</w:t>
-      </w:r>
-      <w:r>
-        <w:t xml:space="preserve">: the intensity-margin DAI mechanism cannot be confirmed in the exporter-only subsample (N = 84, power ≈ 16%) — we are underpowered to detect interaction effects of β &lt; 1.5 standard deviations; (b)</w:t>
-      </w:r>
-      <w:r>
-        <w:t xml:space="preserve"> </w:t>
-      </w:r>
-      <w:r>
-        <w:rPr>
-          <w:iCs/>
-          <w:i/>
-        </w:rPr>
-        <w:t xml:space="preserve">Methodological remedy</w:t>
-      </w:r>
-      <w:r>
-        <w:t xml:space="preserve">: panel data or an exporter oversampling design with N ≥ 300 would enable intensity-margin inference; (c) power requirements for interaction testing follow Leon (2004). Null DAI moderation results in the exporters-only specification therefore should not be interpreted as evidence against the conditional-scaling mechanism; conversely, the positive joint F-test reported in the R5 exporters-only specification (F = 6.32, p = .003, β = +2.821) is a stronger positive signal than the marginal sample size would ordinarily support, and is read here as a high-prior-strength signal consistent with the full-sample amplification mechanism rather than as a stand-alone identifying test.</w:t>
-      </w:r>
-    </w:p>
-    <w:p>
-      <w:pPr>
-        <w:pStyle w:val="BodyText"/>
-      </w:pPr>
-      <w:r>
-        <w:rPr>
-          <w:iCs/>
-          <w:i/>
-        </w:rPr>
-        <w:t xml:space="preserve">(iii) Lind–Mehlum equivalence framing of the upper-tail decline.</w:t>
-      </w:r>
-      <w:r>
-        <w:t xml:space="preserve"> </w:t>
-      </w:r>
-      <w:r>
-        <w:t xml:space="preserve">The Lind–Mehlum (2010) test does not formally reject monotonicity at conventional thresholds (p = .303 in the baseline pooled specification) — but the appropriate reading of this null is not "the inverted-U fails", because the test is conditioned on dense support around the turning point, which the §3.4(i) sample-support boundary establishes is absent here. Read against the saturation hypothesis developed in §1.1, the Lind–Mehlum null is a</w:t>
-      </w:r>
-      <w:r>
-        <w:t xml:space="preserve"> </w:t>
-      </w:r>
-      <w:r>
-        <w:rPr>
-          <w:iCs/>
-          <w:i/>
-        </w:rPr>
-        <w:t xml:space="preserve">theoretically informative absence-of-decline</w:t>
-      </w:r>
-      <w:r>
-        <w:t xml:space="preserve"> </w:t>
-      </w:r>
-      <w:r>
-        <w:t xml:space="preserve">in the right tail: if foundational digital infrastructure is sufficiently mature to absorb the coordination-cost saturation that produces the conventional inverted-U right-side decline, the appropriate empirical signature is precisely the</w:t>
-      </w:r>
-      <w:r>
-        <w:t xml:space="preserve"> </w:t>
-      </w:r>
-      <w:r>
-        <w:rPr>
-          <w:iCs/>
-          <w:i/>
-        </w:rPr>
-        <w:t xml:space="preserve">non-rejection</w:t>
-      </w:r>
-      <w:r>
-        <w:t xml:space="preserve"> </w:t>
-      </w:r>
-      <w:r>
-        <w:t xml:space="preserve">of monotonicity in the upper tail. This equivalence-framed reading is consistent with both the descriptive evidence (the right tail does not slope sharply downward) and the theoretical commitment in §1.1 (Tier-2 digital infrastructure absorbs the coordination-cost mechanism that generates the inverted-U in less digitally mature settings). The Lind–Mehlum p = .303 is therefore a</w:t>
-      </w:r>
-      <w:r>
-        <w:t xml:space="preserve"> </w:t>
-      </w:r>
-      <w:r>
-        <w:rPr>
-          <w:iCs/>
-          <w:i/>
-        </w:rPr>
-        <w:t xml:space="preserve">positive theoretical signal</w:t>
-      </w:r>
-      <w:r>
-        <w:t xml:space="preserve"> </w:t>
-      </w:r>
-      <w:r>
-        <w:t xml:space="preserve">under the saturation framework, not a methodological failure.</w:t>
-      </w:r>
-    </w:p>
-    <w:p>
-      <w:pPr>
-        <w:pStyle w:val="BodyText"/>
-      </w:pPr>
-      <w:r>
-        <w:rPr>
-          <w:iCs/>
-          <w:i/>
-        </w:rPr>
-        <w:t xml:space="preserve">(iv) Heckman selection sensitivity and absence of an exclusion restriction.</w:t>
-      </w:r>
-      <w:r>
-        <w:t xml:space="preserve"> </w:t>
-      </w:r>
-      <w:r>
-        <w:t xml:space="preserve">No instrument satisfying the exclusion restriction for export participation is available in the single-wave WBES Singapore design. A reduced-form sensitivity check estimates a first-stage probit of export participation on observable firm characteristics (age, log size, sector fixed effects, WBES sampling stratum) and adds the resulting inverse Mills ratio (IMR) as a covariate to the M8 specification. The IMR coefficient (β = 0.264, SE = 0.138, t = 1.92, p = .055) is just above the .05 threshold, indicating mild selection at the extensive margin of export participation. The key DAI × FSTS² interaction (H3 amplification) and the TCI coefficient are not materially altered (|Δ| &lt; 0.02 in each case), confirming that the conditional-scaling mechanism is robust to this selection adjustment. Consistent with Wolfolds and Siegel (2019), the OLS estimates are reported as the primary specification with the caveat that selection on unobservables cannot be fully excluded from the single-wave cross-sectional design.</w:t>
-      </w:r>
-    </w:p>
-    <w:p>
-      <w:pPr>
-        <w:pStyle w:val="BodyText"/>
-      </w:pPr>
-      <w:r>
-        <w:t xml:space="preserve">Read together, these four boundary conditions establish that (a) the upper-tail inverted-U decline is not formally identified within the supported data range — but is not expected to be identified, given the saturation framework; (b) the exporters-only specification provides a high-prior-strength corroborating signal rather than an independent identifying test; (c) the Lind–Mehlum null is a theoretically informative positive signal under the saturation hypothesis, not a methodological failure; and (d) the H3 amplification mechanism is robust to the Heckman sensitivity diagnostic. The §4 results below are reported on this consolidated identification scope, and §5 interprets the substantive findings without further re-litigation of these boundary conditions.</w:t>
-      </w:r>
-    </w:p>
-    <w:bookmarkEnd w:id="47"/>
-    <w:bookmarkEnd w:id="48"/>
-    <w:bookmarkStart w:id="60" w:name="X121719332867ee227f0a04b486098cee978c6e6"/>
+    <w:bookmarkStart w:id="58" w:name="X121719332867ee227f0a04b486098cee978c6e6"/>
     <w:p>
       <w:pPr>
         <w:pStyle w:val="Heading2"/>
@@ -1181,7 +1125,7 @@
         <w:t xml:space="preserve">4 Results</w:t>
       </w:r>
     </w:p>
-    <w:bookmarkStart w:id="49" w:name="Xcfcbc1028680fbd618b9b585dd17cf608861803"/>
+    <w:bookmarkStart w:id="47" w:name="Xcfcbc1028680fbd618b9b585dd17cf608861803"/>
     <w:p>
       <w:pPr>
         <w:pStyle w:val="Heading3"/>
@@ -1492,63 +1436,63 @@
         <w:t xml:space="preserve">Notes: N = 623. TCI and DAI are z-standardized formative composites. FSTS is the share of annual sales accounted for by direct exports. Two-tailed significance levels are reported as follows: p &lt; .10, p &lt; .05, p &lt; .01.</w:t>
       </w:r>
     </w:p>
+    <w:bookmarkEnd w:id="47"/>
+    <w:bookmarkStart w:id="48" w:name="Xe86cbbe4620ce5d84f78b7737e30408048ed6af"/>
+    <w:p>
+      <w:pPr>
+        <w:pStyle w:val="Heading3"/>
+      </w:pPr>
+      <w:r>
+        <w:t xml:space="preserve">4.2 The I–P relationship: primarily monotonic with mild curvature</w:t>
+      </w:r>
+    </w:p>
+    <w:p>
+      <w:pPr>
+        <w:pStyle w:val="FirstParagraph"/>
+      </w:pPr>
+      <w:r>
+        <w:t xml:space="preserve">In the baseline quadratic specification (Model M2), the linear FSTS term is positive and statistically significant (β = +2.652, SE = 0.691, p &lt; .001), whereas the squared term is negative and marginally significant (β = −1.705, SE = 0.931, p &lt; .10). The fitted curve therefore implies a turning point in the upper tail of the export-intensity distribution, near FSTS = 82% on the original scale, but that point is imprecisely located and falls in a sparsely populated region of the data. The 5,000-replication bootstrap recovers an inverted-U shape frequently (96.3% of replications), yet the corresponding 95% percentile confidence interval for the turning point is wide ([53%, 253%]), and the Lind–Mehlum test does not formally confirm a conventional inverted-U at conventional significance levels (p = .303). This null is itself an informative positive result: Singapore's DAI distribution is concentrated at the high end — approximately 67% of firms report website presence and Tier 2 e-payment adoption is widespread — leaving insufficient distributional spread to formally identify the right-side decline within the observable FSTS range. In a digitally mature economy where Tier 1–2 coordination tools are widely diffused, the attenuation of the classic coordination-cost mechanism is consistent with the saturation hypothesis underlying H3 rather than constituting a failure of the inverted-U framework. The interpretive force of this null is sharpened by an equivalence-test framing (Lakens, Scheel, &amp; Isager, 2018): with the observed FSTS range bounded essentially at the 70th percentile of the distribution, the L–M test is statistically underpowered to distinguish "no inverted-U" from "inverted-U whose right-side decline has been pushed into the unobserved upper tail." Under both hypotheses the data are consistent with a predominantly positive monotonic association across the supported range; what equivalence framing rules out is only the strong claim of a firmly identified inverted-U</w:t>
+      </w:r>
+      <w:r>
+        <w:t xml:space="preserve"> </w:t>
+      </w:r>
+      <w:r>
+        <w:rPr>
+          <w:iCs/>
+          <w:i/>
+        </w:rPr>
+        <w:t xml:space="preserve">within the observed support</w:t>
+      </w:r>
+      <w:r>
+        <w:t xml:space="preserve">. The most defensible interpretation is therefore not that the inverted-U is firmly established, but that the full-sample relationship is predominantly positive with mild quadratic curvature over the observed export-intensity range. In this sense, the quadratic fit is informative descriptively, while stronger claims about a structurally identified right-side decline remain beyond what the present data can support. Read this way, the evidence qualifies rather than overturns the conventional nonlinear literature, while keeping interpretation within the empirical support actually available in the Singapore sample.</w:t>
+      </w:r>
+    </w:p>
+    <w:bookmarkEnd w:id="48"/>
+    <w:bookmarkStart w:id="49" w:name="Xbd081e7d38ad07e1e46d233e5fbc3c3c47a4f64"/>
+    <w:p>
+      <w:pPr>
+        <w:pStyle w:val="Heading3"/>
+      </w:pPr>
+      <w:r>
+        <w:t xml:space="preserve">4.3 TCI results</w:t>
+      </w:r>
+    </w:p>
+    <w:p>
+      <w:pPr>
+        <w:pStyle w:val="FirstParagraph"/>
+      </w:pPr>
+      <w:r>
+        <w:t xml:space="preserve">The direct-effect model for technological capability (Model M5) shows that TCI is positively associated with labour productivity (β = 0.168, SE = 0.040, p &lt; .001). Model fit also improves relative to the quadratic baseline, with R² rising from 0.178 in Model M2 to 0.199 in Model M5. This pattern supports the view that technological capability raises the firm’s productivity base rather than simply proxying for export intensity.</w:t>
+      </w:r>
+      <w:r>
+        <w:t xml:space="preserve"> </w:t>
+      </w:r>
+      <w:r>
+        <w:t xml:space="preserve">In the supplementary TCI-moderation specification (Model M3), the direct TCI coefficient remains positive and significant (β = 0.188, p &lt; .001), but the interaction terms involving FSTS and squared FSTS are jointly insignificant. Because the absence of moderation cannot be inferred from non-significance alone, the evidence is better read as supporting an intercept-dominant interpretation of the TCI association rather than as a definitive demonstration that curvature moderation is exactly zero. Taken together, the evidence is more consistent with an intercept-dominant reading of the TCI association than with a clearly identified moderation channel in the internationalization–performance relationship. This is also the most coherent reading for hypothesis development, because it preserves the distinction between internal capability depth and export-contingent digital complementarity.</w:t>
+      </w:r>
+    </w:p>
     <w:bookmarkEnd w:id="49"/>
-    <w:bookmarkStart w:id="50" w:name="Xe86cbbe4620ce5d84f78b7737e30408048ed6af"/>
-    <w:p>
-      <w:pPr>
-        <w:pStyle w:val="Heading3"/>
-      </w:pPr>
-      <w:r>
-        <w:t xml:space="preserve">4.2 The I–P relationship: primarily monotonic with mild curvature</w:t>
-      </w:r>
-    </w:p>
-    <w:p>
-      <w:pPr>
-        <w:pStyle w:val="FirstParagraph"/>
-      </w:pPr>
-      <w:r>
-        <w:t xml:space="preserve">In the baseline quadratic specification (Model M2), the linear FSTS term is positive and statistically significant (β = +2.652, SE = 0.691, p &lt; .001), whereas the squared term is negative and marginally significant (β = −1.705, SE = 0.931, p &lt; .10). The fitted curve therefore implies a turning point in the upper tail of the export-intensity distribution, near FSTS = 82% on the original scale, but that point is imprecisely located and falls in a sparsely populated region of the data. The 5,000-replication bootstrap recovers an inverted-U shape frequently (96.3% of replications), yet the corresponding 95% percentile confidence interval for the turning point is wide ([53%, 253%]), and the Lind–Mehlum test does not formally confirm a conventional inverted-U at conventional significance levels (p = .303). This null is itself an informative positive result: Singapore's DAI distribution is concentrated at the high end — approximately 67% of firms report website presence and Tier 2 e-payment adoption is widespread — leaving insufficient distributional spread to formally identify the right-side decline within the observable FSTS range. In a digitally mature economy where Tier 1–2 coordination tools are widely diffused, the attenuation of the classic coordination-cost mechanism is consistent with the saturation hypothesis underlying H3 rather than constituting a failure of the inverted-U framework. The interpretive force of this null is sharpened by an equivalence-test framing (Lakens, Scheel, &amp; Isager, 2018): with the observed FSTS range bounded essentially at the 70th percentile of the distribution, the L–M test is statistically underpowered to distinguish "no inverted-U" from "inverted-U whose right-side decline has been pushed into the unobserved upper tail." Under both hypotheses the data are consistent with a predominantly positive monotonic association across the supported range; what equivalence framing rules out is only the strong claim of a firmly identified inverted-U</w:t>
-      </w:r>
-      <w:r>
-        <w:t xml:space="preserve"> </w:t>
-      </w:r>
-      <w:r>
-        <w:rPr>
-          <w:iCs/>
-          <w:i/>
-        </w:rPr>
-        <w:t xml:space="preserve">within the observed support</w:t>
-      </w:r>
-      <w:r>
-        <w:t xml:space="preserve">. The most defensible interpretation is therefore not that the inverted-U is firmly established, but that the full-sample relationship is predominantly positive with mild quadratic curvature over the observed export-intensity range. In this sense, the quadratic fit is informative descriptively, while stronger claims about a structurally identified right-side decline remain beyond what the present data can support. Read this way, the evidence qualifies rather than overturns the conventional nonlinear literature, while keeping interpretation within the empirical support actually available in the Singapore sample.</w:t>
-      </w:r>
-    </w:p>
-    <w:bookmarkEnd w:id="50"/>
-    <w:bookmarkStart w:id="51" w:name="Xbd081e7d38ad07e1e46d233e5fbc3c3c47a4f64"/>
-    <w:p>
-      <w:pPr>
-        <w:pStyle w:val="Heading3"/>
-      </w:pPr>
-      <w:r>
-        <w:t xml:space="preserve">4.3 TCI results</w:t>
-      </w:r>
-    </w:p>
-    <w:p>
-      <w:pPr>
-        <w:pStyle w:val="FirstParagraph"/>
-      </w:pPr>
-      <w:r>
-        <w:t xml:space="preserve">The direct-effect model for technological capability (Model M5) shows that TCI is positively associated with labour productivity (β = 0.168, SE = 0.040, p &lt; .001). Model fit also improves relative to the quadratic baseline, with R² rising from 0.178 in Model M2 to 0.199 in Model M5. This pattern supports the view that technological capability raises the firm’s productivity base rather than simply proxying for export intensity.</w:t>
-      </w:r>
-      <w:r>
-        <w:t xml:space="preserve"> </w:t>
-      </w:r>
-      <w:r>
-        <w:t xml:space="preserve">In the supplementary TCI-moderation specification (Model M3), the direct TCI coefficient remains positive and significant (β = 0.188, p &lt; .001), but the interaction terms involving FSTS and squared FSTS are jointly insignificant. Because the absence of moderation cannot be inferred from non-significance alone, the evidence is better read as supporting an intercept-dominant interpretation of the TCI association rather than as a definitive demonstration that curvature moderation is exactly zero. Taken together, the evidence is more consistent with an intercept-dominant reading of the TCI association than with a clearly identified moderation channel in the internationalization–performance relationship. This is also the most coherent reading for hypothesis development, because it preserves the distinction between internal capability depth and export-contingent digital complementarity.</w:t>
-      </w:r>
-    </w:p>
-    <w:bookmarkEnd w:id="51"/>
-    <w:bookmarkStart w:id="58" w:name="X0bc604979a3b7f5f87ce430a2a9c0e71ddd76f9"/>
+    <w:bookmarkStart w:id="56" w:name="X0bc604979a3b7f5f87ce430a2a9c0e71ddd76f9"/>
     <w:p>
       <w:pPr>
         <w:pStyle w:val="Heading3"/>
@@ -4177,18 +4121,18 @@
           <wp:inline>
             <wp:extent cx="5564514" cy="3588675"/>
             <wp:effectExtent b="0" l="0" r="0" t="0"/>
-            <wp:docPr descr="Figure 2: Marginal effects of DAI on log labour productivity at varying FSTS levels (Singapore, N=617)" title="" id="53" name="Picture"/>
+            <wp:docPr descr="Figure 2: Marginal effects of DAI on log labour productivity at varying FSTS levels (Singapore, N=617)" title="" id="51" name="Picture"/>
             <a:graphic>
               <a:graphicData uri="http://schemas.openxmlformats.org/drawingml/2006/picture">
                 <pic:pic>
                   <pic:nvPicPr>
-                    <pic:cNvPr descr="figures/p4_singapore/figure_2_dai_marginal_effect.png" id="54" name="Picture"/>
+                    <pic:cNvPr descr="figures/p4_singapore/figure_2_dai_marginal_effect.png" id="52" name="Picture"/>
                     <pic:cNvPicPr>
                       <a:picLocks noChangeArrowheads="1" noChangeAspect="1"/>
                     </pic:cNvPicPr>
                   </pic:nvPicPr>
                   <pic:blipFill>
-                    <a:blip r:embed="rId52"/>
+                    <a:blip r:embed="rId50"/>
                     <a:stretch>
                       <a:fillRect/>
                     </a:stretch>
@@ -4240,18 +4184,18 @@
           <wp:inline>
             <wp:extent cx="5422070" cy="3593270"/>
             <wp:effectExtent b="0" l="0" r="0" t="0"/>
-            <wp:docPr descr="Figure 3: Predicted I–P curve with bootstrap confidence band (Singapore, OLS M2)" title="" id="56" name="Picture"/>
+            <wp:docPr descr="Figure 3: Predicted I–P curve with bootstrap confidence band (Singapore, OLS M2)" title="" id="54" name="Picture"/>
             <a:graphic>
               <a:graphicData uri="http://schemas.openxmlformats.org/drawingml/2006/picture">
                 <pic:pic>
                   <pic:nvPicPr>
-                    <pic:cNvPr descr="figures/p4_singapore/figure_3_predicted_ip_curve.png" id="57" name="Picture"/>
+                    <pic:cNvPr descr="figures/p4_singapore/figure_3_predicted_ip_curve.png" id="55" name="Picture"/>
                     <pic:cNvPicPr>
                       <a:picLocks noChangeArrowheads="1" noChangeAspect="1"/>
                     </pic:cNvPicPr>
                   </pic:nvPicPr>
                   <pic:blipFill>
-                    <a:blip r:embed="rId55"/>
+                    <a:blip r:embed="rId53"/>
                     <a:stretch>
                       <a:fillRect/>
                     </a:stretch>
@@ -4302,8 +4246,8 @@
         <w:t xml:space="preserve">Figure 3 visualizes the baseline quadratic fit between export intensity and labour productivity. The fitted curve implies a turning point near FSTS = 88.6% on the original scale (corrected per reviewer fix #3: −β₁/2β₂ applied to mean-centered FSTS ≈ 84.1%; +sample mean 0.045 ≈ 88.6%), but the point estimate is loosely identified — its 95% percentile bootstrap confidence interval spans [53%, 253%] — and lies in a sparsely populated upper tail of the sample. The Lind–Mehlum test does not formally confirm a conventional inverted-U at conventional significance levels. The appropriate interpretation is therefore not that the classic nonlinear literature is overturned, but that in this Singapore sample the right-side decline of the curve appears attenuated or shifted beyond the export range occupied by most firms in the data.</w:t>
       </w:r>
     </w:p>
-    <w:bookmarkEnd w:id="58"/>
-    <w:bookmarkStart w:id="59" w:name="Xc8e997e14555d7ba8da5c1d596c5311617447cd"/>
+    <w:bookmarkEnd w:id="56"/>
+    <w:bookmarkStart w:id="57" w:name="Xc8e997e14555d7ba8da5c1d596c5311617447cd"/>
     <w:p>
       <w:pPr>
         <w:pStyle w:val="Heading3"/>
@@ -4955,9 +4899,9 @@
         <w:t xml:space="preserve">Table 3 evaluates whether the core inference is sensitive to measurement choice and sample composition. Across all reported robustness specifications, the quadratic DAI moderation term retains a positive sign, which strengthens confidence that the main result is not driven by a single operational decision. At the same time, the weakening of statistical significance in the thinner website-only specification suggests that the richer DAI baseline draws meaningful explanatory variation from the electronic-payment indicators in addition to simple digital presence. The exporters-only subsample is less stable because the number of exporting firms is limited and the right tail of export intensity remains thin, so these estimates should be interpreted cautiously. Taken together, the robustness results support the argument that foundational digital adoption acts as a contingent scaling complement, while also reinforcing that the evidence is strongest when interpreted within the Tier 1–2 measurement boundary of the DAI construct.</w:t>
       </w:r>
     </w:p>
-    <w:bookmarkEnd w:id="59"/>
-    <w:bookmarkEnd w:id="60"/>
-    <w:bookmarkStart w:id="63" w:name="X735612638e4e736e4693e459c258977262c0dfc"/>
+    <w:bookmarkEnd w:id="57"/>
+    <w:bookmarkEnd w:id="58"/>
+    <w:bookmarkStart w:id="61" w:name="X735612638e4e736e4693e459c258977262c0dfc"/>
     <w:p>
       <w:pPr>
         <w:pStyle w:val="Heading2"/>
@@ -4966,7 +4910,7 @@
         <w:t xml:space="preserve">5 Discussion</w:t>
       </w:r>
     </w:p>
-    <w:bookmarkStart w:id="61" w:name="X027b31c2d090a00917aa7291770680fd40b64cd"/>
+    <w:bookmarkStart w:id="59" w:name="X027b31c2d090a00917aa7291770680fd40b64cd"/>
     <w:p>
       <w:pPr>
         <w:pStyle w:val="Heading3"/>
@@ -5103,14 +5047,45 @@
         <w:t xml:space="preserve">The institutional transferability of the amplification finding rests on a construct-tier distinction with direct policy implications. In Singapore, the DAI composite captures Tier-1+2 digital capability — website presence (c22b) combined with electronic payment integration (k33/k38) embedded in the public digital infrastructure — enabling firms to execute frictionless cross-border transactions. In contrast, in transitional economies where Tier-2 payment infrastructure remains institutionally bounded — settings where cross-border electronic-payment rails reached systemic scale only in the late 2010s, as documented across lower-middle-income Asia in World Bank digital infrastructure assessments (World Bank, 2023) — the WBES website indicator captures Tier-1 presence only, and the amplification mechanism loses empirical legibility because the payment-integration channel is absent. The implication is that the amplification ceiling is not a Singapore-specific idiosyncrasy but a Tier-1+2 threshold effect: economies that upgrade payment infrastructure to Tier-2 coverage should expect the conditional complementarity pattern to become empirically detectable. This reframes Singapore from an outlier case to a leading indicator of where Tier-2 adoption leads.</w:t>
       </w:r>
     </w:p>
+    <w:bookmarkEnd w:id="59"/>
+    <w:bookmarkStart w:id="60" w:name="Xa4e692b259d9b803bab54ad026a7e8d888a5d2c"/>
+    <w:p>
+      <w:pPr>
+        <w:pStyle w:val="Heading3"/>
+      </w:pPr>
+      <w:r>
+        <w:t xml:space="preserve">5.2 Managerial implications</w:t>
+      </w:r>
+    </w:p>
+    <w:p>
+      <w:pPr>
+        <w:pStyle w:val="FirstParagraph"/>
+      </w:pPr>
+      <w:r>
+        <w:t xml:space="preserve">For firms in Singapore and comparable high-digital-infrastructure contexts, the findings suggest that investments in foundational digital adoption are most strongly associated with productivity advantages when firms already operate at relatively high export intensity. In such cases, digital interfaces, payment systems, and related transaction-enabling tools appear to function as scaling mechanisms that help firms coordinate a larger volume of cross-border activity more efficiently. For firms already deeply engaged in export markets, the managerial implication is therefore strategic rather than symbolic: foundational digital systems appear to matter most when coordination demands across customers, suppliers, and foreign-market transactions become dense enough for those systems to be used intensively.</w:t>
+      </w:r>
+      <w:r>
+        <w:t xml:space="preserve"> </w:t>
+      </w:r>
+      <w:r>
+        <w:t xml:space="preserve">For firms concentrated in domestic markets or at low export intensity, digital adoption may still be worthwhile, but the productivity differentials appear smaller and less distinctive in the present data. In this setting, basic digital functionality is already relatively widespread, so adopting such tools may not generate a large standalone labour-productivity premium for all firms equally. For firms in the intermediate export-intensity range, the results suggest caution in expecting immediate productivity gains from digital adoption alone; these investments are likely to be more valuable when aligned with broader objectives such as customer integration, supplier coordination, export readiness, and future scaling.</w:t>
+      </w:r>
+      <w:r>
+        <w:t xml:space="preserve"> </w:t>
+      </w:r>
+      <w:r>
+        <w:t xml:space="preserve">More broadly, the findings imply that managers should avoid treating technological capability and digital adoption as interchangeable investment categories. Investments in technological capability appear to support a broader productivity base, whereas investments in foundational digital adoption become more relevant when firms face the coordination intensity associated with deeper internationalization. This suggests that capability-building and digitalization strategies should be sequenced and matched to the firm’s actual stage of export expansion rather than pursued as a single undifferentiated digital-capability agenda.</w:t>
+      </w:r>
+    </w:p>
+    <w:bookmarkEnd w:id="60"/>
     <w:bookmarkEnd w:id="61"/>
-    <w:bookmarkStart w:id="62" w:name="Xa4e692b259d9b803bab54ad026a7e8d888a5d2c"/>
-    <w:p>
-      <w:pPr>
-        <w:pStyle w:val="Heading3"/>
-      </w:pPr>
-      <w:r>
-        <w:t xml:space="preserve">5.2 Managerial implications</w:t>
+    <w:bookmarkStart w:id="62" w:name="X6b297cc947e0db5526be369b1f0f4ddc67b2415"/>
+    <w:p>
+      <w:pPr>
+        <w:pStyle w:val="Heading2"/>
+      </w:pPr>
+      <w:r>
+        <w:t xml:space="preserve">6 Conclusion</w:t>
       </w:r>
     </w:p>
     <w:p>
@@ -5118,30 +5093,59 @@
         <w:pStyle w:val="FirstParagraph"/>
       </w:pPr>
       <w:r>
-        <w:t xml:space="preserve">For firms in Singapore and comparable high-digital-infrastructure contexts, the findings suggest that investments in foundational digital adoption are most strongly associated with productivity advantages when firms already operate at relatively high export intensity. In such cases, digital interfaces, payment systems, and related transaction-enabling tools appear to function as scaling mechanisms that help firms coordinate a larger volume of cross-border activity more efficiently. For firms already deeply engaged in export markets, the managerial implication is therefore strategic rather than symbolic: foundational digital systems appear to matter most when coordination demands across customers, suppliers, and foreign-market transactions become dense enough for those systems to be used intensively.</w:t>
-      </w:r>
-      <w:r>
-        <w:t xml:space="preserve"> </w:t>
-      </w:r>
-      <w:r>
-        <w:t xml:space="preserve">For firms concentrated in domestic markets or at low export intensity, digital adoption may still be worthwhile, but the productivity differentials appear smaller and less distinctive in the present data. In this setting, basic digital functionality is already relatively widespread, so adopting such tools may not generate a large standalone labour-productivity premium for all firms equally. For firms in the intermediate export-intensity range, the results suggest caution in expecting immediate productivity gains from digital adoption alone; these investments are likely to be more valuable when aligned with broader objectives such as customer integration, supplier coordination, export readiness, and future scaling.</w:t>
-      </w:r>
-      <w:r>
-        <w:t xml:space="preserve"> </w:t>
-      </w:r>
-      <w:r>
-        <w:t xml:space="preserve">More broadly, the findings imply that managers should avoid treating technological capability and digital adoption as interchangeable investment categories. Investments in technological capability appear to support a broader productivity base, whereas investments in foundational digital adoption become more relevant when firms face the coordination intensity associated with deeper internationalization. This suggests that capability-building and digitalization strategies should be sequenced and matched to the firm’s actual stage of export expansion rather than pursued as a single undifferentiated digital-capability agenda.</w:t>
+        <w:t xml:space="preserve">This study revisits the internationalization–performance relationship by distinguishing technological capability from foundational digital adoption and examining how each is associated with labour productivity among firms in Singapore. Using World Bank Enterprise Survey microdata for Singapore 2023, the analysis shows that technological capability is positively associated with productivity, while digital adoption exhibits a more conditional association that becomes more positive only at higher levels of export intensity. The findings therefore support a distinction between firm-internal capability depth and foundational digitally enabled transaction capacity rather than treating both domains as interchangeable aspects of a single digital-capability construct.</w:t>
+      </w:r>
+      <w:r>
+        <w:t xml:space="preserve"> </w:t>
+      </w:r>
+      <w:r>
+        <w:t xml:space="preserve">The study also qualifies the interpretation of the nonlinear I–P literature in this setting. Within the observed export-intensity range, the baseline pattern is better characterized as predominantly positive with mild quadratic curvature than as a formally identified inverted-U, because the implied turning point lies in a sparsely populated upper tail and is imprecisely located. Read in this way, the evidence does not overturn the established I–P literature, nor does it establish a general boundary condition for digitally mature economies; instead, it provides within-context evidence from Singapore on how the conventional nonlinear logic appears in a highly digitalized institutional environment where most firms remain concentrated at low export intensity.</w:t>
+      </w:r>
+      <w:r>
+        <w:t xml:space="preserve"> </w:t>
+      </w:r>
+      <w:r>
+        <w:t xml:space="preserve">More broadly, the study contributes to international business research by sharpening construct interpretation and by showing that technological capability and foundational digital adoption are associated with performance through different empirical patterns. Technological capability shows the more stable positive association with productivity, whereas foundational digital adoption is better interpreted as a conditional scaling resource whose relevance becomes more visible only where cross-border coordination demands are relatively intense. These conclusions are deliberately bounded to the present design and setting, and they point toward the need for comparative and longitudinal research before broader cross-setting claims about how digitalization shapes the I–P pattern can be sustained.</w:t>
       </w:r>
     </w:p>
     <w:bookmarkEnd w:id="62"/>
+    <w:bookmarkStart w:id="63" w:name="X422fdd10c3908fe492ea939b97371c73422dbba"/>
+    <w:p>
+      <w:pPr>
+        <w:pStyle w:val="Heading2"/>
+      </w:pPr>
+      <w:r>
+        <w:t xml:space="preserve">7 Limitations and Future Research</w:t>
+      </w:r>
+    </w:p>
+    <w:p>
+      <w:pPr>
+        <w:pStyle w:val="FirstParagraph"/>
+      </w:pPr>
+      <w:r>
+        <w:t xml:space="preserve">Three limitations warrant caution in interpreting the findings. First, the analysis is based on a single-country cross-section, so the identification scope is associational rather than causal. The observed relationships among technological capability, digital adoption, export intensity, and labour productivity may reflect reverse causation, omitted variables, or productivity-driven selection into exporting and digital adoption. The appropriate interpretation is therefore that the study documents how these variables co-vary in Singapore rather than establishing a causal mechanism.</w:t>
+      </w:r>
+      <w:r>
+        <w:t xml:space="preserve"> </w:t>
+      </w:r>
+      <w:r>
+        <w:t xml:space="preserve">Second, the sample contains a thin right tail of high-intensity exporters. Most firms report zero exports, the 75th percentile of FSTS remains at zero, and only a small fraction of firms occupy the high-export range in which the fitted turning point and the strongest DAI moderation signals appear. The implied turning point in the quadratic specification should therefore be interpreted as a descriptive feature rather than as a structurally identified inflection, because it is estimated from a sparsely populated region and its 95% bootstrap confidence interval is wide ([53%, 253%]) even though an inverted-U shape is recovered in 96.3% of resamples. The same caution applies to the DAI moderation pattern: it remains visible across leave-one-out, trimmed-tail, and indicator-sensitivity diagnostics, but precision is necessarily lower in the small exporter subsample (N = 84) and the sparsely populated high-intensity range. The appropriate caution therefore rests on the limited empirical support in the upper tail and the resulting imprecision of tail-based inference.</w:t>
+      </w:r>
+      <w:r>
+        <w:t xml:space="preserve"> </w:t>
+      </w:r>
+      <w:r>
+        <w:t xml:space="preserve">Third, the estimated digital-adoption effect should be interpreted within the measurement boundary of the available indicators. The DAI construct captures Tier 1–2 digital adoption — digital presence and electronic-transaction usage — rather than deeper digitally integrated organizational capability or digital dynamic capability; indicator-sensitivity analysis shows that the moderation pattern depends on the foundational digital-infrastructure indicators and weakens when those specific items are dropped. Future research should therefore examine whether the same conditional pattern appears in other digitally advanced economies and under richer measures that capture process integration, organizational digitalization, and higher-order digital capabilities more directly. Panel data, successive enterprise-survey waves, linked administrative records, and stronger quasi-experimental designs — including instrumental-variable or difference-in-differences specifications keyed to digital-infrastructure rollouts or trade-policy shocks — would also help clarify whether the observed associations reflect scaling complementarities, selection effects, or other mechanisms. Concrete instrumental-variable strategies could exploit firm-to-port distance or local customs-clearance times as instruments for export intensity, and regional broadband-coverage shares or within-sector peer-adoption rates as instruments for foundational digital adoption, although Wolfolds and Siegel (2019) caution that such designs require both adequate first-stage strength and credible exclusion restrictions before they can deliver clean causal identification.</w:t>
+      </w:r>
+    </w:p>
     <w:bookmarkEnd w:id="63"/>
-    <w:bookmarkStart w:id="64" w:name="X6b297cc947e0db5526be369b1f0f4ddc67b2415"/>
+    <w:bookmarkStart w:id="65" w:name="data-availability-statement"/>
     <w:p>
       <w:pPr>
         <w:pStyle w:val="Heading2"/>
       </w:pPr>
       <w:r>
-        <w:t xml:space="preserve">6 Conclusion</w:t>
+        <w:t xml:space="preserve">Data Availability Statement</w:t>
       </w:r>
     </w:p>
     <w:p>
@@ -5149,72 +5153,12 @@
         <w:pStyle w:val="FirstParagraph"/>
       </w:pPr>
       <w:r>
-        <w:t xml:space="preserve">This study revisits the internationalization–performance relationship by distinguishing technological capability from foundational digital adoption and examining how each is associated with labour productivity among firms in Singapore. Using World Bank Enterprise Survey microdata for Singapore 2023, the analysis shows that technological capability is positively associated with productivity, while digital adoption exhibits a more conditional association that becomes more positive only at higher levels of export intensity. The findings therefore support a distinction between firm-internal capability depth and foundational digitally enabled transaction capacity rather than treating both domains as interchangeable aspects of a single digital-capability construct.</w:t>
-      </w:r>
-      <w:r>
-        <w:t xml:space="preserve"> </w:t>
-      </w:r>
-      <w:r>
-        <w:t xml:space="preserve">The study also qualifies the interpretation of the nonlinear I–P literature in this setting. Within the observed export-intensity range, the baseline pattern is better characterized as predominantly positive with mild quadratic curvature than as a formally identified inverted-U, because the implied turning point lies in a sparsely populated upper tail and is imprecisely located. Read in this way, the evidence does not overturn the established I–P literature, nor does it establish a general boundary condition for digitally mature economies; instead, it provides within-context evidence from Singapore on how the conventional nonlinear logic appears in a highly digitalized institutional environment where most firms remain concentrated at low export intensity.</w:t>
-      </w:r>
-      <w:r>
-        <w:t xml:space="preserve"> </w:t>
-      </w:r>
-      <w:r>
-        <w:t xml:space="preserve">More broadly, the study contributes to international business research by sharpening construct interpretation and by showing that technological capability and foundational digital adoption are associated with performance through different empirical patterns. Technological capability shows the more stable positive association with productivity, whereas foundational digital adoption is better interpreted as a conditional scaling resource whose relevance becomes more visible only where cross-border coordination demands are relatively intense. These conclusions are deliberately bounded to the present design and setting, and they point toward the need for comparative and longitudinal research before broader cross-setting claims about how digitalization shapes the I–P pattern can be sustained.</w:t>
-      </w:r>
-    </w:p>
-    <w:bookmarkEnd w:id="64"/>
-    <w:bookmarkStart w:id="65" w:name="X422fdd10c3908fe492ea939b97371c73422dbba"/>
-    <w:p>
-      <w:pPr>
-        <w:pStyle w:val="Heading2"/>
-      </w:pPr>
-      <w:r>
-        <w:t xml:space="preserve">7 Limitations and Future Research</w:t>
-      </w:r>
-    </w:p>
-    <w:p>
-      <w:pPr>
-        <w:pStyle w:val="FirstParagraph"/>
-      </w:pPr>
-      <w:r>
-        <w:t xml:space="preserve">Three limitations warrant caution in interpreting the findings. First, the analysis is based on a single-country cross-section, so the identification scope is associational rather than causal. The observed relationships among technological capability, digital adoption, export intensity, and labour productivity may reflect reverse causation, omitted variables, or productivity-driven selection into exporting and digital adoption. The appropriate interpretation is therefore that the study documents how these variables co-vary in Singapore rather than establishing a causal mechanism.</w:t>
-      </w:r>
-      <w:r>
-        <w:t xml:space="preserve"> </w:t>
-      </w:r>
-      <w:r>
-        <w:t xml:space="preserve">Second, the sample contains a thin right tail of high-intensity exporters. Most firms report zero exports, the 75th percentile of FSTS remains at zero, and only a small fraction of firms occupy the high-export range in which the fitted turning point and the strongest DAI moderation signals appear. The implied turning point in the quadratic specification should therefore be interpreted as a descriptive feature rather than as a structurally identified inflection, because it is estimated from a sparsely populated region and its 95% bootstrap confidence interval is wide ([53%, 253%]) even though an inverted-U shape is recovered in 96.3% of resamples. The same caution applies to the DAI moderation pattern: it remains visible across leave-one-out, trimmed-tail, and indicator-sensitivity diagnostics, but precision is necessarily lower in the small exporter subsample (N = 84) and the sparsely populated high-intensity range. The appropriate caution therefore rests on the limited empirical support in the upper tail and the resulting imprecision of tail-based inference.</w:t>
-      </w:r>
-      <w:r>
-        <w:t xml:space="preserve"> </w:t>
-      </w:r>
-      <w:r>
-        <w:t xml:space="preserve">Third, the estimated digital-adoption effect should be interpreted within the measurement boundary of the available indicators. The DAI construct captures Tier 1–2 digital adoption — digital presence and electronic-transaction usage — rather than deeper digitally integrated organizational capability or digital dynamic capability; indicator-sensitivity analysis shows that the moderation pattern depends on the foundational digital-infrastructure indicators and weakens when those specific items are dropped. Future research should therefore examine whether the same conditional pattern appears in other digitally advanced economies and under richer measures that capture process integration, organizational digitalization, and higher-order digital capabilities more directly. Panel data, successive enterprise-survey waves, linked administrative records, and stronger quasi-experimental designs — including instrumental-variable or difference-in-differences specifications keyed to digital-infrastructure rollouts or trade-policy shocks — would also help clarify whether the observed associations reflect scaling complementarities, selection effects, or other mechanisms. Concrete instrumental-variable strategies could exploit firm-to-port distance or local customs-clearance times as instruments for export intensity, and regional broadband-coverage shares or within-sector peer-adoption rates as instruments for foundational digital adoption, although Wolfolds and Siegel (2019) caution that such designs require both adequate first-stage strength and credible exclusion restrictions before they can deliver clean causal identification.</w:t>
-      </w:r>
-    </w:p>
-    <w:bookmarkEnd w:id="65"/>
-    <w:bookmarkStart w:id="67" w:name="data-availability-statement"/>
-    <w:p>
-      <w:pPr>
-        <w:pStyle w:val="Heading2"/>
-      </w:pPr>
-      <w:r>
-        <w:t xml:space="preserve">Data Availability Statement</w:t>
-      </w:r>
-    </w:p>
-    <w:p>
-      <w:pPr>
-        <w:pStyle w:val="FirstParagraph"/>
-      </w:pPr>
-      <w:r>
         <w:t xml:space="preserve">The data analyzed in this study are from the World Bank Enterprise Survey (WBES) Singapore 2023 wave, publicly available at</w:t>
       </w:r>
       <w:r>
         <w:t xml:space="preserve"> </w:t>
       </w:r>
-      <w:hyperlink r:id="rId66">
+      <w:hyperlink r:id="rId64">
         <w:r>
           <w:rPr>
             <w:rStyle w:val="Hyperlink"/>
@@ -5226,14 +5170,50 @@
         <w:t xml:space="preserve">. Analysis scripts to replicate the results are available from the corresponding author on reasonable request.</w:t>
       </w:r>
     </w:p>
+    <w:bookmarkEnd w:id="65"/>
+    <w:bookmarkStart w:id="66" w:name="acknowledgements"/>
+    <w:p>
+      <w:pPr>
+        <w:pStyle w:val="Heading2"/>
+      </w:pPr>
+      <w:r>
+        <w:t xml:space="preserve">Acknowledgements</w:t>
+      </w:r>
+    </w:p>
+    <w:p>
+      <w:pPr>
+        <w:pStyle w:val="FirstParagraph"/>
+      </w:pPr>
+      <w:r>
+        <w:t xml:space="preserve">We thank the Enterprise Analysis Unit of the Development Economics Global Indicators Group of the World Bank for the data.</w:t>
+      </w:r>
+    </w:p>
+    <w:bookmarkEnd w:id="66"/>
+    <w:bookmarkStart w:id="67" w:name="funding"/>
+    <w:p>
+      <w:pPr>
+        <w:pStyle w:val="Heading2"/>
+      </w:pPr>
+      <w:r>
+        <w:t xml:space="preserve">Funding</w:t>
+      </w:r>
+    </w:p>
+    <w:p>
+      <w:pPr>
+        <w:pStyle w:val="FirstParagraph"/>
+      </w:pPr>
+      <w:r>
+        <w:t xml:space="preserve">This research received no external funding.</w:t>
+      </w:r>
+    </w:p>
     <w:bookmarkEnd w:id="67"/>
-    <w:bookmarkStart w:id="68" w:name="acknowledgements"/>
+    <w:bookmarkStart w:id="68" w:name="conflict-of-interest"/>
     <w:p>
       <w:pPr>
         <w:pStyle w:val="Heading2"/>
       </w:pPr>
       <w:r>
-        <w:t xml:space="preserve">Acknowledgements</w:t>
+        <w:t xml:space="preserve">Conflict of Interest</w:t>
       </w:r>
     </w:p>
     <w:p>
@@ -5241,47 +5221,11 @@
         <w:pStyle w:val="FirstParagraph"/>
       </w:pPr>
       <w:r>
-        <w:t xml:space="preserve">We thank the Enterprise Analysis Unit of the Development Economics Global Indicators Group of the World Bank for the data.</w:t>
+        <w:t xml:space="preserve">The authors declare no conflicts of interest.</w:t>
       </w:r>
     </w:p>
     <w:bookmarkEnd w:id="68"/>
-    <w:bookmarkStart w:id="69" w:name="funding"/>
-    <w:p>
-      <w:pPr>
-        <w:pStyle w:val="Heading2"/>
-      </w:pPr>
-      <w:r>
-        <w:t xml:space="preserve">Funding</w:t>
-      </w:r>
-    </w:p>
-    <w:p>
-      <w:pPr>
-        <w:pStyle w:val="FirstParagraph"/>
-      </w:pPr>
-      <w:r>
-        <w:t xml:space="preserve">This research received no external funding.</w:t>
-      </w:r>
-    </w:p>
-    <w:bookmarkEnd w:id="69"/>
-    <w:bookmarkStart w:id="70" w:name="conflict-of-interest"/>
-    <w:p>
-      <w:pPr>
-        <w:pStyle w:val="Heading2"/>
-      </w:pPr>
-      <w:r>
-        <w:t xml:space="preserve">Conflict of Interest</w:t>
-      </w:r>
-    </w:p>
-    <w:p>
-      <w:pPr>
-        <w:pStyle w:val="FirstParagraph"/>
-      </w:pPr>
-      <w:r>
-        <w:t xml:space="preserve">The authors declare no conflicts of interest.</w:t>
-      </w:r>
-    </w:p>
-    <w:bookmarkEnd w:id="70"/>
-    <w:bookmarkStart w:id="72" w:name="ai-and-data-availability"/>
+    <w:bookmarkStart w:id="70" w:name="ai-and-data-availability"/>
     <w:p>
       <w:pPr>
         <w:pStyle w:val="Heading2"/>
@@ -5322,7 +5266,7 @@
       <w:r>
         <w:t xml:space="preserve"> </w:t>
       </w:r>
-      <w:hyperlink r:id="rId71">
+      <w:hyperlink r:id="rId69">
         <w:r>
           <w:rPr>
             <w:rStyle w:val="Hyperlink"/>
@@ -5341,8 +5285,8 @@
         </w:pict>
       </w:r>
     </w:p>
-    <w:bookmarkEnd w:id="72"/>
-    <w:bookmarkStart w:id="108" w:name="references"/>
+    <w:bookmarkEnd w:id="70"/>
+    <w:bookmarkStart w:id="106" w:name="references"/>
     <w:p>
       <w:pPr>
         <w:pStyle w:val="Heading2"/>
@@ -5387,7 +5331,7 @@
       <w:r>
         <w:t xml:space="preserve"> </w:t>
       </w:r>
-      <w:hyperlink r:id="rId73">
+      <w:hyperlink r:id="rId71">
         <w:r>
           <w:rPr>
             <w:rStyle w:val="Hyperlink"/>
@@ -5449,7 +5393,7 @@
       <w:r>
         <w:t xml:space="preserve"> </w:t>
       </w:r>
-      <w:hyperlink r:id="rId74">
+      <w:hyperlink r:id="rId72">
         <w:r>
           <w:rPr>
             <w:rStyle w:val="Hyperlink"/>
@@ -5492,7 +5436,7 @@
       <w:r>
         <w:t xml:space="preserve"> </w:t>
       </w:r>
-      <w:hyperlink r:id="rId75">
+      <w:hyperlink r:id="rId73">
         <w:r>
           <w:rPr>
             <w:rStyle w:val="Hyperlink"/>
@@ -5535,7 +5479,7 @@
       <w:r>
         <w:t xml:space="preserve"> </w:t>
       </w:r>
-      <w:hyperlink r:id="rId76">
+      <w:hyperlink r:id="rId74">
         <w:r>
           <w:rPr>
             <w:rStyle w:val="Hyperlink"/>
@@ -5578,7 +5522,7 @@
       <w:r>
         <w:t xml:space="preserve"> </w:t>
       </w:r>
-      <w:hyperlink r:id="rId77">
+      <w:hyperlink r:id="rId75">
         <w:r>
           <w:rPr>
             <w:rStyle w:val="Hyperlink"/>
@@ -5621,7 +5565,7 @@
       <w:r>
         <w:t xml:space="preserve"> </w:t>
       </w:r>
-      <w:hyperlink r:id="rId78">
+      <w:hyperlink r:id="rId76">
         <w:r>
           <w:rPr>
             <w:rStyle w:val="Hyperlink"/>
@@ -5664,7 +5608,7 @@
       <w:r>
         <w:t xml:space="preserve"> </w:t>
       </w:r>
-      <w:hyperlink r:id="rId79">
+      <w:hyperlink r:id="rId77">
         <w:r>
           <w:rPr>
             <w:rStyle w:val="Hyperlink"/>
@@ -5729,7 +5673,7 @@
       <w:r>
         <w:t xml:space="preserve"> </w:t>
       </w:r>
-      <w:hyperlink r:id="rId80">
+      <w:hyperlink r:id="rId78">
         <w:r>
           <w:rPr>
             <w:rStyle w:val="Hyperlink"/>
@@ -5772,7 +5716,7 @@
       <w:r>
         <w:t xml:space="preserve"> </w:t>
       </w:r>
-      <w:hyperlink r:id="rId81">
+      <w:hyperlink r:id="rId79">
         <w:r>
           <w:rPr>
             <w:rStyle w:val="Hyperlink"/>
@@ -5815,7 +5759,7 @@
       <w:r>
         <w:t xml:space="preserve"> </w:t>
       </w:r>
-      <w:hyperlink r:id="rId82">
+      <w:hyperlink r:id="rId80">
         <w:r>
           <w:rPr>
             <w:rStyle w:val="Hyperlink"/>
@@ -5858,7 +5802,7 @@
       <w:r>
         <w:t xml:space="preserve"> </w:t>
       </w:r>
-      <w:hyperlink r:id="rId83">
+      <w:hyperlink r:id="rId81">
         <w:r>
           <w:rPr>
             <w:rStyle w:val="Hyperlink"/>
@@ -5901,7 +5845,7 @@
       <w:r>
         <w:t xml:space="preserve"> </w:t>
       </w:r>
-      <w:hyperlink r:id="rId84">
+      <w:hyperlink r:id="rId82">
         <w:r>
           <w:rPr>
             <w:rStyle w:val="Hyperlink"/>
@@ -5944,7 +5888,7 @@
       <w:r>
         <w:t xml:space="preserve"> </w:t>
       </w:r>
-      <w:hyperlink r:id="rId85">
+      <w:hyperlink r:id="rId83">
         <w:r>
           <w:rPr>
             <w:rStyle w:val="Hyperlink"/>
@@ -5987,7 +5931,7 @@
       <w:r>
         <w:t xml:space="preserve"> </w:t>
       </w:r>
-      <w:hyperlink r:id="rId86">
+      <w:hyperlink r:id="rId84">
         <w:r>
           <w:rPr>
             <w:rStyle w:val="Hyperlink"/>
@@ -6030,7 +5974,7 @@
       <w:r>
         <w:t xml:space="preserve"> </w:t>
       </w:r>
-      <w:hyperlink r:id="rId87">
+      <w:hyperlink r:id="rId85">
         <w:r>
           <w:rPr>
             <w:rStyle w:val="Hyperlink"/>
@@ -6073,7 +6017,7 @@
       <w:r>
         <w:t xml:space="preserve"> </w:t>
       </w:r>
-      <w:hyperlink r:id="rId88">
+      <w:hyperlink r:id="rId86">
         <w:r>
           <w:rPr>
             <w:rStyle w:val="Hyperlink"/>
@@ -6116,7 +6060,7 @@
       <w:r>
         <w:t xml:space="preserve"> </w:t>
       </w:r>
-      <w:hyperlink r:id="rId89">
+      <w:hyperlink r:id="rId87">
         <w:r>
           <w:rPr>
             <w:rStyle w:val="Hyperlink"/>
@@ -6159,7 +6103,7 @@
       <w:r>
         <w:t xml:space="preserve"> </w:t>
       </w:r>
-      <w:hyperlink r:id="rId90">
+      <w:hyperlink r:id="rId88">
         <w:r>
           <w:rPr>
             <w:rStyle w:val="Hyperlink"/>
@@ -6202,7 +6146,7 @@
       <w:r>
         <w:t xml:space="preserve"> </w:t>
       </w:r>
-      <w:hyperlink r:id="rId91">
+      <w:hyperlink r:id="rId89">
         <w:r>
           <w:rPr>
             <w:rStyle w:val="Hyperlink"/>
@@ -6245,7 +6189,7 @@
       <w:r>
         <w:t xml:space="preserve"> </w:t>
       </w:r>
-      <w:hyperlink r:id="rId92">
+      <w:hyperlink r:id="rId90">
         <w:r>
           <w:rPr>
             <w:rStyle w:val="Hyperlink"/>
@@ -6288,7 +6232,7 @@
       <w:r>
         <w:t xml:space="preserve"> </w:t>
       </w:r>
-      <w:hyperlink r:id="rId93">
+      <w:hyperlink r:id="rId91">
         <w:r>
           <w:rPr>
             <w:rStyle w:val="Hyperlink"/>
@@ -6331,7 +6275,7 @@
       <w:r>
         <w:t xml:space="preserve"> </w:t>
       </w:r>
-      <w:hyperlink r:id="rId94">
+      <w:hyperlink r:id="rId92">
         <w:r>
           <w:rPr>
             <w:rStyle w:val="Hyperlink"/>
@@ -6374,7 +6318,7 @@
       <w:r>
         <w:t xml:space="preserve"> </w:t>
       </w:r>
-      <w:hyperlink r:id="rId95">
+      <w:hyperlink r:id="rId93">
         <w:r>
           <w:rPr>
             <w:rStyle w:val="Hyperlink"/>
@@ -6417,7 +6361,7 @@
       <w:r>
         <w:t xml:space="preserve"> </w:t>
       </w:r>
-      <w:hyperlink r:id="rId96">
+      <w:hyperlink r:id="rId94">
         <w:r>
           <w:rPr>
             <w:rStyle w:val="Hyperlink"/>
@@ -6460,7 +6404,7 @@
       <w:r>
         <w:t xml:space="preserve"> </w:t>
       </w:r>
-      <w:hyperlink r:id="rId97">
+      <w:hyperlink r:id="rId95">
         <w:r>
           <w:rPr>
             <w:rStyle w:val="Hyperlink"/>
@@ -6503,7 +6447,7 @@
       <w:r>
         <w:t xml:space="preserve"> </w:t>
       </w:r>
-      <w:hyperlink r:id="rId98">
+      <w:hyperlink r:id="rId96">
         <w:r>
           <w:rPr>
             <w:rStyle w:val="Hyperlink"/>
@@ -6546,7 +6490,7 @@
       <w:r>
         <w:t xml:space="preserve"> </w:t>
       </w:r>
-      <w:hyperlink r:id="rId99">
+      <w:hyperlink r:id="rId97">
         <w:r>
           <w:rPr>
             <w:rStyle w:val="Hyperlink"/>
@@ -6589,7 +6533,7 @@
       <w:r>
         <w:t xml:space="preserve"> </w:t>
       </w:r>
-      <w:hyperlink r:id="rId100">
+      <w:hyperlink r:id="rId98">
         <w:r>
           <w:rPr>
             <w:rStyle w:val="Hyperlink"/>
@@ -6632,7 +6576,7 @@
       <w:r>
         <w:t xml:space="preserve"> </w:t>
       </w:r>
-      <w:hyperlink r:id="rId101">
+      <w:hyperlink r:id="rId99">
         <w:r>
           <w:rPr>
             <w:rStyle w:val="Hyperlink"/>
@@ -6675,7 +6619,7 @@
       <w:r>
         <w:t xml:space="preserve"> </w:t>
       </w:r>
-      <w:hyperlink r:id="rId102">
+      <w:hyperlink r:id="rId100">
         <w:r>
           <w:rPr>
             <w:rStyle w:val="Hyperlink"/>
@@ -6729,7 +6673,7 @@
       <w:r>
         <w:t xml:space="preserve"> </w:t>
       </w:r>
-      <w:hyperlink r:id="rId103">
+      <w:hyperlink r:id="rId101">
         <w:r>
           <w:rPr>
             <w:rStyle w:val="Hyperlink"/>
@@ -6761,7 +6705,7 @@
       <w:r>
         <w:t xml:space="preserve"> </w:t>
       </w:r>
-      <w:hyperlink r:id="rId104">
+      <w:hyperlink r:id="rId102">
         <w:r>
           <w:rPr>
             <w:rStyle w:val="Hyperlink"/>
@@ -6796,7 +6740,7 @@
       <w:r>
         <w:t xml:space="preserve"> </w:t>
       </w:r>
-      <w:hyperlink r:id="rId105">
+      <w:hyperlink r:id="rId103">
         <w:r>
           <w:rPr>
             <w:rStyle w:val="Hyperlink"/>
@@ -6828,7 +6772,7 @@
       <w:r>
         <w:t xml:space="preserve"> </w:t>
       </w:r>
-      <w:hyperlink r:id="rId106">
+      <w:hyperlink r:id="rId104">
         <w:r>
           <w:rPr>
             <w:rStyle w:val="Hyperlink"/>
@@ -6860,7 +6804,7 @@
       <w:r>
         <w:t xml:space="preserve"> </w:t>
       </w:r>
-      <w:hyperlink r:id="rId107">
+      <w:hyperlink r:id="rId105">
         <w:r>
           <w:rPr>
             <w:rStyle w:val="Hyperlink"/>
@@ -6890,7 +6834,7 @@
       <w:r>
         <w:t xml:space="preserve"> </w:t>
       </w:r>
-      <w:hyperlink r:id="rId71">
+      <w:hyperlink r:id="rId69">
         <w:r>
           <w:rPr>
             <w:rStyle w:val="Hyperlink"/>
@@ -6899,8 +6843,8 @@
         </w:r>
       </w:hyperlink>
     </w:p>
-    <w:bookmarkEnd w:id="108"/>
-    <w:bookmarkEnd w:id="109"/>
+    <w:bookmarkEnd w:id="106"/>
+    <w:bookmarkEnd w:id="107"/>
     <w:sectPr>
       <w:pgSz w:h="16838" w:w="11906"/>
       <w:pgMar w:bottom="1417" w:left="1417" w:right="1417" w:top="1417"/>

</xml_diff>

<commit_message>
fix(p4-mir): reconcile all reported numbers to raw .dta replication
Replicate the raw-number reconciliation to the MIR (Springer, fullest)
package. Table 2, Table 4 marginal effects, Table 3 robustness (R1-R5),
M2 turning point (85.7%), bootstrap CI, Cohen f2, exporters-only R5,
item-swap and Lind-Mehlum, and all inline prose match the canonical raw
output from p4_singapore_full_raw.py. Heckman IMR clause rewritten to
the reproducible result; winsorization claim removed; orphan World Bank
cites resolved to 2024. The 30-60% Marano prior-literature range is
preserved. Figures 2-3 regenerated from raw; docx rebuilt. Narrative
unchanged. Completes P4 across all three target journals.

Co-Authored-By: Claude Opus 4.8 (1M context) <noreply@anthropic.com>
Claude-Session: https://claude.ai/code/session_01Xumaoraa2DLWLXsgJJ62oq
</commit_message>
<xml_diff>
--- a/p4/submission/mir_package/01_manuscript_blinded.docx
+++ b/p4/submission/mir_package/01_manuscript_blinded.docx
@@ -263,7 +263,7 @@
       </w:r>
     </w:p>
     <w:bookmarkEnd w:id="20"/>
-    <w:bookmarkStart w:id="25" w:name="Xe3d0fc0bea9a42ce7605565d0964033d7f6ee47"/>
+    <w:bookmarkStart w:id="25" w:name="introduction"/>
     <w:p>
       <w:pPr>
         <w:pStyle w:val="Heading2"/>
@@ -272,7 +272,7 @@
         <w:t xml:space="preserve">1 Introduction</w:t>
       </w:r>
     </w:p>
-    <w:bookmarkStart w:id="21" w:name="Xe5b26b80b1cffd635bf6d81ca2944b40daaf62d"/>
+    <w:bookmarkStart w:id="21" w:name="background-and-motivation"/>
     <w:p>
       <w:pPr>
         <w:pStyle w:val="Heading3"/>
@@ -328,7 +328,7 @@
         <w:t xml:space="preserve"> </w:t>
       </w:r>
       <w:r>
-        <w:t xml:space="preserve">literature (Marano et al. 2016). However, much of this literature was</w:t>
+        <w:t xml:space="preserve">literature (Marano et al. 2016). However, much of this literature was</w:t>
       </w:r>
       <w:r>
         <w:t xml:space="preserve"> </w:t>
@@ -346,7 +346,7 @@
         <w:t xml:space="preserve"> </w:t>
       </w:r>
       <w:r>
-        <w:t xml:space="preserve">those of digitally advanced economies (Peng 2003; Peng et al. 2008) and</w:t>
+        <w:t xml:space="preserve">those of digitally advanced economies (Peng 2003; Peng et al. 2008) and</w:t>
       </w:r>
       <w:r>
         <w:t xml:space="preserve"> </w:t>
@@ -478,7 +478,7 @@
         <w:t xml:space="preserve"> </w:t>
       </w:r>
       <w:r>
-        <w:t xml:space="preserve">(Bharadwaj et al. 2013; Verhoef et al. 2021). This combination creates</w:t>
+        <w:t xml:space="preserve">(Bharadwaj et al. 2013; Verhoef et al. 2021). This combination creates</w:t>
       </w:r>
       <w:r>
         <w:t xml:space="preserve"> </w:t>
@@ -521,7 +521,7 @@
         <w:t xml:space="preserve"> </w:t>
       </w:r>
       <w:r>
-        <w:t xml:space="preserve">near-universal Tier 1–2 diffusion is enabled by Singapore's nationally</w:t>
+        <w:t xml:space="preserve">near-universal Tier 1–2 diffusion is enabled by Singapore’s nationally</w:t>
       </w:r>
       <w:r>
         <w:t xml:space="preserve"> </w:t>
@@ -539,7 +539,7 @@
         <w:t xml:space="preserve"> </w:t>
       </w:r>
       <w:r>
-        <w:t xml:space="preserve">Bank (2025a) identifies as the foundational enabling layer for</w:t>
+        <w:t xml:space="preserve">Bank (2024) identifies as the foundational enabling layer for</w:t>
       </w:r>
       <w:r>
         <w:t xml:space="preserve"> </w:t>
@@ -563,7 +563,7 @@
         <w:t xml:space="preserve"> </w:t>
       </w:r>
       <w:r>
-        <w:t xml:space="preserve">domestic orientation despite the economy's mature digital</w:t>
+        <w:t xml:space="preserve">domestic orientation despite the economy’s mature digital</w:t>
       </w:r>
       <w:r>
         <w:t xml:space="preserve"> </w:t>
@@ -683,7 +683,7 @@
         <w:t xml:space="preserve"> </w:t>
       </w:r>
       <w:r>
-        <w:t xml:space="preserve">surrounding digital ecosystem (Bharadwaj et al. 2013; Verhoef et al.</w:t>
+        <w:t xml:space="preserve">surrounding digital ecosystem (Bharadwaj et al. 2013; Verhoef et al.</w:t>
       </w:r>
       <w:r>
         <w:t xml:space="preserve"> </w:t>
@@ -693,7 +693,7 @@
       </w:r>
     </w:p>
     <w:bookmarkEnd w:id="21"/>
-    <w:bookmarkStart w:id="22" w:name="X2961a496af63dca26d6e29b654ead2e696c6fdd"/>
+    <w:bookmarkStart w:id="22" w:name="research-gap"/>
     <w:p>
       <w:pPr>
         <w:pStyle w:val="Heading3"/>
@@ -909,7 +909,7 @@
       </w:r>
     </w:p>
     <w:bookmarkEnd w:id="22"/>
-    <w:bookmarkStart w:id="23" w:name="X494b14dde48fd709c427dcfac91526fdde5ec7e"/>
+    <w:bookmarkStart w:id="23" w:name="contribution"/>
     <w:p>
       <w:pPr>
         <w:pStyle w:val="Heading3"/>
@@ -989,13 +989,13 @@
         <w:t xml:space="preserve"> </w:t>
       </w:r>
       <w:r>
-        <w:t xml:space="preserve">this mechanism (H3: positive quadratic DAI×FSTS² interaction, β=+3.119,</w:t>
-      </w:r>
-      <w:r>
-        <w:t xml:space="preserve"> </w:t>
-      </w:r>
-      <w:r>
-        <w:t xml:space="preserve">p=.005) is the most distinctive empirical finding and the one least</w:t>
+        <w:t xml:space="preserve">this mechanism (H3: positive quadratic DAI×FSTS² interaction, β=+3.220,</w:t>
+      </w:r>
+      <w:r>
+        <w:t xml:space="preserve"> </w:t>
+      </w:r>
+      <w:r>
+        <w:t xml:space="preserve">p=.020) is the most distinctive empirical finding and the one least</w:t>
       </w:r>
       <w:r>
         <w:t xml:space="preserve"> </w:t>
@@ -1025,7 +1025,7 @@
         <w:t xml:space="preserve"> </w:t>
       </w:r>
       <w:r>
-        <w:t xml:space="preserve">established inverted-U: the implied turning point lies near FSTS=88.6%,</w:t>
+        <w:t xml:space="preserve">established inverted-U: the implied turning point lies near FSTS=85.7%,</w:t>
       </w:r>
       <w:r>
         <w:t xml:space="preserve"> </w:t>
@@ -1161,7 +1161,7 @@
       </w:r>
     </w:p>
     <w:bookmarkEnd w:id="23"/>
-    <w:bookmarkStart w:id="24" w:name="Xdd618d9602139b0eee88c4277e195c55d104c48"/>
+    <w:bookmarkStart w:id="24" w:name="roadmap"/>
     <w:p>
       <w:pPr>
         <w:pStyle w:val="Heading3"/>
@@ -1204,7 +1204,7 @@
     </w:p>
     <w:bookmarkEnd w:id="24"/>
     <w:bookmarkEnd w:id="25"/>
-    <w:bookmarkStart w:id="34" w:name="X8bf20a63f0decf7b16e99d564b9958ec4fbbb23"/>
+    <w:bookmarkStart w:id="34" w:name="theory-and-hypotheses"/>
     <w:p>
       <w:pPr>
         <w:pStyle w:val="Heading2"/>
@@ -1213,7 +1213,7 @@
         <w:t xml:space="preserve">2 Theory and Hypotheses</w:t>
       </w:r>
     </w:p>
-    <w:bookmarkStart w:id="26" w:name="X9497e0c582d29cdf214e76507e8fbbcc0b6d410"/>
+    <w:bookmarkStart w:id="26" w:name="X001c1553335b0468ad48060ef103d7d22aed657"/>
     <w:p>
       <w:pPr>
         <w:pStyle w:val="Heading3"/>
@@ -1239,7 +1239,7 @@
         <w:t xml:space="preserve"> </w:t>
       </w:r>
       <w:r>
-        <w:t xml:space="preserve">performance. Hitt et al. (1997) introduced the inverted-U logic: initial</w:t>
+        <w:t xml:space="preserve">performance. Hitt et al. (1997) introduced the inverted-U logic: initial</w:t>
       </w:r>
       <w:r>
         <w:t xml:space="preserve"> </w:t>
@@ -1257,7 +1257,7 @@
         <w:t xml:space="preserve"> </w:t>
       </w:r>
       <w:r>
-        <w:t xml:space="preserve">that erode the returns to further expansion. Contractor et al. (2003)</w:t>
+        <w:t xml:space="preserve">that erode the returns to further expansion. Contractor et al. (2003)</w:t>
       </w:r>
       <w:r>
         <w:t xml:space="preserve"> </w:t>
@@ -1287,7 +1287,7 @@
         <w:t xml:space="preserve"> </w:t>
       </w:r>
       <w:r>
-        <w:t xml:space="preserve">et al. 2016). An important implication of the nonlinear I–P literature</w:t>
+        <w:t xml:space="preserve">et al. 2016). An important implication of the nonlinear I–P literature</w:t>
       </w:r>
       <w:r>
         <w:t xml:space="preserve"> </w:t>
@@ -1357,7 +1357,7 @@
       </w:r>
     </w:p>
     <w:bookmarkEnd w:id="26"/>
-    <w:bookmarkStart w:id="27" w:name="X58009fa5124754b9d12ae223bf3908d651fea58"/>
+    <w:bookmarkStart w:id="27" w:name="two-distinct-constructs-tci-and-dai"/>
     <w:p>
       <w:pPr>
         <w:pStyle w:val="Heading3"/>
@@ -1395,7 +1395,7 @@
         <w:t xml:space="preserve"> </w:t>
       </w:r>
       <w:r>
-        <w:t xml:space="preserve">participation (Verhoef et al. 2021). This study departs from that</w:t>
+        <w:t xml:space="preserve">participation (Verhoef et al. 2021). This study departs from that</w:t>
       </w:r>
       <w:r>
         <w:t xml:space="preserve"> </w:t>
@@ -1425,7 +1425,7 @@
         <w:t xml:space="preserve"> </w:t>
       </w:r>
       <w:r>
-        <w:t xml:space="preserve">al. 2013; Verhoef et al. 2021). The distinction is theoretically</w:t>
+        <w:t xml:space="preserve">al. 2013; Verhoef et al. 2021). The distinction is theoretically</w:t>
       </w:r>
       <w:r>
         <w:t xml:space="preserve"> </w:t>
@@ -1467,7 +1467,7 @@
         <w:t xml:space="preserve"> </w:t>
       </w:r>
       <w:r>
-        <w:t xml:space="preserve">transaction-enabling mechanisms (Bharadwaj et al. 2013), reflecting a</w:t>
+        <w:t xml:space="preserve">transaction-enabling mechanisms (Bharadwaj et al. 2013), reflecting a</w:t>
       </w:r>
       <w:r>
         <w:t xml:space="preserve"> </w:t>
@@ -1479,19 +1479,49 @@
         <w:t xml:space="preserve"> </w:t>
       </w:r>
       <w:r>
-        <w:t xml:space="preserve">the maturity of the surrounding digital ecosystem (Verhoef et al. 2021).</w:t>
-      </w:r>
-      <w:r>
-        <w:t xml:space="preserve"> </w:t>
-      </w:r>
-      <w:r>
-        <w:t xml:space="preserve">Equally important, the label "digital adoption" is more defensible than</w:t>
-      </w:r>
-      <w:r>
-        <w:t xml:space="preserve"> </w:t>
-      </w:r>
-      <w:r>
-        <w:t xml:space="preserve">"digital capability" in the present empirical setting because the WBES</w:t>
+        <w:t xml:space="preserve">the maturity of the surrounding digital ecosystem (Verhoef et al. 2021).</w:t>
+      </w:r>
+      <w:r>
+        <w:t xml:space="preserve"> </w:t>
+      </w:r>
+      <w:r>
+        <w:t xml:space="preserve">Equally important, the label</w:t>
+      </w:r>
+      <w:r>
+        <w:t xml:space="preserve"> </w:t>
+      </w:r>
+      <w:r>
+        <w:t xml:space="preserve">“</w:t>
+      </w:r>
+      <w:r>
+        <w:t xml:space="preserve">digital adoption</w:t>
+      </w:r>
+      <w:r>
+        <w:t xml:space="preserve">”</w:t>
+      </w:r>
+      <w:r>
+        <w:t xml:space="preserve"> </w:t>
+      </w:r>
+      <w:r>
+        <w:t xml:space="preserve">is more defensible than</w:t>
+      </w:r>
+      <w:r>
+        <w:t xml:space="preserve"> </w:t>
+      </w:r>
+      <w:r>
+        <w:t xml:space="preserve">“</w:t>
+      </w:r>
+      <w:r>
+        <w:t xml:space="preserve">digital capability</w:t>
+      </w:r>
+      <w:r>
+        <w:t xml:space="preserve">”</w:t>
+      </w:r>
+      <w:r>
+        <w:t xml:space="preserve"> </w:t>
+      </w:r>
+      <w:r>
+        <w:t xml:space="preserve">in the present empirical setting because the WBES</w:t>
       </w:r>
       <w:r>
         <w:t xml:space="preserve"> </w:t>
@@ -1509,7 +1539,7 @@
         <w:t xml:space="preserve"> </w:t>
       </w:r>
       <w:r>
-        <w:t xml:space="preserve">organizational processes. In the Verhoef et al. (2021) hierarchy,</w:t>
+        <w:t xml:space="preserve">organizational processes. In the Verhoef et al. (2021) hierarchy,</w:t>
       </w:r>
       <w:r>
         <w:t xml:space="preserve"> </w:t>
@@ -1563,7 +1593,25 @@
         <w:t xml:space="preserve"> </w:t>
       </w:r>
       <w:r>
-        <w:t xml:space="preserve">this measurement boundary, retaining a broad "digital capability" label</w:t>
+        <w:t xml:space="preserve">this measurement boundary, retaining a broad</w:t>
+      </w:r>
+      <w:r>
+        <w:t xml:space="preserve"> </w:t>
+      </w:r>
+      <w:r>
+        <w:t xml:space="preserve">“</w:t>
+      </w:r>
+      <w:r>
+        <w:t xml:space="preserve">digital capability</w:t>
+      </w:r>
+      <w:r>
+        <w:t xml:space="preserve">”</w:t>
+      </w:r>
+      <w:r>
+        <w:t xml:space="preserve"> </w:t>
+      </w:r>
+      <w:r>
+        <w:t xml:space="preserve">label</w:t>
       </w:r>
       <w:r>
         <w:t xml:space="preserve"> </w:t>
@@ -1587,7 +1635,7 @@
         <w:t xml:space="preserve"> </w:t>
       </w:r>
       <w:r>
-        <w:t xml:space="preserve">Methodologically, the two constructs satisfy the Coltman et al. (2008)</w:t>
+        <w:t xml:space="preserve">Methodologically, the two constructs satisfy the Coltman et al. (2008)</w:t>
       </w:r>
       <w:r>
         <w:t xml:space="preserve"> </w:t>
@@ -1615,7 +1663,7 @@
       </w:r>
     </w:p>
     <w:bookmarkEnd w:id="27"/>
-    <w:bookmarkStart w:id="32" w:name="Xfeb3205642325e47f2817bab2cc060c9f999b02"/>
+    <w:bookmarkStart w:id="32" w:name="hypothesis-development"/>
     <w:p>
       <w:pPr>
         <w:pStyle w:val="Heading3"/>
@@ -1624,7 +1672,7 @@
         <w:t xml:space="preserve">2.3 Hypothesis development</w:t>
       </w:r>
     </w:p>
-    <w:bookmarkStart w:id="28" w:name="X9de0e934912487c2b2355f424516474f67bf4ef"/>
+    <w:bookmarkStart w:id="28" w:name="tci-direct-effect-on-productivity"/>
     <w:p>
       <w:pPr>
         <w:pStyle w:val="Heading4"/>
@@ -1680,19 +1728,19 @@
         <w:t xml:space="preserve"> </w:t>
       </w:r>
       <w:r>
-        <w:t xml:space="preserve">efficiency, product quality, and learning routines (Avenyo et al. 2021;</w:t>
-      </w:r>
-      <w:r>
-        <w:t xml:space="preserve"> </w:t>
-      </w:r>
-      <w:r>
-        <w:t xml:space="preserve">Krammer et al. 2018). We therefore hypothesize: Hypothesis 1 (H1). In</w:t>
-      </w:r>
-      <w:r>
-        <w:t xml:space="preserve"> </w:t>
-      </w:r>
-      <w:r>
-        <w:t xml:space="preserve">Singapore's advanced-economy context, when firms invest more deeply in</w:t>
+        <w:t xml:space="preserve">efficiency, product quality, and learning routines (Avenyo et al. 2021;</w:t>
+      </w:r>
+      <w:r>
+        <w:t xml:space="preserve"> </w:t>
+      </w:r>
+      <w:r>
+        <w:t xml:space="preserve">Krammer et al. 2018). We therefore hypothesize: Hypothesis 1 (H1). In</w:t>
+      </w:r>
+      <w:r>
+        <w:t xml:space="preserve"> </w:t>
+      </w:r>
+      <w:r>
+        <w:t xml:space="preserve">Singapore’s advanced-economy context, when firms invest more deeply in</w:t>
       </w:r>
       <w:r>
         <w:t xml:space="preserve"> </w:t>
@@ -1710,7 +1758,7 @@
         <w:t xml:space="preserve"> </w:t>
       </w:r>
       <w:r>
-        <w:t xml:space="preserve">firm's operational efficiency and learning routines (Lall 1992; Cohen &amp;</w:t>
+        <w:t xml:space="preserve">firm’s operational efficiency and learning routines (Lall 1992; Cohen &amp;</w:t>
       </w:r>
       <w:r>
         <w:t xml:space="preserve"> </w:t>
@@ -1726,7 +1774,7 @@
       </w:r>
     </w:p>
     <w:bookmarkEnd w:id="28"/>
-    <w:bookmarkStart w:id="29" w:name="Xd77aef7f084e33ec0dd33a50710ed9d88a5bd5f"/>
+    <w:bookmarkStart w:id="29" w:name="tci-moderation-of-the-ip-relationship"/>
     <w:p>
       <w:pPr>
         <w:pStyle w:val="Heading4"/>
@@ -1842,7 +1890,7 @@
         <w:t xml:space="preserve"> </w:t>
       </w:r>
       <w:r>
-        <w:t xml:space="preserve">TCI-contingent I–P curvature. The present paper's H2 and H3 are</w:t>
+        <w:t xml:space="preserve">TCI-contingent I–P curvature. The present paper’s H2 and H3 are</w:t>
       </w:r>
       <w:r>
         <w:t xml:space="preserve"> </w:t>
@@ -1864,7 +1912,7 @@
       </w:r>
     </w:p>
     <w:bookmarkEnd w:id="29"/>
-    <w:bookmarkStart w:id="30" w:name="Xca797cdf899e8025c95598929e8214dfe008510"/>
+    <w:bookmarkStart w:id="30" w:name="dai-direct-effect-on-productivity"/>
     <w:p>
       <w:pPr>
         <w:pStyle w:val="Heading4"/>
@@ -1962,13 +2010,13 @@
         <w:t xml:space="preserve"> </w:t>
       </w:r>
       <w:r>
-        <w:t xml:space="preserve">those digital channels are actually used (Bharadwaj et al. 2013; Verhoef</w:t>
-      </w:r>
-      <w:r>
-        <w:t xml:space="preserve"> </w:t>
-      </w:r>
-      <w:r>
-        <w:t xml:space="preserve">et al. 2021), until a level of export intensity is reached at which</w:t>
+        <w:t xml:space="preserve">those digital channels are actually used (Bharadwaj et al. 2013; Verhoef</w:t>
+      </w:r>
+      <w:r>
+        <w:t xml:space="preserve"> </w:t>
+      </w:r>
+      <w:r>
+        <w:t xml:space="preserve">et al. 2021), until a level of export intensity is reached at which</w:t>
       </w:r>
       <w:r>
         <w:t xml:space="preserve"> </w:t>
@@ -1978,7 +2026,7 @@
       </w:r>
     </w:p>
     <w:bookmarkEnd w:id="30"/>
-    <w:bookmarkStart w:id="31" w:name="Xb90d981e4efafb918608a9cc7d37012dec59e7b"/>
+    <w:bookmarkStart w:id="31" w:name="X4a1dd7965a5d35ccd8d325197ae2dd2e833f047"/>
     <w:p>
       <w:pPr>
         <w:pStyle w:val="Heading4"/>
@@ -2250,7 +2298,7 @@
         <w:t xml:space="preserve"> </w:t>
       </w:r>
       <w:r>
-        <w:t xml:space="preserve">implies that DAI's productivity contribution grows super-linearly with</w:t>
+        <w:t xml:space="preserve">implies that DAI’s productivity contribution grows super-linearly with</w:t>
       </w:r>
       <w:r>
         <w:t xml:space="preserve"> </w:t>
@@ -2476,7 +2524,7 @@
     </w:p>
     <w:bookmarkEnd w:id="31"/>
     <w:bookmarkEnd w:id="32"/>
-    <w:bookmarkStart w:id="33" w:name="X120be97a373b91b5bab21d44e9895db7ca01e76"/>
+    <w:bookmarkStart w:id="33" w:name="conceptual-model"/>
     <w:p>
       <w:pPr>
         <w:pStyle w:val="Heading3"/>
@@ -2678,7 +2726,7 @@
         <w:t xml:space="preserve"> </w:t>
       </w:r>
       <w:r>
-        <w:t xml:space="preserve">~88.6% FSTS, bootstrap CI [53%, 253%]) is grounded in</w:t>
+        <w:t xml:space="preserve">~85.7% FSTS, bootstrap CI [58%, 398%]) is grounded in</w:t>
       </w:r>
       <w:r>
         <w:t xml:space="preserve"> </w:t>
@@ -2702,7 +2750,7 @@
         <w:t xml:space="preserve"> </w:t>
       </w:r>
       <w:r>
-        <w:t xml:space="preserve">.303). H1-TCI: technological capability (TCI_z, RBV: Barney, 1991)</w:t>
+        <w:t xml:space="preserve">.346). H1-TCI: technological capability (TCI_z, RBV: Barney, 1991)</w:t>
       </w:r>
       <w:r>
         <w:t xml:space="preserve"> </w:t>
@@ -2779,7 +2827,7 @@
     </w:p>
     <w:bookmarkEnd w:id="33"/>
     <w:bookmarkEnd w:id="34"/>
-    <w:bookmarkStart w:id="43" w:name="X167a2da0345881bf36eef0606d50b1063a572d3"/>
+    <w:bookmarkStart w:id="43" w:name="methods"/>
     <w:p>
       <w:pPr>
         <w:pStyle w:val="Heading2"/>
@@ -2788,7 +2836,7 @@
         <w:t xml:space="preserve">3 Methods</w:t>
       </w:r>
     </w:p>
-    <w:bookmarkStart w:id="35" w:name="X7539fb3dc2f98232f41138bc75cab658563f4ee"/>
+    <w:bookmarkStart w:id="35" w:name="data"/>
     <w:p>
       <w:pPr>
         <w:pStyle w:val="Heading3"/>
@@ -2886,7 +2934,7 @@
         <w:t xml:space="preserve"> </w:t>
       </w:r>
       <w:r>
-        <w:t xml:space="preserve">for the majority of Singapore's aggregate trade flows (national</w:t>
+        <w:t xml:space="preserve">for the majority of Singapore’s aggregate trade flows (national</w:t>
       </w:r>
       <w:r>
         <w:t xml:space="preserve"> </w:t>
@@ -2898,7 +2946,7 @@
         <w:t xml:space="preserve"> </w:t>
       </w:r>
       <w:r>
-        <w:t xml:space="preserve">Singapore's SME sector rather than of the national export economy;</w:t>
+        <w:t xml:space="preserve">Singapore’s SME sector rather than of the national export economy;</w:t>
       </w:r>
       <w:r>
         <w:t xml:space="preserve"> </w:t>
@@ -3060,7 +3108,7 @@
         <w:t xml:space="preserve"> </w:t>
       </w:r>
       <w:r>
-        <w:t xml:space="preserve">test result (p = .303) reported in Section 4.2 should therefore be interpreted</w:t>
+        <w:t xml:space="preserve">test result (p = .346) reported in Section 4.2 should therefore be interpreted</w:t>
       </w:r>
       <w:r>
         <w:t xml:space="preserve"> </w:t>
@@ -3094,7 +3142,7 @@
       </w:r>
     </w:p>
     <w:bookmarkEnd w:id="35"/>
-    <w:bookmarkStart w:id="40" w:name="Xbcf9f12e79107fa2c089aaf13fc6c4fb773f1c2"/>
+    <w:bookmarkStart w:id="40" w:name="variables"/>
     <w:p>
       <w:pPr>
         <w:pStyle w:val="Heading3"/>
@@ -3103,7 +3151,7 @@
         <w:t xml:space="preserve">3.2 Variables</w:t>
       </w:r>
     </w:p>
-    <w:bookmarkStart w:id="36" w:name="X7e58563e31c3ad002492190dd8d5308423faaad"/>
+    <w:bookmarkStart w:id="36" w:name="dependent-variable"/>
     <w:p>
       <w:pPr>
         <w:pStyle w:val="Heading4"/>
@@ -3159,17 +3207,11 @@
         <w:t xml:space="preserve"> </w:t>
       </w:r>
       <w:r>
-        <w:t xml:space="preserve">effect absorbed by the intercept. To reduce sensitivity to outliers, the</w:t>
-      </w:r>
-      <w:r>
-        <w:t xml:space="preserve"> </w:t>
-      </w:r>
-      <w:r>
-        <w:t xml:space="preserve">dependent variable is winsorized at the 1st and 99th percentiles.</w:t>
+        <w:t xml:space="preserve">effect absorbed by the intercept.</w:t>
       </w:r>
     </w:p>
     <w:bookmarkEnd w:id="36"/>
-    <w:bookmarkStart w:id="37" w:name="X2cdc78afcfd9a4441a0b7b899a2b559f49a455a"/>
+    <w:bookmarkStart w:id="37" w:name="focal-independent-variable"/>
     <w:p>
       <w:pPr>
         <w:pStyle w:val="Heading4"/>
@@ -3223,7 +3265,7 @@
       </w:r>
     </w:p>
     <w:bookmarkEnd w:id="37"/>
-    <w:bookmarkStart w:id="38" w:name="X5885cfa65cddf1d15b27f59176f9dbae5a8c10a"/>
+    <w:bookmarkStart w:id="38" w:name="tci-and-dai-composites"/>
     <w:p>
       <w:pPr>
         <w:pStyle w:val="Heading4"/>
@@ -3339,7 +3381,25 @@
         <w:t xml:space="preserve"> </w:t>
       </w:r>
       <w:r>
-        <w:t xml:space="preserve">standard-deviation units.</w:t>
+        <w:t xml:space="preserve">standard-deviation units. Empirically, the two standardized indices are</w:t>
+      </w:r>
+      <w:r>
+        <w:t xml:space="preserve"> </w:t>
+      </w:r>
+      <w:r>
+        <w:t xml:space="preserve">distinct in the Singapore sample (composite correlation r = 0.13; under</w:t>
+      </w:r>
+      <w:r>
+        <w:t xml:space="preserve"> </w:t>
+      </w:r>
+      <w:r>
+        <w:t xml:space="preserve">2 % shared variance), consistent with treating them as separate</w:t>
+      </w:r>
+      <w:r>
+        <w:t xml:space="preserve"> </w:t>
+      </w:r>
+      <w:r>
+        <w:t xml:space="preserve">firm-level domains rather than one redundant construct.</w:t>
       </w:r>
     </w:p>
     <w:p>
@@ -3408,13 +3468,13 @@
         <w:t xml:space="preserve"> </w:t>
       </w:r>
       <w:r>
-        <w:t xml:space="preserve">+3.119 (p = .005) in the Tier-1+2 specification to a smaller and</w:t>
-      </w:r>
-      <w:r>
-        <w:t xml:space="preserve"> </w:t>
-      </w:r>
-      <w:r>
-        <w:t xml:space="preserve">statistically weaker estimate, while the Tier-1+2 full model's adjusted</w:t>
+        <w:t xml:space="preserve">+3.220 (p = .020) in the Tier-1+2 specification to a smaller and</w:t>
+      </w:r>
+      <w:r>
+        <w:t xml:space="preserve"> </w:t>
+      </w:r>
+      <w:r>
+        <w:t xml:space="preserve">statistically weaker estimate, while the Tier-1+2 full model’s adjusted</w:t>
       </w:r>
       <w:r>
         <w:t xml:space="preserve"> </w:t>
@@ -3456,7 +3516,7 @@
         <w:t xml:space="preserve"> </w:t>
       </w:r>
       <w:r>
-        <w:t xml:space="preserve">Singapore's high-saturation institutional setting, the website indicator</w:t>
+        <w:t xml:space="preserve">Singapore’s high-saturation institutional setting, the website indicator</w:t>
       </w:r>
       <w:r>
         <w:t xml:space="preserve"> </w:t>
@@ -3505,7 +3565,7 @@
       </w:r>
     </w:p>
     <w:bookmarkEnd w:id="38"/>
-    <w:bookmarkStart w:id="39" w:name="X7f318314f3a5164dbb5d2e2bfe8bd11c34b488e"/>
+    <w:bookmarkStart w:id="39" w:name="controls"/>
     <w:p>
       <w:pPr>
         <w:pStyle w:val="Heading4"/>
@@ -3584,7 +3644,7 @@
     </w:p>
     <w:bookmarkEnd w:id="39"/>
     <w:bookmarkEnd w:id="40"/>
-    <w:bookmarkStart w:id="41" w:name="X84482d10811f20e2a246857c008316fafc15eb6"/>
+    <w:bookmarkStart w:id="41" w:name="Xf0d337b7871f1e30984357ede4c26fad3ab0772"/>
     <w:p>
       <w:pPr>
         <w:pStyle w:val="Heading3"/>
@@ -3766,7 +3826,7 @@
         <w:t xml:space="preserve"> </w:t>
       </w:r>
       <w:r>
-        <w:t xml:space="preserve">productivity. Following the recommendations of Haans et al. (2016) for</w:t>
+        <w:t xml:space="preserve">productivity. Following the recommendations of Haans et al. (2016) for</w:t>
       </w:r>
       <w:r>
         <w:t xml:space="preserve"> </w:t>
@@ -3802,7 +3862,7 @@
         <w:t xml:space="preserve"> </w:t>
       </w:r>
       <w:r>
-        <w:t xml:space="preserve">using Cohen’s f² (Aguinis et al. 2005; Cohen 1988).</w:t>
+        <w:t xml:space="preserve">using Cohen’s f² (Aguinis et al. 2005; Cohen 1988).</w:t>
       </w:r>
     </w:p>
     <w:p>
@@ -3918,7 +3978,7 @@
       </w:r>
     </w:p>
     <w:bookmarkEnd w:id="41"/>
-    <w:bookmarkStart w:id="42" w:name="X4758c326240d97a48e7d79456dba8f6cc5c46be"/>
+    <w:bookmarkStart w:id="42" w:name="X0fcf099929e626b10071b523c2c83735d5a4cd9"/>
     <w:p>
       <w:pPr>
         <w:pStyle w:val="Heading3"/>
@@ -3986,7 +4046,7 @@
         <w:t xml:space="preserve"> </w:t>
       </w:r>
       <w:r>
-        <w:t xml:space="preserve">Singapore's SME sector under the WBES sampling frame. Within this frame,</w:t>
+        <w:t xml:space="preserve">Singapore’s SME sector under the WBES sampling frame. Within this frame,</w:t>
       </w:r>
       <w:r>
         <w:t xml:space="preserve"> </w:t>
@@ -4022,7 +4082,7 @@
         <w:t xml:space="preserve"> </w:t>
       </w:r>
       <w:r>
-        <w:t xml:space="preserve">intensity. The fitted turning point near FSTS ≈ 88.6 % falls in a</w:t>
+        <w:t xml:space="preserve">intensity. The fitted turning point near FSTS ≈ 85.7 % falls in a</w:t>
       </w:r>
       <w:r>
         <w:t xml:space="preserve"> </w:t>
@@ -4034,19 +4094,19 @@
         <w:t xml:space="preserve"> </w:t>
       </w:r>
       <w:r>
-        <w:t xml:space="preserve">interval is wide ([53 %, 253 %]) even though an inverted-U shape is</w:t>
-      </w:r>
-      <w:r>
-        <w:t xml:space="preserve"> </w:t>
-      </w:r>
-      <w:r>
-        <w:t xml:space="preserve">recovered in 96.3 % of resamples. The wide confidence interval [53%,</w:t>
-      </w:r>
-      <w:r>
-        <w:t xml:space="preserve"> </w:t>
-      </w:r>
-      <w:r>
-        <w:t xml:space="preserve">253%] reflects sparse upper-tail support (only 3% of firms exceed 50%</w:t>
+        <w:t xml:space="preserve">interval is wide ([58 %, 398 %]) even though an inverted-U shape is</w:t>
+      </w:r>
+      <w:r>
+        <w:t xml:space="preserve"> </w:t>
+      </w:r>
+      <w:r>
+        <w:t xml:space="preserve">recovered in 94.9 % of resamples. The wide confidence interval [58%,</w:t>
+      </w:r>
+      <w:r>
+        <w:t xml:space="preserve"> </w:t>
+      </w:r>
+      <w:r>
+        <w:t xml:space="preserve">398%] reflects sparse upper-tail support (only 3% of firms exceed 50%</w:t>
       </w:r>
       <w:r>
         <w:t xml:space="preserve"> </w:t>
@@ -4200,7 +4260,7 @@
         <w:t xml:space="preserve"> </w:t>
       </w:r>
       <w:r>
-        <w:t xml:space="preserve">(1988) and Aguinis et al. (2005). Null DAI moderation results in the exporters-only specification</w:t>
+        <w:t xml:space="preserve">(1988) and Aguinis et al. (2005). Null DAI moderation results in the exporters-only specification</w:t>
       </w:r>
       <w:r>
         <w:t xml:space="preserve"> </w:t>
@@ -4218,13 +4278,13 @@
         <w:t xml:space="preserve"> </w:t>
       </w:r>
       <w:r>
-        <w:t xml:space="preserve">reported in the R5 exporters-only specification (F = 6.32, p = .003, β =</w:t>
-      </w:r>
-      <w:r>
-        <w:t xml:space="preserve"> </w:t>
-      </w:r>
-      <w:r>
-        <w:t xml:space="preserve">+2.821) is a stronger positive signal than the marginal sample size</w:t>
+        <w:t xml:space="preserve">reported in the R5 exporters-only specification (F = 4.54, p = .014, β =</w:t>
+      </w:r>
+      <w:r>
+        <w:t xml:space="preserve"> </w:t>
+      </w:r>
+      <w:r>
+        <w:t xml:space="preserve">+1.987) is a stronger positive signal than the marginal sample size</w:t>
       </w:r>
       <w:r>
         <w:t xml:space="preserve"> </w:t>
@@ -4272,19 +4332,34 @@
         <w:t xml:space="preserve"> </w:t>
       </w:r>
       <w:r>
-        <w:t xml:space="preserve">conventional thresholds (p = .303 in the baseline pooled specification)</w:t>
-      </w:r>
-      <w:r>
-        <w:t xml:space="preserve"> </w:t>
-      </w:r>
-      <w:r>
-        <w:t xml:space="preserve">but the appropriate reading of this null is not "the inverted-U</w:t>
-      </w:r>
-      <w:r>
-        <w:t xml:space="preserve"> </w:t>
-      </w:r>
-      <w:r>
-        <w:t xml:space="preserve">fails", because the test is conditioned on dense support around the</w:t>
+        <w:t xml:space="preserve">conventional thresholds (p = .346 in the baseline pooled specification)</w:t>
+      </w:r>
+      <w:r>
+        <w:t xml:space="preserve"> </w:t>
+      </w:r>
+      <w:r>
+        <w:t xml:space="preserve">but the appropriate reading of this null is not</w:t>
+      </w:r>
+      <w:r>
+        <w:t xml:space="preserve"> </w:t>
+      </w:r>
+      <w:r>
+        <w:t xml:space="preserve">“</w:t>
+      </w:r>
+      <w:r>
+        <w:t xml:space="preserve">the inverted-U</w:t>
+      </w:r>
+      <w:r>
+        <w:t xml:space="preserve"> </w:t>
+      </w:r>
+      <w:r>
+        <w:t xml:space="preserve">fails</w:t>
+      </w:r>
+      <w:r>
+        <w:t xml:space="preserve">”</w:t>
+      </w:r>
+      <w:r>
+        <w:t xml:space="preserve">, because the test is conditioned on dense support around the</w:t>
       </w:r>
       <w:r>
         <w:t xml:space="preserve"> </w:t>
@@ -4388,7 +4463,7 @@
         <w:t xml:space="preserve"> </w:t>
       </w:r>
       <w:r>
-        <w:t xml:space="preserve">.303 is therefore a</w:t>
+        <w:t xml:space="preserve">.346 is therefore a</w:t>
       </w:r>
       <w:r>
         <w:t xml:space="preserve"> </w:t>
@@ -4478,37 +4553,25 @@
         <w:t xml:space="preserve"> </w:t>
       </w:r>
       <w:r>
-        <w:t xml:space="preserve">specification. The IMR coefficient (β = 0.264, SE = 0.138, t = 1.92, p =</w:t>
-      </w:r>
-      <w:r>
-        <w:t xml:space="preserve"> </w:t>
-      </w:r>
-      <w:r>
-        <w:t xml:space="preserve">.055) is just above the .05 threshold, indicating mild selection at the</w:t>
-      </w:r>
-      <w:r>
-        <w:t xml:space="preserve"> </w:t>
-      </w:r>
-      <w:r>
-        <w:t xml:space="preserve">extensive margin of export participation. The key DAI × FSTS²</w:t>
-      </w:r>
-      <w:r>
-        <w:t xml:space="preserve"> </w:t>
-      </w:r>
-      <w:r>
-        <w:t xml:space="preserve">interaction (H3 amplification) and the TCI coefficient are not</w:t>
-      </w:r>
-      <w:r>
-        <w:t xml:space="preserve"> </w:t>
-      </w:r>
-      <w:r>
-        <w:t xml:space="preserve">materially altered (|Δ| &lt; 0.02 in each case), confirming that the</w:t>
-      </w:r>
-      <w:r>
-        <w:t xml:space="preserve"> </w:t>
-      </w:r>
-      <w:r>
-        <w:t xml:space="preserve">conditional-scaling mechanism is robust to this selection adjustment.</w:t>
+        <w:t xml:space="preserve">specification. This check leaves the key DAI × FSTS² and TCI estimates</w:t>
+      </w:r>
+      <w:r>
+        <w:t xml:space="preserve"> </w:t>
+      </w:r>
+      <w:r>
+        <w:t xml:space="preserve">essentially unchanged (|Δ| &lt; 0.02), with the inverse-Mills term itself</w:t>
+      </w:r>
+      <w:r>
+        <w:t xml:space="preserve"> </w:t>
+      </w:r>
+      <w:r>
+        <w:t xml:space="preserve">statistically insignificant, confirming that the conditional-scaling</w:t>
+      </w:r>
+      <w:r>
+        <w:t xml:space="preserve"> </w:t>
+      </w:r>
+      <w:r>
+        <w:t xml:space="preserve">mechanism is robust to this selection adjustment.</w:t>
       </w:r>
       <w:r>
         <w:t xml:space="preserve"> </w:t>
@@ -4611,7 +4674,7 @@
     </w:p>
     <w:bookmarkEnd w:id="42"/>
     <w:bookmarkEnd w:id="43"/>
-    <w:bookmarkStart w:id="49" w:name="X121719332867ee227f0a04b486098cee978c6e6"/>
+    <w:bookmarkStart w:id="49" w:name="results"/>
     <w:p>
       <w:pPr>
         <w:pStyle w:val="Heading2"/>
@@ -4620,7 +4683,7 @@
         <w:t xml:space="preserve">4 Results</w:t>
       </w:r>
     </w:p>
-    <w:bookmarkStart w:id="44" w:name="Xcfcbc1028680fbd618b9b585dd17cf608861803"/>
+    <w:bookmarkStart w:id="44" w:name="descriptive-statistics"/>
     <w:p>
       <w:pPr>
         <w:pStyle w:val="Heading3"/>
@@ -5004,7 +5067,7 @@
       </w:r>
     </w:p>
     <w:bookmarkEnd w:id="44"/>
-    <w:bookmarkStart w:id="45" w:name="Xe86cbbe4620ce5d84f78b7737e30408048ed6af"/>
+    <w:bookmarkStart w:id="45" w:name="X2451d3f7ca997a4cc37eff64b1b544b095ebde1"/>
     <w:p>
       <w:pPr>
         <w:pStyle w:val="Heading3"/>
@@ -5024,25 +5087,25 @@
         <w:t xml:space="preserve"> </w:t>
       </w:r>
       <w:r>
-        <w:t xml:space="preserve">is positive and statistically significant (β = +2.652, SE = 0.691, p &lt;</w:t>
-      </w:r>
-      <w:r>
-        <w:t xml:space="preserve"> </w:t>
-      </w:r>
-      <w:r>
-        <w:t xml:space="preserve">.001), whereas the squared term is negative (β = −1.705, SE = 0.931, p =</w:t>
-      </w:r>
-      <w:r>
-        <w:t xml:space="preserve"> </w:t>
-      </w:r>
-      <w:r>
-        <w:t xml:space="preserve">.068). The fitted curve therefore implies a turning point in the upper</w:t>
-      </w:r>
-      <w:r>
-        <w:t xml:space="preserve"> </w:t>
-      </w:r>
-      <w:r>
-        <w:t xml:space="preserve">tail of the export-intensity distribution, near FSTS = 82% on the</w:t>
+        <w:t xml:space="preserve">is positive and statistically significant (β = +3.078, SE = 0.805, p &lt;</w:t>
+      </w:r>
+      <w:r>
+        <w:t xml:space="preserve"> </w:t>
+      </w:r>
+      <w:r>
+        <w:t xml:space="preserve">.001), whereas the squared term is negative (β = −1.898, SE = 1.079, p =</w:t>
+      </w:r>
+      <w:r>
+        <w:t xml:space="preserve"> </w:t>
+      </w:r>
+      <w:r>
+        <w:t xml:space="preserve">.079). The fitted curve therefore implies a turning point in the upper</w:t>
+      </w:r>
+      <w:r>
+        <w:t xml:space="preserve"> </w:t>
+      </w:r>
+      <w:r>
+        <w:t xml:space="preserve">tail of the export-intensity distribution, near FSTS = 85.7% on the</w:t>
       </w:r>
       <w:r>
         <w:t xml:space="preserve"> </w:t>
@@ -5060,7 +5123,7 @@
         <w:t xml:space="preserve"> </w:t>
       </w:r>
       <w:r>
-        <w:t xml:space="preserve">recovers an inverted-U shape frequently (96.3% of replications), yet the</w:t>
+        <w:t xml:space="preserve">recovers an inverted-U shape frequently (94.9% of replications), yet the</w:t>
       </w:r>
       <w:r>
         <w:t xml:space="preserve"> </w:t>
@@ -5072,7 +5135,7 @@
         <w:t xml:space="preserve"> </w:t>
       </w:r>
       <w:r>
-        <w:t xml:space="preserve">is wide ([53%, 253%]), and the Lind–Mehlum test does not formally</w:t>
+        <w:t xml:space="preserve">is wide ([58%, 398%]), and the Lind–Mehlum test does not formally</w:t>
       </w:r>
       <w:r>
         <w:t xml:space="preserve"> </w:t>
@@ -5084,7 +5147,7 @@
         <w:t xml:space="preserve"> </w:t>
       </w:r>
       <w:r>
-        <w:t xml:space="preserve">= .303). This null is itself an informative positive result: Singapore's</w:t>
+        <w:t xml:space="preserve">= .346). This null is itself an informative positive result: Singapore’s</w:t>
       </w:r>
       <w:r>
         <w:t xml:space="preserve"> </w:t>
@@ -5156,19 +5219,49 @@
         <w:t xml:space="preserve"> </w:t>
       </w:r>
       <w:r>
-        <w:t xml:space="preserve">statistically underpowered to distinguish "no inverted-U" from</w:t>
-      </w:r>
-      <w:r>
-        <w:t xml:space="preserve"> </w:t>
-      </w:r>
-      <w:r>
-        <w:t xml:space="preserve">"inverted-U whose right-side decline has been pushed into the unobserved</w:t>
-      </w:r>
-      <w:r>
-        <w:t xml:space="preserve"> </w:t>
-      </w:r>
-      <w:r>
-        <w:t xml:space="preserve">upper tail." Under both hypotheses the data are consistent with a</w:t>
+        <w:t xml:space="preserve">statistically underpowered to distinguish</w:t>
+      </w:r>
+      <w:r>
+        <w:t xml:space="preserve"> </w:t>
+      </w:r>
+      <w:r>
+        <w:t xml:space="preserve">“</w:t>
+      </w:r>
+      <w:r>
+        <w:t xml:space="preserve">no inverted-U</w:t>
+      </w:r>
+      <w:r>
+        <w:t xml:space="preserve">”</w:t>
+      </w:r>
+      <w:r>
+        <w:t xml:space="preserve"> </w:t>
+      </w:r>
+      <w:r>
+        <w:t xml:space="preserve">from</w:t>
+      </w:r>
+      <w:r>
+        <w:t xml:space="preserve"> </w:t>
+      </w:r>
+      <w:r>
+        <w:t xml:space="preserve">“</w:t>
+      </w:r>
+      <w:r>
+        <w:t xml:space="preserve">inverted-U whose right-side decline has been pushed into the unobserved</w:t>
+      </w:r>
+      <w:r>
+        <w:t xml:space="preserve"> </w:t>
+      </w:r>
+      <w:r>
+        <w:t xml:space="preserve">upper tail.</w:t>
+      </w:r>
+      <w:r>
+        <w:t xml:space="preserve">”</w:t>
+      </w:r>
+      <w:r>
+        <w:t xml:space="preserve"> </w:t>
+      </w:r>
+      <w:r>
+        <w:t xml:space="preserve">Under both hypotheses the data are consistent with a</w:t>
       </w:r>
       <w:r>
         <w:t xml:space="preserve"> </w:t>
@@ -5257,7 +5350,7 @@
       </w:r>
     </w:p>
     <w:bookmarkEnd w:id="45"/>
-    <w:bookmarkStart w:id="46" w:name="Xbd081e7d38ad07e1e46d233e5fbc3c3c47a4f64"/>
+    <w:bookmarkStart w:id="46" w:name="tci-results"/>
     <w:p>
       <w:pPr>
         <w:pStyle w:val="Heading3"/>
@@ -5283,13 +5376,13 @@
         <w:t xml:space="preserve"> </w:t>
       </w:r>
       <w:r>
-        <w:t xml:space="preserve">= 0.168, SE = 0.040, p &lt; .001). Model fit also improves relative to the</w:t>
-      </w:r>
-      <w:r>
-        <w:t xml:space="preserve"> </w:t>
-      </w:r>
-      <w:r>
-        <w:t xml:space="preserve">quadratic baseline, with R² rising from 0.178 in Model M2 to 0.199 in</w:t>
+        <w:t xml:space="preserve">= 0.171, SE = 0.044, p &lt; .001). Model fit also improves relative to the</w:t>
+      </w:r>
+      <w:r>
+        <w:t xml:space="preserve"> </w:t>
+      </w:r>
+      <w:r>
+        <w:t xml:space="preserve">quadratic baseline, with R² rising from 0.175 in Model M2 to 0.197 in</w:t>
       </w:r>
       <w:r>
         <w:t xml:space="preserve"> </w:t>
@@ -5319,7 +5412,7 @@
         <w:t xml:space="preserve"> </w:t>
       </w:r>
       <w:r>
-        <w:t xml:space="preserve">(β = 0.188, p &lt; .001), but the interaction terms involving FSTS and</w:t>
+        <w:t xml:space="preserve">(β = 0.168, p &lt; .001), but the interaction terms involving FSTS and</w:t>
       </w:r>
       <w:r>
         <w:t xml:space="preserve"> </w:t>
@@ -5389,7 +5482,7 @@
       </w:r>
     </w:p>
     <w:bookmarkEnd w:id="46"/>
-    <w:bookmarkStart w:id="47" w:name="X0bc604979a3b7f5f87ce430a2a9c0e71ddd76f9"/>
+    <w:bookmarkStart w:id="47" w:name="dai-results"/>
     <w:p>
       <w:pPr>
         <w:pStyle w:val="Heading3"/>
@@ -5409,25 +5502,25 @@
         <w:t xml:space="preserve"> </w:t>
       </w:r>
       <w:r>
-        <w:t xml:space="preserve">positively associated with labour productivity (β = 0.104, SE = 0.038, p</w:t>
-      </w:r>
-      <w:r>
-        <w:t xml:space="preserve"> </w:t>
-      </w:r>
-      <w:r>
-        <w:t xml:space="preserve">= .007). However, once TCI is included alongside DAI in Model M7, the</w:t>
-      </w:r>
-      <w:r>
-        <w:t xml:space="preserve"> </w:t>
-      </w:r>
-      <w:r>
-        <w:t xml:space="preserve">DAI coefficient attenuates to β = 0.077 and remains statistically</w:t>
-      </w:r>
-      <w:r>
-        <w:t xml:space="preserve"> </w:t>
-      </w:r>
-      <w:r>
-        <w:t xml:space="preserve">significant but attenuated (p = .048), suggesting partial overlap in the</w:t>
+        <w:t xml:space="preserve">positively associated with labour productivity (β = 0.119, SE = 0.039, p</w:t>
+      </w:r>
+      <w:r>
+        <w:t xml:space="preserve"> </w:t>
+      </w:r>
+      <w:r>
+        <w:t xml:space="preserve">= .002). However, once TCI is included alongside DAI in Model M7, the</w:t>
+      </w:r>
+      <w:r>
+        <w:t xml:space="preserve"> </w:t>
+      </w:r>
+      <w:r>
+        <w:t xml:space="preserve">DAI coefficient attenuates to β = 0.094 and remains statistically</w:t>
+      </w:r>
+      <w:r>
+        <w:t xml:space="preserve"> </w:t>
+      </w:r>
+      <w:r>
+        <w:t xml:space="preserve">significant but attenuated (p = .016), suggesting partial overlap in the</w:t>
       </w:r>
       <w:r>
         <w:t xml:space="preserve"> </w:t>
@@ -5469,19 +5562,19 @@
     <w:tbl>
       <w:tblPr>
         <w:tblStyle w:val="Table"/>
-        <w:tblW w:type="auto" w:w="0"/>
+        <w:tblW w:type="pct" w:w="5000"/>
         <w:tblLook w:firstRow="1" w:lastRow="0" w:firstColumn="0" w:lastColumn="0" w:noHBand="0" w:noVBand="0" w:val="0020"/>
         <w:jc w:val="start"/>
       </w:tblPr>
       <w:tblGrid>
-        <w:gridCol w:w="990"/>
-        <w:gridCol w:w="990"/>
-        <w:gridCol w:w="990"/>
-        <w:gridCol w:w="990"/>
-        <w:gridCol w:w="990"/>
-        <w:gridCol w:w="990"/>
-        <w:gridCol w:w="990"/>
-        <w:gridCol w:w="990"/>
+        <w:gridCol w:w="1047"/>
+        <w:gridCol w:w="981"/>
+        <w:gridCol w:w="981"/>
+        <w:gridCol w:w="981"/>
+        <w:gridCol w:w="981"/>
+        <w:gridCol w:w="981"/>
+        <w:gridCol w:w="981"/>
+        <w:gridCol w:w="981"/>
       </w:tblGrid>
       <w:tr>
         <w:trPr>
@@ -5613,67 +5706,67 @@
               <w:jc w:val="left"/>
             </w:pPr>
             <w:r>
-              <w:t xml:space="preserve">+2.652***</w:t>
-            </w:r>
-          </w:p>
-        </w:tc>
-        <w:tc>
-          <w:tcPr/>
-          <w:p>
-            <w:pPr>
-              <w:pStyle w:val="Compact"/>
-              <w:jc w:val="left"/>
-            </w:pPr>
-            <w:r>
-              <w:t xml:space="preserve">+2.165**</w:t>
-            </w:r>
-          </w:p>
-        </w:tc>
-        <w:tc>
-          <w:tcPr/>
-          <w:p>
-            <w:pPr>
-              <w:pStyle w:val="Compact"/>
-              <w:jc w:val="left"/>
-            </w:pPr>
-            <w:r>
-              <w:t xml:space="preserve">+2.322***</w:t>
-            </w:r>
-          </w:p>
-        </w:tc>
-        <w:tc>
-          <w:tcPr/>
-          <w:p>
-            <w:pPr>
-              <w:pStyle w:val="Compact"/>
-              <w:jc w:val="left"/>
-            </w:pPr>
-            <w:r>
-              <w:t xml:space="preserve">+1.952**</w:t>
-            </w:r>
-          </w:p>
-        </w:tc>
-        <w:tc>
-          <w:tcPr/>
-          <w:p>
-            <w:pPr>
-              <w:pStyle w:val="Compact"/>
-              <w:jc w:val="left"/>
-            </w:pPr>
-            <w:r>
-              <w:t xml:space="preserve">+2.768***</w:t>
-            </w:r>
-          </w:p>
-        </w:tc>
-        <w:tc>
-          <w:tcPr/>
-          <w:p>
-            <w:pPr>
-              <w:pStyle w:val="Compact"/>
-              <w:jc w:val="left"/>
-            </w:pPr>
-            <w:r>
-              <w:t xml:space="preserve">+2.409**</w:t>
+              <w:t xml:space="preserve">+3.078***</w:t>
+            </w:r>
+          </w:p>
+        </w:tc>
+        <w:tc>
+          <w:tcPr/>
+          <w:p>
+            <w:pPr>
+              <w:pStyle w:val="Compact"/>
+              <w:jc w:val="left"/>
+            </w:pPr>
+            <w:r>
+              <w:t xml:space="preserve">+2.643**</w:t>
+            </w:r>
+          </w:p>
+        </w:tc>
+        <w:tc>
+          <w:tcPr/>
+          <w:p>
+            <w:pPr>
+              <w:pStyle w:val="Compact"/>
+              <w:jc w:val="left"/>
+            </w:pPr>
+            <w:r>
+              <w:t xml:space="preserve">+2.726***</w:t>
+            </w:r>
+          </w:p>
+        </w:tc>
+        <w:tc>
+          <w:tcPr/>
+          <w:p>
+            <w:pPr>
+              <w:pStyle w:val="Compact"/>
+              <w:jc w:val="left"/>
+            </w:pPr>
+            <w:r>
+              <w:t xml:space="preserve">+2.408**</w:t>
+            </w:r>
+          </w:p>
+        </w:tc>
+        <w:tc>
+          <w:tcPr/>
+          <w:p>
+            <w:pPr>
+              <w:pStyle w:val="Compact"/>
+              <w:jc w:val="left"/>
+            </w:pPr>
+            <w:r>
+              <w:t xml:space="preserve">+3.109***</w:t>
+            </w:r>
+          </w:p>
+        </w:tc>
+        <w:tc>
+          <w:tcPr/>
+          <w:p>
+            <w:pPr>
+              <w:pStyle w:val="Compact"/>
+              <w:jc w:val="left"/>
+            </w:pPr>
+            <w:r>
+              <w:t xml:space="preserve">+2.791**</w:t>
             </w:r>
           </w:p>
         </w:tc>
@@ -5703,67 +5796,67 @@
               <w:jc w:val="left"/>
             </w:pPr>
             <w:r>
-              <w:t xml:space="preserve">(0.691)</w:t>
-            </w:r>
-          </w:p>
-        </w:tc>
-        <w:tc>
-          <w:tcPr/>
-          <w:p>
-            <w:pPr>
-              <w:pStyle w:val="Compact"/>
-              <w:jc w:val="left"/>
-            </w:pPr>
-            <w:r>
-              <w:t xml:space="preserve">(0.699)</w:t>
-            </w:r>
-          </w:p>
-        </w:tc>
-        <w:tc>
-          <w:tcPr/>
-          <w:p>
-            <w:pPr>
-              <w:pStyle w:val="Compact"/>
-              <w:jc w:val="left"/>
-            </w:pPr>
-            <w:r>
-              <w:t xml:space="preserve">(0.701)</w:t>
-            </w:r>
-          </w:p>
-        </w:tc>
-        <w:tc>
-          <w:tcPr/>
-          <w:p>
-            <w:pPr>
-              <w:pStyle w:val="Compact"/>
-              <w:jc w:val="left"/>
-            </w:pPr>
-            <w:r>
-              <w:t xml:space="preserve">(0.707)</w:t>
-            </w:r>
-          </w:p>
-        </w:tc>
-        <w:tc>
-          <w:tcPr/>
-          <w:p>
-            <w:pPr>
-              <w:pStyle w:val="Compact"/>
-              <w:jc w:val="left"/>
-            </w:pPr>
-            <w:r>
-              <w:t xml:space="preserve">(0.750)</w:t>
-            </w:r>
-          </w:p>
-        </w:tc>
-        <w:tc>
-          <w:tcPr/>
-          <w:p>
-            <w:pPr>
-              <w:pStyle w:val="Compact"/>
-              <w:jc w:val="left"/>
-            </w:pPr>
-            <w:r>
-              <w:t xml:space="preserve">(0.748)</w:t>
+              <w:t xml:space="preserve">(0.805)</w:t>
+            </w:r>
+          </w:p>
+        </w:tc>
+        <w:tc>
+          <w:tcPr/>
+          <w:p>
+            <w:pPr>
+              <w:pStyle w:val="Compact"/>
+              <w:jc w:val="left"/>
+            </w:pPr>
+            <w:r>
+              <w:t xml:space="preserve">(0.836)</w:t>
+            </w:r>
+          </w:p>
+        </w:tc>
+        <w:tc>
+          <w:tcPr/>
+          <w:p>
+            <w:pPr>
+              <w:pStyle w:val="Compact"/>
+              <w:jc w:val="left"/>
+            </w:pPr>
+            <w:r>
+              <w:t xml:space="preserve">(0.817)</w:t>
+            </w:r>
+          </w:p>
+        </w:tc>
+        <w:tc>
+          <w:tcPr/>
+          <w:p>
+            <w:pPr>
+              <w:pStyle w:val="Compact"/>
+              <w:jc w:val="left"/>
+            </w:pPr>
+            <w:r>
+              <w:t xml:space="preserve">(0.845)</w:t>
+            </w:r>
+          </w:p>
+        </w:tc>
+        <w:tc>
+          <w:tcPr/>
+          <w:p>
+            <w:pPr>
+              <w:pStyle w:val="Compact"/>
+              <w:jc w:val="left"/>
+            </w:pPr>
+            <w:r>
+              <w:t xml:space="preserve">(0.826)</w:t>
+            </w:r>
+          </w:p>
+        </w:tc>
+        <w:tc>
+          <w:tcPr/>
+          <w:p>
+            <w:pPr>
+              <w:pStyle w:val="Compact"/>
+              <w:jc w:val="left"/>
+            </w:pPr>
+            <w:r>
+              <w:t xml:space="preserve">(0.850)</w:t>
             </w:r>
           </w:p>
         </w:tc>
@@ -5797,67 +5890,67 @@
               <w:jc w:val="left"/>
             </w:pPr>
             <w:r>
-              <w:t xml:space="preserve">-1.705†</w:t>
-            </w:r>
-          </w:p>
-        </w:tc>
-        <w:tc>
-          <w:tcPr/>
-          <w:p>
-            <w:pPr>
-              <w:pStyle w:val="Compact"/>
-              <w:jc w:val="left"/>
-            </w:pPr>
-            <w:r>
-              <w:t xml:space="preserve">-1.168</w:t>
-            </w:r>
-          </w:p>
-        </w:tc>
-        <w:tc>
-          <w:tcPr/>
-          <w:p>
-            <w:pPr>
-              <w:pStyle w:val="Compact"/>
-              <w:jc w:val="left"/>
-            </w:pPr>
-            <w:r>
-              <w:t xml:space="preserve">-1.389</w:t>
-            </w:r>
-          </w:p>
-        </w:tc>
-        <w:tc>
-          <w:tcPr/>
-          <w:p>
-            <w:pPr>
-              <w:pStyle w:val="Compact"/>
-              <w:jc w:val="left"/>
-            </w:pPr>
-            <w:r>
-              <w:t xml:space="preserve">-0.965</w:t>
-            </w:r>
-          </w:p>
-        </w:tc>
-        <w:tc>
-          <w:tcPr/>
-          <w:p>
-            <w:pPr>
-              <w:pStyle w:val="Compact"/>
-              <w:jc w:val="left"/>
-            </w:pPr>
-            <w:r>
-              <w:t xml:space="preserve">-2.959**</w:t>
-            </w:r>
-          </w:p>
-        </w:tc>
-        <w:tc>
-          <w:tcPr/>
-          <w:p>
-            <w:pPr>
-              <w:pStyle w:val="Compact"/>
-              <w:jc w:val="left"/>
-            </w:pPr>
-            <w:r>
-              <w:t xml:space="preserve">-2.543*</w:t>
+              <w:t xml:space="preserve">-1.898†</w:t>
+            </w:r>
+          </w:p>
+        </w:tc>
+        <w:tc>
+          <w:tcPr/>
+          <w:p>
+            <w:pPr>
+              <w:pStyle w:val="Compact"/>
+              <w:jc w:val="left"/>
+            </w:pPr>
+            <w:r>
+              <w:t xml:space="preserve">-1.418</w:t>
+            </w:r>
+          </w:p>
+        </w:tc>
+        <w:tc>
+          <w:tcPr/>
+          <w:p>
+            <w:pPr>
+              <w:pStyle w:val="Compact"/>
+              <w:jc w:val="left"/>
+            </w:pPr>
+            <w:r>
+              <w:t xml:space="preserve">-1.568</w:t>
+            </w:r>
+          </w:p>
+        </w:tc>
+        <w:tc>
+          <w:tcPr/>
+          <w:p>
+            <w:pPr>
+              <w:pStyle w:val="Compact"/>
+              <w:jc w:val="left"/>
+            </w:pPr>
+            <w:r>
+              <w:t xml:space="preserve">-1.203</w:t>
+            </w:r>
+          </w:p>
+        </w:tc>
+        <w:tc>
+          <w:tcPr/>
+          <w:p>
+            <w:pPr>
+              <w:pStyle w:val="Compact"/>
+              <w:jc w:val="left"/>
+            </w:pPr>
+            <w:r>
+              <w:t xml:space="preserve">-3.277**</w:t>
+            </w:r>
+          </w:p>
+        </w:tc>
+        <w:tc>
+          <w:tcPr/>
+          <w:p>
+            <w:pPr>
+              <w:pStyle w:val="Compact"/>
+              <w:jc w:val="left"/>
+            </w:pPr>
+            <w:r>
+              <w:t xml:space="preserve">-2.872*</w:t>
             </w:r>
           </w:p>
         </w:tc>
@@ -5887,67 +5980,67 @@
               <w:jc w:val="left"/>
             </w:pPr>
             <w:r>
-              <w:t xml:space="preserve">(0.931)</w:t>
-            </w:r>
-          </w:p>
-        </w:tc>
-        <w:tc>
-          <w:tcPr/>
-          <w:p>
-            <w:pPr>
-              <w:pStyle w:val="Compact"/>
-              <w:jc w:val="left"/>
-            </w:pPr>
-            <w:r>
-              <w:t xml:space="preserve">(0.940)</w:t>
-            </w:r>
-          </w:p>
-        </w:tc>
-        <w:tc>
-          <w:tcPr/>
-          <w:p>
-            <w:pPr>
-              <w:pStyle w:val="Compact"/>
-              <w:jc w:val="left"/>
-            </w:pPr>
-            <w:r>
-              <w:t xml:space="preserve">(0.928)</w:t>
-            </w:r>
-          </w:p>
-        </w:tc>
-        <w:tc>
-          <w:tcPr/>
-          <w:p>
-            <w:pPr>
-              <w:pStyle w:val="Compact"/>
-              <w:jc w:val="left"/>
-            </w:pPr>
-            <w:r>
-              <w:t xml:space="preserve">(0.938)</w:t>
-            </w:r>
-          </w:p>
-        </w:tc>
-        <w:tc>
-          <w:tcPr/>
-          <w:p>
-            <w:pPr>
-              <w:pStyle w:val="Compact"/>
-              <w:jc w:val="left"/>
-            </w:pPr>
-            <w:r>
-              <w:t xml:space="preserve">(1.012)</w:t>
-            </w:r>
-          </w:p>
-        </w:tc>
-        <w:tc>
-          <w:tcPr/>
-          <w:p>
-            <w:pPr>
-              <w:pStyle w:val="Compact"/>
-              <w:jc w:val="left"/>
-            </w:pPr>
-            <w:r>
-              <w:t xml:space="preserve">(1.045)</w:t>
+              <w:t xml:space="preserve">(1.079)</w:t>
+            </w:r>
+          </w:p>
+        </w:tc>
+        <w:tc>
+          <w:tcPr/>
+          <w:p>
+            <w:pPr>
+              <w:pStyle w:val="Compact"/>
+              <w:jc w:val="left"/>
+            </w:pPr>
+            <w:r>
+              <w:t xml:space="preserve">(1.111)</w:t>
+            </w:r>
+          </w:p>
+        </w:tc>
+        <w:tc>
+          <w:tcPr/>
+          <w:p>
+            <w:pPr>
+              <w:pStyle w:val="Compact"/>
+              <w:jc w:val="left"/>
+            </w:pPr>
+            <w:r>
+              <w:t xml:space="preserve">(1.080)</w:t>
+            </w:r>
+          </w:p>
+        </w:tc>
+        <w:tc>
+          <w:tcPr/>
+          <w:p>
+            <w:pPr>
+              <w:pStyle w:val="Compact"/>
+              <w:jc w:val="left"/>
+            </w:pPr>
+            <w:r>
+              <w:t xml:space="preserve">(1.114)</w:t>
+            </w:r>
+          </w:p>
+        </w:tc>
+        <w:tc>
+          <w:tcPr/>
+          <w:p>
+            <w:pPr>
+              <w:pStyle w:val="Compact"/>
+              <w:jc w:val="left"/>
+            </w:pPr>
+            <w:r>
+              <w:t xml:space="preserve">(1.103)</w:t>
+            </w:r>
+          </w:p>
+        </w:tc>
+        <w:tc>
+          <w:tcPr/>
+          <w:p>
+            <w:pPr>
+              <w:pStyle w:val="Compact"/>
+              <w:jc w:val="left"/>
+            </w:pPr>
+            <w:r>
+              <w:t xml:space="preserve">(1.145)</w:t>
             </w:r>
           </w:p>
         </w:tc>
@@ -5989,47 +6082,47 @@
               <w:jc w:val="left"/>
             </w:pPr>
             <w:r>
-              <w:t xml:space="preserve">+0.168***</w:t>
-            </w:r>
-          </w:p>
-        </w:tc>
-        <w:tc>
-          <w:tcPr/>
-          <w:p>
-            <w:pPr>
-              <w:pStyle w:val="Compact"/>
-            </w:pPr>
-          </w:p>
-        </w:tc>
-        <w:tc>
-          <w:tcPr/>
-          <w:p>
-            <w:pPr>
-              <w:pStyle w:val="Compact"/>
-              <w:jc w:val="left"/>
-            </w:pPr>
-            <w:r>
-              <w:t xml:space="preserve">+0.153***</w:t>
-            </w:r>
-          </w:p>
-        </w:tc>
-        <w:tc>
-          <w:tcPr/>
-          <w:p>
-            <w:pPr>
-              <w:pStyle w:val="Compact"/>
-            </w:pPr>
-          </w:p>
-        </w:tc>
-        <w:tc>
-          <w:tcPr/>
-          <w:p>
-            <w:pPr>
-              <w:pStyle w:val="Compact"/>
-              <w:jc w:val="left"/>
-            </w:pPr>
-            <w:r>
-              <w:t xml:space="preserve">+0.153***</w:t>
+              <w:t xml:space="preserve">+0.171***</w:t>
+            </w:r>
+          </w:p>
+        </w:tc>
+        <w:tc>
+          <w:tcPr/>
+          <w:p>
+            <w:pPr>
+              <w:pStyle w:val="Compact"/>
+            </w:pPr>
+          </w:p>
+        </w:tc>
+        <w:tc>
+          <w:tcPr/>
+          <w:p>
+            <w:pPr>
+              <w:pStyle w:val="Compact"/>
+              <w:jc w:val="left"/>
+            </w:pPr>
+            <w:r>
+              <w:t xml:space="preserve">+0.155***</w:t>
+            </w:r>
+          </w:p>
+        </w:tc>
+        <w:tc>
+          <w:tcPr/>
+          <w:p>
+            <w:pPr>
+              <w:pStyle w:val="Compact"/>
+            </w:pPr>
+          </w:p>
+        </w:tc>
+        <w:tc>
+          <w:tcPr/>
+          <w:p>
+            <w:pPr>
+              <w:pStyle w:val="Compact"/>
+              <w:jc w:val="left"/>
+            </w:pPr>
+            <w:r>
+              <w:t xml:space="preserve">+0.152***</w:t>
             </w:r>
           </w:p>
         </w:tc>
@@ -6067,47 +6160,47 @@
               <w:jc w:val="left"/>
             </w:pPr>
             <w:r>
-              <w:t xml:space="preserve">(0.040)</w:t>
-            </w:r>
-          </w:p>
-        </w:tc>
-        <w:tc>
-          <w:tcPr/>
-          <w:p>
-            <w:pPr>
-              <w:pStyle w:val="Compact"/>
-            </w:pPr>
-          </w:p>
-        </w:tc>
-        <w:tc>
-          <w:tcPr/>
-          <w:p>
-            <w:pPr>
-              <w:pStyle w:val="Compact"/>
-              <w:jc w:val="left"/>
-            </w:pPr>
-            <w:r>
-              <w:t xml:space="preserve">(0.041)</w:t>
-            </w:r>
-          </w:p>
-        </w:tc>
-        <w:tc>
-          <w:tcPr/>
-          <w:p>
-            <w:pPr>
-              <w:pStyle w:val="Compact"/>
-            </w:pPr>
-          </w:p>
-        </w:tc>
-        <w:tc>
-          <w:tcPr/>
-          <w:p>
-            <w:pPr>
-              <w:pStyle w:val="Compact"/>
-              <w:jc w:val="left"/>
-            </w:pPr>
-            <w:r>
-              <w:t xml:space="preserve">(0.041)</w:t>
+              <w:t xml:space="preserve">(0.044)</w:t>
+            </w:r>
+          </w:p>
+        </w:tc>
+        <w:tc>
+          <w:tcPr/>
+          <w:p>
+            <w:pPr>
+              <w:pStyle w:val="Compact"/>
+            </w:pPr>
+          </w:p>
+        </w:tc>
+        <w:tc>
+          <w:tcPr/>
+          <w:p>
+            <w:pPr>
+              <w:pStyle w:val="Compact"/>
+              <w:jc w:val="left"/>
+            </w:pPr>
+            <w:r>
+              <w:t xml:space="preserve">(0.046)</w:t>
+            </w:r>
+          </w:p>
+        </w:tc>
+        <w:tc>
+          <w:tcPr/>
+          <w:p>
+            <w:pPr>
+              <w:pStyle w:val="Compact"/>
+            </w:pPr>
+          </w:p>
+        </w:tc>
+        <w:tc>
+          <w:tcPr/>
+          <w:p>
+            <w:pPr>
+              <w:pStyle w:val="Compact"/>
+              <w:jc w:val="left"/>
+            </w:pPr>
+            <w:r>
+              <w:t xml:space="preserve">(0.046)</w:t>
             </w:r>
           </w:p>
         </w:tc>
@@ -6157,43 +6250,43 @@
               <w:jc w:val="left"/>
             </w:pPr>
             <w:r>
-              <w:t xml:space="preserve">+0.104**</w:t>
-            </w:r>
-          </w:p>
-        </w:tc>
-        <w:tc>
-          <w:tcPr/>
-          <w:p>
-            <w:pPr>
-              <w:pStyle w:val="Compact"/>
-              <w:jc w:val="left"/>
-            </w:pPr>
-            <w:r>
-              <w:t xml:space="preserve">+0.077*</w:t>
-            </w:r>
-          </w:p>
-        </w:tc>
-        <w:tc>
-          <w:tcPr/>
-          <w:p>
-            <w:pPr>
-              <w:pStyle w:val="Compact"/>
-              <w:jc w:val="left"/>
-            </w:pPr>
-            <w:r>
-              <w:t xml:space="preserve">+0.046</w:t>
-            </w:r>
-          </w:p>
-        </w:tc>
-        <w:tc>
-          <w:tcPr/>
-          <w:p>
-            <w:pPr>
-              <w:pStyle w:val="Compact"/>
-              <w:jc w:val="left"/>
-            </w:pPr>
-            <w:r>
-              <w:t xml:space="preserve">+0.019</w:t>
+              <w:t xml:space="preserve">+0.119**</w:t>
+            </w:r>
+          </w:p>
+        </w:tc>
+        <w:tc>
+          <w:tcPr/>
+          <w:p>
+            <w:pPr>
+              <w:pStyle w:val="Compact"/>
+              <w:jc w:val="left"/>
+            </w:pPr>
+            <w:r>
+              <w:t xml:space="preserve">+0.094*</w:t>
+            </w:r>
+          </w:p>
+        </w:tc>
+        <w:tc>
+          <w:tcPr/>
+          <w:p>
+            <w:pPr>
+              <w:pStyle w:val="Compact"/>
+              <w:jc w:val="left"/>
+            </w:pPr>
+            <w:r>
+              <w:t xml:space="preserve">+0.063</w:t>
+            </w:r>
+          </w:p>
+        </w:tc>
+        <w:tc>
+          <w:tcPr/>
+          <w:p>
+            <w:pPr>
+              <w:pStyle w:val="Compact"/>
+              <w:jc w:val="left"/>
+            </w:pPr>
+            <w:r>
+              <w:t xml:space="preserve">+0.039</w:t>
             </w:r>
           </w:p>
         </w:tc>
@@ -6239,18 +6332,6 @@
               <w:jc w:val="left"/>
             </w:pPr>
             <w:r>
-              <w:t xml:space="preserve">(0.038)</w:t>
-            </w:r>
-          </w:p>
-        </w:tc>
-        <w:tc>
-          <w:tcPr/>
-          <w:p>
-            <w:pPr>
-              <w:pStyle w:val="Compact"/>
-              <w:jc w:val="left"/>
-            </w:pPr>
-            <w:r>
               <w:t xml:space="preserve">(0.039)</w:t>
             </w:r>
           </w:p>
@@ -6263,19 +6344,31 @@
               <w:jc w:val="left"/>
             </w:pPr>
             <w:r>
-              <w:t xml:space="preserve">(0.045)</w:t>
-            </w:r>
-          </w:p>
-        </w:tc>
-        <w:tc>
-          <w:tcPr/>
-          <w:p>
-            <w:pPr>
-              <w:pStyle w:val="Compact"/>
-              <w:jc w:val="left"/>
-            </w:pPr>
-            <w:r>
-              <w:t xml:space="preserve">(0.050)</w:t>
+              <w:t xml:space="preserve">(0.039)</w:t>
+            </w:r>
+          </w:p>
+        </w:tc>
+        <w:tc>
+          <w:tcPr/>
+          <w:p>
+            <w:pPr>
+              <w:pStyle w:val="Compact"/>
+              <w:jc w:val="left"/>
+            </w:pPr>
+            <w:r>
+              <w:t xml:space="preserve">(0.049)</w:t>
+            </w:r>
+          </w:p>
+        </w:tc>
+        <w:tc>
+          <w:tcPr/>
+          <w:p>
+            <w:pPr>
+              <w:pStyle w:val="Compact"/>
+              <w:jc w:val="left"/>
+            </w:pPr>
+            <w:r>
+              <w:t xml:space="preserve">(0.049)</w:t>
             </w:r>
           </w:p>
         </w:tc>
@@ -6341,19 +6434,19 @@
               <w:jc w:val="left"/>
             </w:pPr>
             <w:r>
-              <w:t xml:space="preserve">-1.144</w:t>
-            </w:r>
-          </w:p>
-        </w:tc>
-        <w:tc>
-          <w:tcPr/>
-          <w:p>
-            <w:pPr>
-              <w:pStyle w:val="Compact"/>
-              <w:jc w:val="left"/>
-            </w:pPr>
-            <w:r>
-              <w:t xml:space="preserve">-1.167†</w:t>
+              <w:t xml:space="preserve">-1.037</w:t>
+            </w:r>
+          </w:p>
+        </w:tc>
+        <w:tc>
+          <w:tcPr/>
+          <w:p>
+            <w:pPr>
+              <w:pStyle w:val="Compact"/>
+              <w:jc w:val="left"/>
+            </w:pPr>
+            <w:r>
+              <w:t xml:space="preserve">-1.018</w:t>
             </w:r>
           </w:p>
         </w:tc>
@@ -6415,19 +6508,19 @@
               <w:jc w:val="left"/>
             </w:pPr>
             <w:r>
-              <w:t xml:space="preserve">(0.702)</w:t>
-            </w:r>
-          </w:p>
-        </w:tc>
-        <w:tc>
-          <w:tcPr/>
-          <w:p>
-            <w:pPr>
-              <w:pStyle w:val="Compact"/>
-              <w:jc w:val="left"/>
-            </w:pPr>
-            <w:r>
-              <w:t xml:space="preserve">(0.686)</w:t>
+              <w:t xml:space="preserve">(0.790)</w:t>
+            </w:r>
+          </w:p>
+        </w:tc>
+        <w:tc>
+          <w:tcPr/>
+          <w:p>
+            <w:pPr>
+              <w:pStyle w:val="Compact"/>
+              <w:jc w:val="left"/>
+            </w:pPr>
+            <w:r>
+              <w:t xml:space="preserve">(0.777)</w:t>
             </w:r>
           </w:p>
         </w:tc>
@@ -6493,19 +6586,19 @@
               <w:jc w:val="left"/>
             </w:pPr>
             <w:r>
-              <w:t xml:space="preserve">+3.098**</w:t>
-            </w:r>
-          </w:p>
-        </w:tc>
-        <w:tc>
-          <w:tcPr/>
-          <w:p>
-            <w:pPr>
-              <w:pStyle w:val="Compact"/>
-              <w:jc w:val="left"/>
-            </w:pPr>
-            <w:r>
-              <w:t xml:space="preserve">+3.119**</w:t>
+              <w:t xml:space="preserve">+3.307*</w:t>
+            </w:r>
+          </w:p>
+        </w:tc>
+        <w:tc>
+          <w:tcPr/>
+          <w:p>
+            <w:pPr>
+              <w:pStyle w:val="Compact"/>
+              <w:jc w:val="left"/>
+            </w:pPr>
+            <w:r>
+              <w:t xml:space="preserve">+3.220*</w:t>
             </w:r>
           </w:p>
         </w:tc>
@@ -6567,19 +6660,19 @@
               <w:jc w:val="left"/>
             </w:pPr>
             <w:r>
-              <w:t xml:space="preserve">(1.088)</w:t>
-            </w:r>
-          </w:p>
-        </w:tc>
-        <w:tc>
-          <w:tcPr/>
-          <w:p>
-            <w:pPr>
-              <w:pStyle w:val="Compact"/>
-              <w:jc w:val="left"/>
-            </w:pPr>
-            <w:r>
-              <w:t xml:space="preserve">(1.124)</w:t>
+              <w:t xml:space="preserve">(1.345)</w:t>
+            </w:r>
+          </w:p>
+        </w:tc>
+        <w:tc>
+          <w:tcPr/>
+          <w:p>
+            <w:pPr>
+              <w:pStyle w:val="Compact"/>
+              <w:jc w:val="left"/>
+            </w:pPr>
+            <w:r>
+              <w:t xml:space="preserve">(1.384)</w:t>
             </w:r>
           </w:p>
         </w:tc>
@@ -6605,79 +6698,79 @@
               <w:jc w:val="left"/>
             </w:pPr>
             <w:r>
-              <w:t xml:space="preserve">-0.120**</w:t>
-            </w:r>
-          </w:p>
-        </w:tc>
-        <w:tc>
-          <w:tcPr/>
-          <w:p>
-            <w:pPr>
-              <w:pStyle w:val="Compact"/>
-              <w:jc w:val="left"/>
-            </w:pPr>
-            <w:r>
-              <w:t xml:space="preserve">-0.124***</w:t>
-            </w:r>
-          </w:p>
-        </w:tc>
-        <w:tc>
-          <w:tcPr/>
-          <w:p>
-            <w:pPr>
-              <w:pStyle w:val="Compact"/>
-              <w:jc w:val="left"/>
-            </w:pPr>
-            <w:r>
-              <w:t xml:space="preserve">-0.175***</w:t>
-            </w:r>
-          </w:p>
-        </w:tc>
-        <w:tc>
-          <w:tcPr/>
-          <w:p>
-            <w:pPr>
-              <w:pStyle w:val="Compact"/>
-              <w:jc w:val="left"/>
-            </w:pPr>
-            <w:r>
-              <w:t xml:space="preserve">-0.135***</w:t>
-            </w:r>
-          </w:p>
-        </w:tc>
-        <w:tc>
-          <w:tcPr/>
-          <w:p>
-            <w:pPr>
-              <w:pStyle w:val="Compact"/>
-              <w:jc w:val="left"/>
-            </w:pPr>
-            <w:r>
-              <w:t xml:space="preserve">-0.179***</w:t>
-            </w:r>
-          </w:p>
-        </w:tc>
-        <w:tc>
-          <w:tcPr/>
-          <w:p>
-            <w:pPr>
-              <w:pStyle w:val="Compact"/>
-              <w:jc w:val="left"/>
-            </w:pPr>
-            <w:r>
-              <w:t xml:space="preserve">-0.125***</w:t>
-            </w:r>
-          </w:p>
-        </w:tc>
-        <w:tc>
-          <w:tcPr/>
-          <w:p>
-            <w:pPr>
-              <w:pStyle w:val="Compact"/>
-              <w:jc w:val="left"/>
-            </w:pPr>
-            <w:r>
-              <w:t xml:space="preserve">-0.168***</w:t>
+              <w:t xml:space="preserve">-0.127***</w:t>
+            </w:r>
+          </w:p>
+        </w:tc>
+        <w:tc>
+          <w:tcPr/>
+          <w:p>
+            <w:pPr>
+              <w:pStyle w:val="Compact"/>
+              <w:jc w:val="left"/>
+            </w:pPr>
+            <w:r>
+              <w:t xml:space="preserve">-0.129***</w:t>
+            </w:r>
+          </w:p>
+        </w:tc>
+        <w:tc>
+          <w:tcPr/>
+          <w:p>
+            <w:pPr>
+              <w:pStyle w:val="Compact"/>
+              <w:jc w:val="left"/>
+            </w:pPr>
+            <w:r>
+              <w:t xml:space="preserve">-0.177***</w:t>
+            </w:r>
+          </w:p>
+        </w:tc>
+        <w:tc>
+          <w:tcPr/>
+          <w:p>
+            <w:pPr>
+              <w:pStyle w:val="Compact"/>
+              <w:jc w:val="left"/>
+            </w:pPr>
+            <w:r>
+              <w:t xml:space="preserve">-0.143***</w:t>
+            </w:r>
+          </w:p>
+        </w:tc>
+        <w:tc>
+          <w:tcPr/>
+          <w:p>
+            <w:pPr>
+              <w:pStyle w:val="Compact"/>
+              <w:jc w:val="left"/>
+            </w:pPr>
+            <w:r>
+              <w:t xml:space="preserve">-0.184***</w:t>
+            </w:r>
+          </w:p>
+        </w:tc>
+        <w:tc>
+          <w:tcPr/>
+          <w:p>
+            <w:pPr>
+              <w:pStyle w:val="Compact"/>
+              <w:jc w:val="left"/>
+            </w:pPr>
+            <w:r>
+              <w:t xml:space="preserve">-0.130***</w:t>
+            </w:r>
+          </w:p>
+        </w:tc>
+        <w:tc>
+          <w:tcPr/>
+          <w:p>
+            <w:pPr>
+              <w:pStyle w:val="Compact"/>
+              <w:jc w:val="left"/>
+            </w:pPr>
+            <w:r>
+              <w:t xml:space="preserve">-0.171***</w:t>
             </w:r>
           </w:p>
         </w:tc>
@@ -6703,7 +6796,7 @@
               <w:jc w:val="left"/>
             </w:pPr>
             <w:r>
-              <w:t xml:space="preserve">+0.017***</w:t>
+              <w:t xml:space="preserve">+0.018***</w:t>
             </w:r>
           </w:p>
         </w:tc>
@@ -6727,18 +6820,6 @@
               <w:jc w:val="left"/>
             </w:pPr>
             <w:r>
-              <w:t xml:space="preserve">+0.017***</w:t>
-            </w:r>
-          </w:p>
-        </w:tc>
-        <w:tc>
-          <w:tcPr/>
-          <w:p>
-            <w:pPr>
-              <w:pStyle w:val="Compact"/>
-              <w:jc w:val="left"/>
-            </w:pPr>
-            <w:r>
               <w:t xml:space="preserve">+0.016***</w:t>
             </w:r>
           </w:p>
@@ -6751,7 +6832,19 @@
               <w:jc w:val="left"/>
             </w:pPr>
             <w:r>
-              <w:t xml:space="preserve">+0.017***</w:t>
+              <w:t xml:space="preserve">+0.016***</w:t>
+            </w:r>
+          </w:p>
+        </w:tc>
+        <w:tc>
+          <w:tcPr/>
+          <w:p>
+            <w:pPr>
+              <w:pStyle w:val="Compact"/>
+              <w:jc w:val="left"/>
+            </w:pPr>
+            <w:r>
+              <w:t xml:space="preserve">+0.016***</w:t>
             </w:r>
           </w:p>
         </w:tc>
@@ -6801,79 +6894,79 @@
               <w:jc w:val="left"/>
             </w:pPr>
             <w:r>
-              <w:t xml:space="preserve">+0.407***</w:t>
-            </w:r>
-          </w:p>
-        </w:tc>
-        <w:tc>
-          <w:tcPr/>
-          <w:p>
-            <w:pPr>
-              <w:pStyle w:val="Compact"/>
-              <w:jc w:val="left"/>
-            </w:pPr>
-            <w:r>
-              <w:t xml:space="preserve">+0.307***</w:t>
-            </w:r>
-          </w:p>
-        </w:tc>
-        <w:tc>
-          <w:tcPr/>
-          <w:p>
-            <w:pPr>
-              <w:pStyle w:val="Compact"/>
-              <w:jc w:val="left"/>
-            </w:pPr>
-            <w:r>
-              <w:t xml:space="preserve">+0.293***</w:t>
-            </w:r>
-          </w:p>
-        </w:tc>
-        <w:tc>
-          <w:tcPr/>
-          <w:p>
-            <w:pPr>
-              <w:pStyle w:val="Compact"/>
-              <w:jc w:val="left"/>
-            </w:pPr>
-            <w:r>
-              <w:t xml:space="preserve">+0.307***</w:t>
-            </w:r>
-          </w:p>
-        </w:tc>
-        <w:tc>
-          <w:tcPr/>
-          <w:p>
-            <w:pPr>
-              <w:pStyle w:val="Compact"/>
-              <w:jc w:val="left"/>
-            </w:pPr>
-            <w:r>
-              <w:t xml:space="preserve">+0.294**</w:t>
-            </w:r>
-          </w:p>
-        </w:tc>
-        <w:tc>
-          <w:tcPr/>
-          <w:p>
-            <w:pPr>
-              <w:pStyle w:val="Compact"/>
-              <w:jc w:val="left"/>
-            </w:pPr>
-            <w:r>
-              <w:t xml:space="preserve">+0.298***</w:t>
-            </w:r>
-          </w:p>
-        </w:tc>
-        <w:tc>
-          <w:tcPr/>
-          <w:p>
-            <w:pPr>
-              <w:pStyle w:val="Compact"/>
-              <w:jc w:val="left"/>
-            </w:pPr>
-            <w:r>
-              <w:t xml:space="preserve">+0.284**</w:t>
+              <w:t xml:space="preserve">+0.443***</w:t>
+            </w:r>
+          </w:p>
+        </w:tc>
+        <w:tc>
+          <w:tcPr/>
+          <w:p>
+            <w:pPr>
+              <w:pStyle w:val="Compact"/>
+              <w:jc w:val="left"/>
+            </w:pPr>
+            <w:r>
+              <w:t xml:space="preserve">+0.330***</w:t>
+            </w:r>
+          </w:p>
+        </w:tc>
+        <w:tc>
+          <w:tcPr/>
+          <w:p>
+            <w:pPr>
+              <w:pStyle w:val="Compact"/>
+              <w:jc w:val="left"/>
+            </w:pPr>
+            <w:r>
+              <w:t xml:space="preserve">+0.319***</w:t>
+            </w:r>
+          </w:p>
+        </w:tc>
+        <w:tc>
+          <w:tcPr/>
+          <w:p>
+            <w:pPr>
+              <w:pStyle w:val="Compact"/>
+              <w:jc w:val="left"/>
+            </w:pPr>
+            <w:r>
+              <w:t xml:space="preserve">+0.327***</w:t>
+            </w:r>
+          </w:p>
+        </w:tc>
+        <w:tc>
+          <w:tcPr/>
+          <w:p>
+            <w:pPr>
+              <w:pStyle w:val="Compact"/>
+              <w:jc w:val="left"/>
+            </w:pPr>
+            <w:r>
+              <w:t xml:space="preserve">+0.315***</w:t>
+            </w:r>
+          </w:p>
+        </w:tc>
+        <w:tc>
+          <w:tcPr/>
+          <w:p>
+            <w:pPr>
+              <w:pStyle w:val="Compact"/>
+              <w:jc w:val="left"/>
+            </w:pPr>
+            <w:r>
+              <w:t xml:space="preserve">+0.316***</w:t>
+            </w:r>
+          </w:p>
+        </w:tc>
+        <w:tc>
+          <w:tcPr/>
+          <w:p>
+            <w:pPr>
+              <w:pStyle w:val="Compact"/>
+              <w:jc w:val="left"/>
+            </w:pPr>
+            <w:r>
+              <w:t xml:space="preserve">+0.304***</w:t>
             </w:r>
           </w:p>
         </w:tc>
@@ -6997,79 +7090,79 @@
               <w:jc w:val="left"/>
             </w:pPr>
             <w:r>
-              <w:t xml:space="preserve">+10.958***</w:t>
-            </w:r>
-          </w:p>
-        </w:tc>
-        <w:tc>
-          <w:tcPr/>
-          <w:p>
-            <w:pPr>
-              <w:pStyle w:val="Compact"/>
-              <w:jc w:val="left"/>
-            </w:pPr>
-            <w:r>
-              <w:t xml:space="preserve">+11.157***</w:t>
-            </w:r>
-          </w:p>
-        </w:tc>
-        <w:tc>
-          <w:tcPr/>
-          <w:p>
-            <w:pPr>
-              <w:pStyle w:val="Compact"/>
-              <w:jc w:val="left"/>
-            </w:pPr>
-            <w:r>
-              <w:t xml:space="preserve">+11.345***</w:t>
-            </w:r>
-          </w:p>
-        </w:tc>
-        <w:tc>
-          <w:tcPr/>
-          <w:p>
-            <w:pPr>
-              <w:pStyle w:val="Compact"/>
-              <w:jc w:val="left"/>
-            </w:pPr>
-            <w:r>
-              <w:t xml:space="preserve">+11.199***</w:t>
-            </w:r>
-          </w:p>
-        </w:tc>
-        <w:tc>
-          <w:tcPr/>
-          <w:p>
-            <w:pPr>
-              <w:pStyle w:val="Compact"/>
-              <w:jc w:val="left"/>
-            </w:pPr>
-            <w:r>
-              <w:t xml:space="preserve">+11.361***</w:t>
-            </w:r>
-          </w:p>
-        </w:tc>
-        <w:tc>
-          <w:tcPr/>
-          <w:p>
-            <w:pPr>
-              <w:pStyle w:val="Compact"/>
-              <w:jc w:val="left"/>
-            </w:pPr>
-            <w:r>
-              <w:t xml:space="preserve">+11.190***</w:t>
-            </w:r>
-          </w:p>
-        </w:tc>
-        <w:tc>
-          <w:tcPr/>
-          <w:p>
-            <w:pPr>
-              <w:pStyle w:val="Compact"/>
-              <w:jc w:val="left"/>
-            </w:pPr>
-            <w:r>
-              <w:t xml:space="preserve">+11.353***</w:t>
+              <w:t xml:space="preserve">+11.433***</w:t>
+            </w:r>
+          </w:p>
+        </w:tc>
+        <w:tc>
+          <w:tcPr/>
+          <w:p>
+            <w:pPr>
+              <w:pStyle w:val="Compact"/>
+              <w:jc w:val="left"/>
+            </w:pPr>
+            <w:r>
+              <w:t xml:space="preserve">+11.537***</w:t>
+            </w:r>
+          </w:p>
+        </w:tc>
+        <w:tc>
+          <w:tcPr/>
+          <w:p>
+            <w:pPr>
+              <w:pStyle w:val="Compact"/>
+              <w:jc w:val="left"/>
+            </w:pPr>
+            <w:r>
+              <w:t xml:space="preserve">+11.656***</w:t>
+            </w:r>
+          </w:p>
+        </w:tc>
+        <w:tc>
+          <w:tcPr/>
+          <w:p>
+            <w:pPr>
+              <w:pStyle w:val="Compact"/>
+              <w:jc w:val="left"/>
+            </w:pPr>
+            <w:r>
+              <w:t xml:space="preserve">+11.558***</w:t>
+            </w:r>
+          </w:p>
+        </w:tc>
+        <w:tc>
+          <w:tcPr/>
+          <w:p>
+            <w:pPr>
+              <w:pStyle w:val="Compact"/>
+              <w:jc w:val="left"/>
+            </w:pPr>
+            <w:r>
+              <w:t xml:space="preserve">+11.664***</w:t>
+            </w:r>
+          </w:p>
+        </w:tc>
+        <w:tc>
+          <w:tcPr/>
+          <w:p>
+            <w:pPr>
+              <w:pStyle w:val="Compact"/>
+              <w:jc w:val="left"/>
+            </w:pPr>
+            <w:r>
+              <w:t xml:space="preserve">+11.550***</w:t>
+            </w:r>
+          </w:p>
+        </w:tc>
+        <w:tc>
+          <w:tcPr/>
+          <w:p>
+            <w:pPr>
+              <w:pStyle w:val="Compact"/>
+              <w:jc w:val="left"/>
+            </w:pPr>
+            <w:r>
+              <w:t xml:space="preserve">+11.655***</w:t>
             </w:r>
           </w:p>
         </w:tc>
@@ -7193,31 +7286,31 @@
               <w:jc w:val="left"/>
             </w:pPr>
             <w:r>
-              <w:t xml:space="preserve">0.122</w:t>
-            </w:r>
-          </w:p>
-        </w:tc>
-        <w:tc>
-          <w:tcPr/>
-          <w:p>
-            <w:pPr>
-              <w:pStyle w:val="Compact"/>
-              <w:jc w:val="left"/>
-            </w:pPr>
-            <w:r>
-              <w:t xml:space="preserve">0.178</w:t>
-            </w:r>
-          </w:p>
-        </w:tc>
-        <w:tc>
-          <w:tcPr/>
-          <w:p>
-            <w:pPr>
-              <w:pStyle w:val="Compact"/>
-              <w:jc w:val="left"/>
-            </w:pPr>
-            <w:r>
-              <w:t xml:space="preserve">0.199</w:t>
+              <w:t xml:space="preserve">0.104</w:t>
+            </w:r>
+          </w:p>
+        </w:tc>
+        <w:tc>
+          <w:tcPr/>
+          <w:p>
+            <w:pPr>
+              <w:pStyle w:val="Compact"/>
+              <w:jc w:val="left"/>
+            </w:pPr>
+            <w:r>
+              <w:t xml:space="preserve">0.175</w:t>
+            </w:r>
+          </w:p>
+        </w:tc>
+        <w:tc>
+          <w:tcPr/>
+          <w:p>
+            <w:pPr>
+              <w:pStyle w:val="Compact"/>
+              <w:jc w:val="left"/>
+            </w:pPr>
+            <w:r>
+              <w:t xml:space="preserve">0.197</w:t>
             </w:r>
           </w:p>
         </w:tc>
@@ -7241,19 +7334,19 @@
               <w:jc w:val="left"/>
             </w:pPr>
             <w:r>
-              <w:t xml:space="preserve">0.202</w:t>
-            </w:r>
-          </w:p>
-        </w:tc>
-        <w:tc>
-          <w:tcPr/>
-          <w:p>
-            <w:pPr>
-              <w:pStyle w:val="Compact"/>
-              <w:jc w:val="left"/>
-            </w:pPr>
-            <w:r>
-              <w:t xml:space="preserve">0.193</w:t>
+              <w:t xml:space="preserve">0.201</w:t>
+            </w:r>
+          </w:p>
+        </w:tc>
+        <w:tc>
+          <w:tcPr/>
+          <w:p>
+            <w:pPr>
+              <w:pStyle w:val="Compact"/>
+              <w:jc w:val="left"/>
+            </w:pPr>
+            <w:r>
+              <w:t xml:space="preserve">0.194</w:t>
             </w:r>
           </w:p>
         </w:tc>
@@ -7291,19 +7384,43 @@
               <w:jc w:val="left"/>
             </w:pPr>
             <w:r>
-              <w:t xml:space="preserve">0.115</w:t>
-            </w:r>
-          </w:p>
-        </w:tc>
-        <w:tc>
-          <w:tcPr/>
-          <w:p>
-            <w:pPr>
-              <w:pStyle w:val="Compact"/>
-              <w:jc w:val="left"/>
-            </w:pPr>
-            <w:r>
-              <w:t xml:space="preserve">0.168</w:t>
+              <w:t xml:space="preserve">0.096</w:t>
+            </w:r>
+          </w:p>
+        </w:tc>
+        <w:tc>
+          <w:tcPr/>
+          <w:p>
+            <w:pPr>
+              <w:pStyle w:val="Compact"/>
+              <w:jc w:val="left"/>
+            </w:pPr>
+            <w:r>
+              <w:t xml:space="preserve">0.166</w:t>
+            </w:r>
+          </w:p>
+        </w:tc>
+        <w:tc>
+          <w:tcPr/>
+          <w:p>
+            <w:pPr>
+              <w:pStyle w:val="Compact"/>
+              <w:jc w:val="left"/>
+            </w:pPr>
+            <w:r>
+              <w:t xml:space="preserve">0.186</w:t>
+            </w:r>
+          </w:p>
+        </w:tc>
+        <w:tc>
+          <w:tcPr/>
+          <w:p>
+            <w:pPr>
+              <w:pStyle w:val="Compact"/>
+              <w:jc w:val="left"/>
+            </w:pPr>
+            <w:r>
+              <w:t xml:space="preserve">0.173</w:t>
             </w:r>
           </w:p>
         </w:tc>
@@ -7327,31 +7444,7 @@
               <w:jc w:val="left"/>
             </w:pPr>
             <w:r>
-              <w:t xml:space="preserve">0.174</w:t>
-            </w:r>
-          </w:p>
-        </w:tc>
-        <w:tc>
-          <w:tcPr/>
-          <w:p>
-            <w:pPr>
-              <w:pStyle w:val="Compact"/>
-              <w:jc w:val="left"/>
-            </w:pPr>
-            <w:r>
-              <w:t xml:space="preserve">0.190</w:t>
-            </w:r>
-          </w:p>
-        </w:tc>
-        <w:tc>
-          <w:tcPr/>
-          <w:p>
-            <w:pPr>
-              <w:pStyle w:val="Compact"/>
-              <w:jc w:val="left"/>
-            </w:pPr>
-            <w:r>
-              <w:t xml:space="preserve">0.180</w:t>
+              <w:t xml:space="preserve">0.181</w:t>
             </w:r>
           </w:p>
         </w:tc>
@@ -7506,7 +7599,7 @@
         <w:t xml:space="preserve"> </w:t>
       </w:r>
       <w:r>
-        <w:t xml:space="preserve">term is small and not statistically significant (β = 0.019, p = .705),</w:t>
+        <w:t xml:space="preserve">term is small and not statistically significant (β = 0.039, p = .419),</w:t>
       </w:r>
       <w:r>
         <w:t xml:space="preserve"> </w:t>
@@ -7518,19 +7611,19 @@
         <w:t xml:space="preserve"> </w:t>
       </w:r>
       <w:r>
-        <w:t xml:space="preserve">conventional significance (β = −1.177, p = .083), and the quadratic</w:t>
-      </w:r>
-      <w:r>
-        <w:t xml:space="preserve"> </w:t>
-      </w:r>
-      <w:r>
-        <w:t xml:space="preserve">interaction term is positive and statistically significant (β = 3.119,</w:t>
-      </w:r>
-      <w:r>
-        <w:t xml:space="preserve"> </w:t>
-      </w:r>
-      <w:r>
-        <w:t xml:space="preserve">SE = 1.124, p = .005). Model M8 also produces the highest explanatory</w:t>
+        <w:t xml:space="preserve">conventional significance (β = −1.018, p = .190), and the quadratic</w:t>
+      </w:r>
+      <w:r>
+        <w:t xml:space="preserve"> </w:t>
+      </w:r>
+      <w:r>
+        <w:t xml:space="preserve">interaction term is positive and statistically significant (β = 3.220,</w:t>
+      </w:r>
+      <w:r>
+        <w:t xml:space="preserve"> </w:t>
+      </w:r>
+      <w:r>
+        <w:t xml:space="preserve">SE = 1.384, p = .020). Model M8 also produces the highest explanatory</w:t>
       </w:r>
       <w:r>
         <w:t xml:space="preserve"> </w:t>
@@ -7638,16 +7731,16 @@
     <w:tbl>
       <w:tblPr>
         <w:tblStyle w:val="Table"/>
-        <w:tblW w:type="auto" w:w="0"/>
+        <w:tblW w:type="pct" w:w="5000"/>
         <w:tblLook w:firstRow="1" w:lastRow="0" w:firstColumn="0" w:lastColumn="0" w:noHBand="0" w:noVBand="0" w:val="0020"/>
         <w:jc w:val="start"/>
       </w:tblPr>
       <w:tblGrid>
-        <w:gridCol w:w="1584"/>
-        <w:gridCol w:w="1584"/>
-        <w:gridCol w:w="1584"/>
-        <w:gridCol w:w="1584"/>
-        <w:gridCol w:w="1584"/>
+        <w:gridCol w:w="2099"/>
+        <w:gridCol w:w="2290"/>
+        <w:gridCol w:w="667"/>
+        <w:gridCol w:w="954"/>
+        <w:gridCol w:w="1908"/>
       </w:tblGrid>
       <w:tr>
         <w:trPr>
@@ -7735,43 +7828,43 @@
               <w:jc w:val="left"/>
             </w:pPr>
             <w:r>
-              <w:t xml:space="preserve">+0.080</w:t>
-            </w:r>
-          </w:p>
-        </w:tc>
-        <w:tc>
-          <w:tcPr/>
-          <w:p>
-            <w:pPr>
-              <w:pStyle w:val="Compact"/>
-              <w:jc w:val="left"/>
-            </w:pPr>
-            <w:r>
-              <w:t xml:space="preserve">0.040</w:t>
-            </w:r>
-          </w:p>
-        </w:tc>
-        <w:tc>
-          <w:tcPr/>
-          <w:p>
-            <w:pPr>
-              <w:pStyle w:val="Compact"/>
-              <w:jc w:val="left"/>
-            </w:pPr>
-            <w:r>
-              <w:t xml:space="preserve">.045*</w:t>
-            </w:r>
-          </w:p>
-        </w:tc>
-        <w:tc>
-          <w:tcPr/>
-          <w:p>
-            <w:pPr>
-              <w:pStyle w:val="Compact"/>
-              <w:jc w:val="left"/>
-            </w:pPr>
-            <w:r>
-              <w:t xml:space="preserve">[+0.002, +0.158]</w:t>
+              <w:t xml:space="preserve">+0.094</w:t>
+            </w:r>
+          </w:p>
+        </w:tc>
+        <w:tc>
+          <w:tcPr/>
+          <w:p>
+            <w:pPr>
+              <w:pStyle w:val="Compact"/>
+              <w:jc w:val="left"/>
+            </w:pPr>
+            <w:r>
+              <w:t xml:space="preserve">0.041</w:t>
+            </w:r>
+          </w:p>
+        </w:tc>
+        <w:tc>
+          <w:tcPr/>
+          <w:p>
+            <w:pPr>
+              <w:pStyle w:val="Compact"/>
+              <w:jc w:val="left"/>
+            </w:pPr>
+            <w:r>
+              <w:t xml:space="preserve">.021*</w:t>
+            </w:r>
+          </w:p>
+        </w:tc>
+        <w:tc>
+          <w:tcPr/>
+          <w:p>
+            <w:pPr>
+              <w:pStyle w:val="Compact"/>
+              <w:jc w:val="left"/>
+            </w:pPr>
+            <w:r>
+              <w:t xml:space="preserve">[+0.014, +0.173]</w:t>
             </w:r>
           </w:p>
         </w:tc>
@@ -7797,43 +7890,43 @@
               <w:jc w:val="left"/>
             </w:pPr>
             <w:r>
-              <w:t xml:space="preserve">+0.015</w:t>
-            </w:r>
-          </w:p>
-        </w:tc>
-        <w:tc>
-          <w:tcPr/>
-          <w:p>
-            <w:pPr>
-              <w:pStyle w:val="Compact"/>
-              <w:jc w:val="left"/>
-            </w:pPr>
-            <w:r>
-              <w:t xml:space="preserve">0.047</w:t>
-            </w:r>
-          </w:p>
-        </w:tc>
-        <w:tc>
-          <w:tcPr/>
-          <w:p>
-            <w:pPr>
-              <w:pStyle w:val="Compact"/>
-              <w:jc w:val="left"/>
-            </w:pPr>
-            <w:r>
-              <w:t xml:space="preserve">.752</w:t>
-            </w:r>
-          </w:p>
-        </w:tc>
-        <w:tc>
-          <w:tcPr/>
-          <w:p>
-            <w:pPr>
-              <w:pStyle w:val="Compact"/>
-              <w:jc w:val="left"/>
-            </w:pPr>
-            <w:r>
-              <w:t xml:space="preserve">[-0.077, +0.106]</w:t>
+              <w:t xml:space="preserve">+0.036</w:t>
+            </w:r>
+          </w:p>
+        </w:tc>
+        <w:tc>
+          <w:tcPr/>
+          <w:p>
+            <w:pPr>
+              <w:pStyle w:val="Compact"/>
+              <w:jc w:val="left"/>
+            </w:pPr>
+            <w:r>
+              <w:t xml:space="preserve">0.050</w:t>
+            </w:r>
+          </w:p>
+        </w:tc>
+        <w:tc>
+          <w:tcPr/>
+          <w:p>
+            <w:pPr>
+              <w:pStyle w:val="Compact"/>
+              <w:jc w:val="left"/>
+            </w:pPr>
+            <w:r>
+              <w:t xml:space="preserve">.476</w:t>
+            </w:r>
+          </w:p>
+        </w:tc>
+        <w:tc>
+          <w:tcPr/>
+          <w:p>
+            <w:pPr>
+              <w:pStyle w:val="Compact"/>
+              <w:jc w:val="left"/>
+            </w:pPr>
+            <w:r>
+              <w:t xml:space="preserve">[-0.063, +0.134]</w:t>
             </w:r>
           </w:p>
         </w:tc>
@@ -7859,43 +7952,43 @@
               <w:jc w:val="left"/>
             </w:pPr>
             <w:r>
-              <w:t xml:space="preserve">-0.035</w:t>
-            </w:r>
-          </w:p>
-        </w:tc>
-        <w:tc>
-          <w:tcPr/>
-          <w:p>
-            <w:pPr>
-              <w:pStyle w:val="Compact"/>
-              <w:jc w:val="left"/>
-            </w:pPr>
-            <w:r>
-              <w:t xml:space="preserve">0.069</w:t>
-            </w:r>
-          </w:p>
-        </w:tc>
-        <w:tc>
-          <w:tcPr/>
-          <w:p>
-            <w:pPr>
-              <w:pStyle w:val="Compact"/>
-              <w:jc w:val="left"/>
-            </w:pPr>
-            <w:r>
-              <w:t xml:space="preserve">.616</w:t>
-            </w:r>
-          </w:p>
-        </w:tc>
-        <w:tc>
-          <w:tcPr/>
-          <w:p>
-            <w:pPr>
-              <w:pStyle w:val="Compact"/>
-              <w:jc w:val="left"/>
-            </w:pPr>
-            <w:r>
-              <w:t xml:space="preserve">[-0.170, +0.101]</w:t>
+              <w:t xml:space="preserve">-0.006</w:t>
+            </w:r>
+          </w:p>
+        </w:tc>
+        <w:tc>
+          <w:tcPr/>
+          <w:p>
+            <w:pPr>
+              <w:pStyle w:val="Compact"/>
+              <w:jc w:val="left"/>
+            </w:pPr>
+            <w:r>
+              <w:t xml:space="preserve">0.077</w:t>
+            </w:r>
+          </w:p>
+        </w:tc>
+        <w:tc>
+          <w:tcPr/>
+          <w:p>
+            <w:pPr>
+              <w:pStyle w:val="Compact"/>
+              <w:jc w:val="left"/>
+            </w:pPr>
+            <w:r>
+              <w:t xml:space="preserve">.938</w:t>
+            </w:r>
+          </w:p>
+        </w:tc>
+        <w:tc>
+          <w:tcPr/>
+          <w:p>
+            <w:pPr>
+              <w:pStyle w:val="Compact"/>
+              <w:jc w:val="left"/>
+            </w:pPr>
+            <w:r>
+              <w:t xml:space="preserve">[-0.157, +0.145]</w:t>
             </w:r>
           </w:p>
         </w:tc>
@@ -7921,43 +8014,43 @@
               <w:jc w:val="left"/>
             </w:pPr>
             <w:r>
-              <w:t xml:space="preserve">-0.069</w:t>
-            </w:r>
-          </w:p>
-        </w:tc>
-        <w:tc>
-          <w:tcPr/>
-          <w:p>
-            <w:pPr>
-              <w:pStyle w:val="Compact"/>
-              <w:jc w:val="left"/>
-            </w:pPr>
-            <w:r>
-              <w:t xml:space="preserve">0.093</w:t>
-            </w:r>
-          </w:p>
-        </w:tc>
-        <w:tc>
-          <w:tcPr/>
-          <w:p>
-            <w:pPr>
-              <w:pStyle w:val="Compact"/>
-              <w:jc w:val="left"/>
-            </w:pPr>
-            <w:r>
-              <w:t xml:space="preserve">.459</w:t>
-            </w:r>
-          </w:p>
-        </w:tc>
-        <w:tc>
-          <w:tcPr/>
-          <w:p>
-            <w:pPr>
-              <w:pStyle w:val="Compact"/>
-              <w:jc w:val="left"/>
-            </w:pPr>
-            <w:r>
-              <w:t xml:space="preserve">[-0.250, +0.113]</w:t>
+              <w:t xml:space="preserve">-0.032</w:t>
+            </w:r>
+          </w:p>
+        </w:tc>
+        <w:tc>
+          <w:tcPr/>
+          <w:p>
+            <w:pPr>
+              <w:pStyle w:val="Compact"/>
+              <w:jc w:val="left"/>
+            </w:pPr>
+            <w:r>
+              <w:t xml:space="preserve">0.104</w:t>
+            </w:r>
+          </w:p>
+        </w:tc>
+        <w:tc>
+          <w:tcPr/>
+          <w:p>
+            <w:pPr>
+              <w:pStyle w:val="Compact"/>
+              <w:jc w:val="left"/>
+            </w:pPr>
+            <w:r>
+              <w:t xml:space="preserve">.761</w:t>
+            </w:r>
+          </w:p>
+        </w:tc>
+        <w:tc>
+          <w:tcPr/>
+          <w:p>
+            <w:pPr>
+              <w:pStyle w:val="Compact"/>
+              <w:jc w:val="left"/>
+            </w:pPr>
+            <w:r>
+              <w:t xml:space="preserve">[-0.235, +0.172]</w:t>
             </w:r>
           </w:p>
         </w:tc>
@@ -7983,43 +8076,43 @@
               <w:jc w:val="left"/>
             </w:pPr>
             <w:r>
-              <w:t xml:space="preserve">-0.087</w:t>
-            </w:r>
-          </w:p>
-        </w:tc>
-        <w:tc>
-          <w:tcPr/>
-          <w:p>
-            <w:pPr>
-              <w:pStyle w:val="Compact"/>
-              <w:jc w:val="left"/>
-            </w:pPr>
-            <w:r>
-              <w:t xml:space="preserve">0.113</w:t>
-            </w:r>
-          </w:p>
-        </w:tc>
-        <w:tc>
-          <w:tcPr/>
-          <w:p>
-            <w:pPr>
-              <w:pStyle w:val="Compact"/>
-              <w:jc w:val="left"/>
-            </w:pPr>
-            <w:r>
-              <w:t xml:space="preserve">.444</w:t>
-            </w:r>
-          </w:p>
-        </w:tc>
-        <w:tc>
-          <w:tcPr/>
-          <w:p>
-            <w:pPr>
-              <w:pStyle w:val="Compact"/>
-              <w:jc w:val="left"/>
-            </w:pPr>
-            <w:r>
-              <w:t xml:space="preserve">[-0.309, +0.135]</w:t>
+              <w:t xml:space="preserve">-0.041</w:t>
+            </w:r>
+          </w:p>
+        </w:tc>
+        <w:tc>
+          <w:tcPr/>
+          <w:p>
+            <w:pPr>
+              <w:pStyle w:val="Compact"/>
+              <w:jc w:val="left"/>
+            </w:pPr>
+            <w:r>
+              <w:t xml:space="preserve">0.127</w:t>
+            </w:r>
+          </w:p>
+        </w:tc>
+        <w:tc>
+          <w:tcPr/>
+          <w:p>
+            <w:pPr>
+              <w:pStyle w:val="Compact"/>
+              <w:jc w:val="left"/>
+            </w:pPr>
+            <w:r>
+              <w:t xml:space="preserve">.747</w:t>
+            </w:r>
+          </w:p>
+        </w:tc>
+        <w:tc>
+          <w:tcPr/>
+          <w:p>
+            <w:pPr>
+              <w:pStyle w:val="Compact"/>
+              <w:jc w:val="left"/>
+            </w:pPr>
+            <w:r>
+              <w:t xml:space="preserve">[-0.291, +0.209]</w:t>
             </w:r>
           </w:p>
         </w:tc>
@@ -8045,43 +8138,43 @@
               <w:jc w:val="left"/>
             </w:pPr>
             <w:r>
-              <w:t xml:space="preserve">-0.077</w:t>
-            </w:r>
-          </w:p>
-        </w:tc>
-        <w:tc>
-          <w:tcPr/>
-          <w:p>
-            <w:pPr>
-              <w:pStyle w:val="Compact"/>
-              <w:jc w:val="left"/>
-            </w:pPr>
-            <w:r>
-              <w:t xml:space="preserve">0.145</w:t>
-            </w:r>
-          </w:p>
-        </w:tc>
-        <w:tc>
-          <w:tcPr/>
-          <w:p>
-            <w:pPr>
-              <w:pStyle w:val="Compact"/>
-              <w:jc w:val="left"/>
-            </w:pPr>
-            <w:r>
-              <w:t xml:space="preserve">.598</w:t>
-            </w:r>
-          </w:p>
-        </w:tc>
-        <w:tc>
-          <w:tcPr/>
-          <w:p>
-            <w:pPr>
-              <w:pStyle w:val="Compact"/>
-              <w:jc w:val="left"/>
-            </w:pPr>
-            <w:r>
-              <w:t xml:space="preserve">[-0.361, +0.208]</w:t>
+              <w:t xml:space="preserve">-0.012</w:t>
+            </w:r>
+          </w:p>
+        </w:tc>
+        <w:tc>
+          <w:tcPr/>
+          <w:p>
+            <w:pPr>
+              <w:pStyle w:val="Compact"/>
+              <w:jc w:val="left"/>
+            </w:pPr>
+            <w:r>
+              <w:t xml:space="preserve">0.164</w:t>
+            </w:r>
+          </w:p>
+        </w:tc>
+        <w:tc>
+          <w:tcPr/>
+          <w:p>
+            <w:pPr>
+              <w:pStyle w:val="Compact"/>
+              <w:jc w:val="left"/>
+            </w:pPr>
+            <w:r>
+              <w:t xml:space="preserve">.942</w:t>
+            </w:r>
+          </w:p>
+        </w:tc>
+        <w:tc>
+          <w:tcPr/>
+          <w:p>
+            <w:pPr>
+              <w:pStyle w:val="Compact"/>
+              <w:jc w:val="left"/>
+            </w:pPr>
+            <w:r>
+              <w:t xml:space="preserve">[-0.332, +0.309]</w:t>
             </w:r>
           </w:p>
         </w:tc>
@@ -8107,43 +8200,43 @@
               <w:jc w:val="left"/>
             </w:pPr>
             <w:r>
-              <w:t xml:space="preserve">+0.131</w:t>
-            </w:r>
-          </w:p>
-        </w:tc>
-        <w:tc>
-          <w:tcPr/>
-          <w:p>
-            <w:pPr>
-              <w:pStyle w:val="Compact"/>
-              <w:jc w:val="left"/>
-            </w:pPr>
-            <w:r>
-              <w:t xml:space="preserve">0.186</w:t>
-            </w:r>
-          </w:p>
-        </w:tc>
-        <w:tc>
-          <w:tcPr/>
-          <w:p>
-            <w:pPr>
-              <w:pStyle w:val="Compact"/>
-              <w:jc w:val="left"/>
-            </w:pPr>
-            <w:r>
-              <w:t xml:space="preserve">.481</w:t>
-            </w:r>
-          </w:p>
-        </w:tc>
-        <w:tc>
-          <w:tcPr/>
-          <w:p>
-            <w:pPr>
-              <w:pStyle w:val="Compact"/>
-              <w:jc w:val="left"/>
-            </w:pPr>
-            <w:r>
-              <w:t xml:space="preserve">[-0.234, +0.496]</w:t>
+              <w:t xml:space="preserve">+0.240</w:t>
+            </w:r>
+          </w:p>
+        </w:tc>
+        <w:tc>
+          <w:tcPr/>
+          <w:p>
+            <w:pPr>
+              <w:pStyle w:val="Compact"/>
+              <w:jc w:val="left"/>
+            </w:pPr>
+            <w:r>
+              <w:t xml:space="preserve">0.220</w:t>
+            </w:r>
+          </w:p>
+        </w:tc>
+        <w:tc>
+          <w:tcPr/>
+          <w:p>
+            <w:pPr>
+              <w:pStyle w:val="Compact"/>
+              <w:jc w:val="left"/>
+            </w:pPr>
+            <w:r>
+              <w:t xml:space="preserve">.276</w:t>
+            </w:r>
+          </w:p>
+        </w:tc>
+        <w:tc>
+          <w:tcPr/>
+          <w:p>
+            <w:pPr>
+              <w:pStyle w:val="Compact"/>
+              <w:jc w:val="left"/>
+            </w:pPr>
+            <w:r>
+              <w:t xml:space="preserve">[-0.192, +0.671]</w:t>
             </w:r>
           </w:p>
         </w:tc>
@@ -8169,43 +8262,43 @@
               <w:jc w:val="left"/>
             </w:pPr>
             <w:r>
-              <w:t xml:space="preserve">+0.660</w:t>
-            </w:r>
-          </w:p>
-        </w:tc>
-        <w:tc>
-          <w:tcPr/>
-          <w:p>
-            <w:pPr>
-              <w:pStyle w:val="Compact"/>
-              <w:jc w:val="left"/>
-            </w:pPr>
-            <w:r>
-              <w:t xml:space="preserve">0.295</w:t>
-            </w:r>
-          </w:p>
-        </w:tc>
-        <w:tc>
-          <w:tcPr/>
-          <w:p>
-            <w:pPr>
-              <w:pStyle w:val="Compact"/>
-              <w:jc w:val="left"/>
-            </w:pPr>
-            <w:r>
-              <w:t xml:space="preserve">.025*</w:t>
-            </w:r>
-          </w:p>
-        </w:tc>
-        <w:tc>
-          <w:tcPr/>
-          <w:p>
-            <w:pPr>
-              <w:pStyle w:val="Compact"/>
-              <w:jc w:val="left"/>
-            </w:pPr>
-            <w:r>
-              <w:t xml:space="preserve">[+0.082, +1.238]</w:t>
+              <w:t xml:space="preserve">+0.749</w:t>
+            </w:r>
+          </w:p>
+        </w:tc>
+        <w:tc>
+          <w:tcPr/>
+          <w:p>
+            <w:pPr>
+              <w:pStyle w:val="Compact"/>
+              <w:jc w:val="left"/>
+            </w:pPr>
+            <w:r>
+              <w:t xml:space="preserve">0.342</w:t>
+            </w:r>
+          </w:p>
+        </w:tc>
+        <w:tc>
+          <w:tcPr/>
+          <w:p>
+            <w:pPr>
+              <w:pStyle w:val="Compact"/>
+              <w:jc w:val="left"/>
+            </w:pPr>
+            <w:r>
+              <w:t xml:space="preserve">.029*</w:t>
+            </w:r>
+          </w:p>
+        </w:tc>
+        <w:tc>
+          <w:tcPr/>
+          <w:p>
+            <w:pPr>
+              <w:pStyle w:val="Compact"/>
+              <w:jc w:val="left"/>
+            </w:pPr>
+            <w:r>
+              <w:t xml:space="preserve">[+0.079, +1.420]</w:t>
             </w:r>
           </w:p>
         </w:tc>
@@ -8231,43 +8324,43 @@
               <w:jc w:val="left"/>
             </w:pPr>
             <w:r>
-              <w:t xml:space="preserve">+1.818</w:t>
-            </w:r>
-          </w:p>
-        </w:tc>
-        <w:tc>
-          <w:tcPr/>
-          <w:p>
-            <w:pPr>
-              <w:pStyle w:val="Compact"/>
-              <w:jc w:val="left"/>
-            </w:pPr>
-            <w:r>
-              <w:t xml:space="preserve">0.592</w:t>
-            </w:r>
-          </w:p>
-        </w:tc>
-        <w:tc>
-          <w:tcPr/>
-          <w:p>
-            <w:pPr>
-              <w:pStyle w:val="Compact"/>
-              <w:jc w:val="left"/>
-            </w:pPr>
-            <w:r>
-              <w:t xml:space="preserve">.002**</w:t>
-            </w:r>
-          </w:p>
-        </w:tc>
-        <w:tc>
-          <w:tcPr/>
-          <w:p>
-            <w:pPr>
-              <w:pStyle w:val="Compact"/>
-              <w:jc w:val="left"/>
-            </w:pPr>
-            <w:r>
-              <w:t xml:space="preserve">[+0.658, +2.978]</w:t>
+              <w:t xml:space="preserve">+1.996</w:t>
+            </w:r>
+          </w:p>
+        </w:tc>
+        <w:tc>
+          <w:tcPr/>
+          <w:p>
+            <w:pPr>
+              <w:pStyle w:val="Compact"/>
+              <w:jc w:val="left"/>
+            </w:pPr>
+            <w:r>
+              <w:t xml:space="preserve">0.767</w:t>
+            </w:r>
+          </w:p>
+        </w:tc>
+        <w:tc>
+          <w:tcPr/>
+          <w:p>
+            <w:pPr>
+              <w:pStyle w:val="Compact"/>
+              <w:jc w:val="left"/>
+            </w:pPr>
+            <w:r>
+              <w:t xml:space="preserve">.009**</w:t>
+            </w:r>
+          </w:p>
+        </w:tc>
+        <w:tc>
+          <w:tcPr/>
+          <w:p>
+            <w:pPr>
+              <w:pStyle w:val="Compact"/>
+              <w:jc w:val="left"/>
+            </w:pPr>
+            <w:r>
+              <w:t xml:space="preserve">[+0.492, +3.500]</w:t>
             </w:r>
           </w:p>
         </w:tc>
@@ -8326,7 +8419,7 @@
         <w:t xml:space="preserve"> </w:t>
       </w:r>
       <w:r>
-        <w:t xml:space="preserve">is small but positive and statistically significant (+0.080, p = .045),</w:t>
+        <w:t xml:space="preserve">is small but positive and statistically significant (+0.094, p = .021),</w:t>
       </w:r>
       <w:r>
         <w:t xml:space="preserve"> </w:t>
@@ -8368,13 +8461,13 @@
         <w:t xml:space="preserve"> </w:t>
       </w:r>
       <w:r>
-        <w:t xml:space="preserve">significant among high-intensity exporters, reaching +0.660 at FSTS =</w:t>
-      </w:r>
-      <w:r>
-        <w:t xml:space="preserve"> </w:t>
-      </w:r>
-      <w:r>
-        <w:t xml:space="preserve">70% and +1.818 at FSTS = 100% (Table 4). This pattern supports the</w:t>
+        <w:t xml:space="preserve">significant among high-intensity exporters, reaching +0.749 at FSTS =</w:t>
+      </w:r>
+      <w:r>
+        <w:t xml:space="preserve"> </w:t>
+      </w:r>
+      <w:r>
+        <w:t xml:space="preserve">70% and +1.996 at FSTS = 100% (Table 4). This pattern supports the</w:t>
       </w:r>
       <w:r>
         <w:t xml:space="preserve"> </w:t>
@@ -8530,37 +8623,37 @@
         <w:t xml:space="preserve"> </w:t>
       </w:r>
       <w:r>
-        <w:t xml:space="preserve">implied turning point occurs near FSTS = 88.6% on the original scale</w:t>
-      </w:r>
-      <w:r>
-        <w:t xml:space="preserve"> </w:t>
-      </w:r>
-      <w:r>
-        <w:t xml:space="preserve">(−β₁/2β₂ on mean-centered FSTS ≈ 84.1%; adding back the sample mean of</w:t>
-      </w:r>
-      <w:r>
-        <w:t xml:space="preserve"> </w:t>
-      </w:r>
-      <w:r>
-        <w:t xml:space="preserve">0.045 gives ≈ 88.6%, Aiken &amp; West, 1991), but its 95% percentile</w:t>
-      </w:r>
-      <w:r>
-        <w:t xml:space="preserve"> </w:t>
-      </w:r>
-      <w:r>
-        <w:t xml:space="preserve">cluster-bootstrap confidence interval (5,000 replications) spans [53%,</w:t>
-      </w:r>
-      <w:r>
-        <w:t xml:space="preserve"> </w:t>
-      </w:r>
-      <w:r>
-        <w:t xml:space="preserve">253%] (median 80%, IQR [68%, 102%]); the inverted-U shape is</w:t>
-      </w:r>
-      <w:r>
-        <w:t xml:space="preserve"> </w:t>
-      </w:r>
-      <w:r>
-        <w:t xml:space="preserve">recovered in 96.3% of bootstrap replications, but its precise location</w:t>
+        <w:t xml:space="preserve">implied turning point occurs near FSTS = 85.7% on the original scale</w:t>
+      </w:r>
+      <w:r>
+        <w:t xml:space="preserve"> </w:t>
+      </w:r>
+      <w:r>
+        <w:t xml:space="preserve">(−β₁/2β₂ on mean-centered FSTS ≈ 81.1%; adding back the sample mean of</w:t>
+      </w:r>
+      <w:r>
+        <w:t xml:space="preserve"> </w:t>
+      </w:r>
+      <w:r>
+        <w:t xml:space="preserve">0.047 gives ≈ 85.7%, Aiken &amp; West, 1991), but its 95% percentile</w:t>
+      </w:r>
+      <w:r>
+        <w:t xml:space="preserve"> </w:t>
+      </w:r>
+      <w:r>
+        <w:t xml:space="preserve">cluster-bootstrap confidence interval (5,000 replications) spans [58%,</w:t>
+      </w:r>
+      <w:r>
+        <w:t xml:space="preserve"> </w:t>
+      </w:r>
+      <w:r>
+        <w:t xml:space="preserve">398%] (median 83%, IQR [70%, 107%]); the inverted-U shape is</w:t>
+      </w:r>
+      <w:r>
+        <w:t xml:space="preserve"> </w:t>
+      </w:r>
+      <w:r>
+        <w:t xml:space="preserve">recovered in 94.9% of bootstrap replications, but its precise location</w:t>
       </w:r>
       <w:r>
         <w:t xml:space="preserve"> </w:t>
@@ -8588,7 +8681,7 @@
       </w:r>
     </w:p>
     <w:bookmarkEnd w:id="47"/>
-    <w:bookmarkStart w:id="48" w:name="Xc8e997e14555d7ba8da5c1d596c5311617447cd"/>
+    <w:bookmarkStart w:id="48" w:name="robustness-checks"/>
     <w:p>
       <w:pPr>
         <w:pStyle w:val="Heading3"/>
@@ -8740,7 +8833,7 @@
         <w:t xml:space="preserve"> </w:t>
       </w:r>
       <w:r>
-        <w:t xml:space="preserve">4.56 [p = .011] in the canonical specification to 1.88 [p = .154]),</w:t>
+        <w:t xml:space="preserve">3.21 [p = .041] in the canonical specification to 1.86 [p = .157]),</w:t>
       </w:r>
       <w:r>
         <w:t xml:space="preserve"> </w:t>
@@ -8770,25 +8863,25 @@
         <w:t xml:space="preserve"> </w:t>
       </w:r>
       <w:r>
-        <w:t xml:space="preserve">rather than absorbed into a broader capability construct. Cohen's f² for</w:t>
-      </w:r>
-      <w:r>
-        <w:t xml:space="preserve"> </w:t>
-      </w:r>
-      <w:r>
-        <w:t xml:space="preserve">the TCI direct effect (comparing M2 with M5) is approximately 0.036, in</w:t>
-      </w:r>
-      <w:r>
-        <w:t xml:space="preserve"> </w:t>
-      </w:r>
-      <w:r>
-        <w:t xml:space="preserve">the small-to-medium range; Cohen's f² for the DAI moderation block</w:t>
-      </w:r>
-      <w:r>
-        <w:t xml:space="preserve"> </w:t>
-      </w:r>
-      <w:r>
-        <w:t xml:space="preserve">(comparing M7 with M8) is approximately 0.018, below Cohen's (1988)</w:t>
+        <w:t xml:space="preserve">rather than absorbed into a broader capability construct. Cohen’s f² for</w:t>
+      </w:r>
+      <w:r>
+        <w:t xml:space="preserve"> </w:t>
+      </w:r>
+      <w:r>
+        <w:t xml:space="preserve">the TCI direct effect (comparing M2 with M5) is approximately 0.027, in</w:t>
+      </w:r>
+      <w:r>
+        <w:t xml:space="preserve"> </w:t>
+      </w:r>
+      <w:r>
+        <w:t xml:space="preserve">the small-to-medium range; Cohen’s f² for the DAI moderation block</w:t>
+      </w:r>
+      <w:r>
+        <w:t xml:space="preserve"> </w:t>
+      </w:r>
+      <w:r>
+        <w:t xml:space="preserve">(comparing M7 with M8) is approximately 0.012, below Cohen’s (1988)</w:t>
       </w:r>
       <w:r>
         <w:t xml:space="preserve"> </w:t>
@@ -8888,13 +8981,13 @@
         <w:t xml:space="preserve"> </w:t>
       </w:r>
       <w:r>
-        <w:t xml:space="preserve">sign (β=+2.821) and the joint F-test is statistically significant (F =</w:t>
-      </w:r>
-      <w:r>
-        <w:t xml:space="preserve"> </w:t>
-      </w:r>
-      <w:r>
-        <w:t xml:space="preserve">6.32, p = .003), corroborating the amplification mechanism documented in</w:t>
+        <w:t xml:space="preserve">sign (β=+1.987) and the joint F-test is statistically significant (F =</w:t>
+      </w:r>
+      <w:r>
+        <w:t xml:space="preserve"> </w:t>
+      </w:r>
+      <w:r>
+        <w:t xml:space="preserve">4.54, p = .014), corroborating the amplification mechanism documented in</w:t>
       </w:r>
       <w:r>
         <w:t xml:space="preserve"> </w:t>
@@ -9010,17 +9103,17 @@
     <w:tbl>
       <w:tblPr>
         <w:tblStyle w:val="Table"/>
-        <w:tblW w:type="auto" w:w="0"/>
+        <w:tblW w:type="pct" w:w="5000"/>
         <w:tblLook w:firstRow="1" w:lastRow="0" w:firstColumn="0" w:lastColumn="0" w:noHBand="0" w:noVBand="0" w:val="0020"/>
         <w:jc w:val="start"/>
       </w:tblPr>
       <w:tblGrid>
-        <w:gridCol w:w="1320"/>
-        <w:gridCol w:w="1320"/>
-        <w:gridCol w:w="1320"/>
-        <w:gridCol w:w="1320"/>
-        <w:gridCol w:w="1320"/>
-        <w:gridCol w:w="1320"/>
+        <w:gridCol w:w="3095"/>
+        <w:gridCol w:w="455"/>
+        <w:gridCol w:w="1183"/>
+        <w:gridCol w:w="1183"/>
+        <w:gridCol w:w="1183"/>
+        <w:gridCol w:w="819"/>
       </w:tblGrid>
       <w:tr>
         <w:trPr>
@@ -9132,31 +9225,31 @@
               <w:jc w:val="left"/>
             </w:pPr>
             <w:r>
-              <w:t xml:space="preserve">0.153***</w:t>
-            </w:r>
-          </w:p>
-        </w:tc>
-        <w:tc>
-          <w:tcPr/>
-          <w:p>
-            <w:pPr>
-              <w:pStyle w:val="Compact"/>
-              <w:jc w:val="left"/>
-            </w:pPr>
-            <w:r>
-              <w:t xml:space="preserve">3.119**</w:t>
-            </w:r>
-          </w:p>
-        </w:tc>
-        <w:tc>
-          <w:tcPr/>
-          <w:p>
-            <w:pPr>
-              <w:pStyle w:val="Compact"/>
-              <w:jc w:val="left"/>
-            </w:pPr>
-            <w:r>
-              <w:t xml:space="preserve">4.56 (.011)</w:t>
+              <w:t xml:space="preserve">0.152***</w:t>
+            </w:r>
+          </w:p>
+        </w:tc>
+        <w:tc>
+          <w:tcPr/>
+          <w:p>
+            <w:pPr>
+              <w:pStyle w:val="Compact"/>
+              <w:jc w:val="left"/>
+            </w:pPr>
+            <w:r>
+              <w:t xml:space="preserve">3.220*</w:t>
+            </w:r>
+          </w:p>
+        </w:tc>
+        <w:tc>
+          <w:tcPr/>
+          <w:p>
+            <w:pPr>
+              <w:pStyle w:val="Compact"/>
+              <w:jc w:val="left"/>
+            </w:pPr>
+            <w:r>
+              <w:t xml:space="preserve">3.21 (.041)</w:t>
             </w:r>
           </w:p>
         </w:tc>
@@ -9218,31 +9311,31 @@
               <w:jc w:val="left"/>
             </w:pPr>
             <w:r>
-              <w:t xml:space="preserve">1.552</w:t>
-            </w:r>
-          </w:p>
-        </w:tc>
-        <w:tc>
-          <w:tcPr/>
-          <w:p>
-            <w:pPr>
-              <w:pStyle w:val="Compact"/>
-              <w:jc w:val="left"/>
-            </w:pPr>
-            <w:r>
-              <w:t xml:space="preserve">4.01 (.019)</w:t>
-            </w:r>
-          </w:p>
-        </w:tc>
-        <w:tc>
-          <w:tcPr/>
-          <w:p>
-            <w:pPr>
-              <w:pStyle w:val="Compact"/>
-              <w:jc w:val="left"/>
-            </w:pPr>
-            <w:r>
-              <w:t xml:space="preserve">0.188</w:t>
+              <w:t xml:space="preserve">1.348</w:t>
+            </w:r>
+          </w:p>
+        </w:tc>
+        <w:tc>
+          <w:tcPr/>
+          <w:p>
+            <w:pPr>
+              <w:pStyle w:val="Compact"/>
+              <w:jc w:val="left"/>
+            </w:pPr>
+            <w:r>
+              <w:t xml:space="preserve">2.27 (.104)</w:t>
+            </w:r>
+          </w:p>
+        </w:tc>
+        <w:tc>
+          <w:tcPr/>
+          <w:p>
+            <w:pPr>
+              <w:pStyle w:val="Compact"/>
+              <w:jc w:val="left"/>
+            </w:pPr>
+            <w:r>
+              <w:t xml:space="preserve">0.185</w:t>
             </w:r>
           </w:p>
         </w:tc>
@@ -9268,55 +9361,55 @@
               <w:jc w:val="left"/>
             </w:pPr>
             <w:r>
-              <w:t xml:space="preserve">617</w:t>
-            </w:r>
-          </w:p>
-        </w:tc>
-        <w:tc>
-          <w:tcPr/>
-          <w:p>
-            <w:pPr>
-              <w:pStyle w:val="Compact"/>
-              <w:jc w:val="left"/>
-            </w:pPr>
-            <w:r>
-              <w:t xml:space="preserve">0.159***</w:t>
-            </w:r>
-          </w:p>
-        </w:tc>
-        <w:tc>
-          <w:tcPr/>
-          <w:p>
-            <w:pPr>
-              <w:pStyle w:val="Compact"/>
-              <w:jc w:val="left"/>
-            </w:pPr>
-            <w:r>
-              <w:t xml:space="preserve">2.930**</w:t>
-            </w:r>
-          </w:p>
-        </w:tc>
-        <w:tc>
-          <w:tcPr/>
-          <w:p>
-            <w:pPr>
-              <w:pStyle w:val="Compact"/>
-              <w:jc w:val="left"/>
-            </w:pPr>
-            <w:r>
-              <w:t xml:space="preserve">4.27 (.014)</w:t>
-            </w:r>
-          </w:p>
-        </w:tc>
-        <w:tc>
-          <w:tcPr/>
-          <w:p>
-            <w:pPr>
-              <w:pStyle w:val="Compact"/>
-              <w:jc w:val="left"/>
-            </w:pPr>
-            <w:r>
-              <w:t xml:space="preserve">0.199</w:t>
+              <w:t xml:space="preserve">611</w:t>
+            </w:r>
+          </w:p>
+        </w:tc>
+        <w:tc>
+          <w:tcPr/>
+          <w:p>
+            <w:pPr>
+              <w:pStyle w:val="Compact"/>
+              <w:jc w:val="left"/>
+            </w:pPr>
+            <w:r>
+              <w:t xml:space="preserve">0.149**</w:t>
+            </w:r>
+          </w:p>
+        </w:tc>
+        <w:tc>
+          <w:tcPr/>
+          <w:p>
+            <w:pPr>
+              <w:pStyle w:val="Compact"/>
+              <w:jc w:val="left"/>
+            </w:pPr>
+            <w:r>
+              <w:t xml:space="preserve">2.581*</w:t>
+            </w:r>
+          </w:p>
+        </w:tc>
+        <w:tc>
+          <w:tcPr/>
+          <w:p>
+            <w:pPr>
+              <w:pStyle w:val="Compact"/>
+              <w:jc w:val="left"/>
+            </w:pPr>
+            <w:r>
+              <w:t xml:space="preserve">3.03 (.049)</w:t>
+            </w:r>
+          </w:p>
+        </w:tc>
+        <w:tc>
+          <w:tcPr/>
+          <w:p>
+            <w:pPr>
+              <w:pStyle w:val="Compact"/>
+              <w:jc w:val="left"/>
+            </w:pPr>
+            <w:r>
+              <w:t xml:space="preserve">0.186</w:t>
             </w:r>
           </w:p>
         </w:tc>
@@ -9354,43 +9447,43 @@
               <w:jc w:val="left"/>
             </w:pPr>
             <w:r>
-              <w:t xml:space="preserve">0.170***</w:t>
-            </w:r>
-          </w:p>
-        </w:tc>
-        <w:tc>
-          <w:tcPr/>
-          <w:p>
-            <w:pPr>
-              <w:pStyle w:val="Compact"/>
-              <w:jc w:val="left"/>
-            </w:pPr>
-            <w:r>
-              <w:t xml:space="preserve">3.521**</w:t>
-            </w:r>
-          </w:p>
-        </w:tc>
-        <w:tc>
-          <w:tcPr/>
-          <w:p>
-            <w:pPr>
-              <w:pStyle w:val="Compact"/>
-              <w:jc w:val="left"/>
-            </w:pPr>
-            <w:r>
-              <w:t xml:space="preserve">4.61 (.010)</w:t>
-            </w:r>
-          </w:p>
-        </w:tc>
-        <w:tc>
-          <w:tcPr/>
-          <w:p>
-            <w:pPr>
-              <w:pStyle w:val="Compact"/>
-              <w:jc w:val="left"/>
-            </w:pPr>
-            <w:r>
-              <w:t xml:space="preserve">0.219</w:t>
+              <w:t xml:space="preserve">0.187***</w:t>
+            </w:r>
+          </w:p>
+        </w:tc>
+        <w:tc>
+          <w:tcPr/>
+          <w:p>
+            <w:pPr>
+              <w:pStyle w:val="Compact"/>
+              <w:jc w:val="left"/>
+            </w:pPr>
+            <w:r>
+              <w:t xml:space="preserve">4.252**</w:t>
+            </w:r>
+          </w:p>
+        </w:tc>
+        <w:tc>
+          <w:tcPr/>
+          <w:p>
+            <w:pPr>
+              <w:pStyle w:val="Compact"/>
+              <w:jc w:val="left"/>
+            </w:pPr>
+            <w:r>
+              <w:t xml:space="preserve">4.48 (.012)</w:t>
+            </w:r>
+          </w:p>
+        </w:tc>
+        <w:tc>
+          <w:tcPr/>
+          <w:p>
+            <w:pPr>
+              <w:pStyle w:val="Compact"/>
+              <w:jc w:val="left"/>
+            </w:pPr>
+            <w:r>
+              <w:t xml:space="preserve">0.231</w:t>
             </w:r>
           </w:p>
         </w:tc>
@@ -9428,43 +9521,43 @@
               <w:jc w:val="left"/>
             </w:pPr>
             <w:r>
-              <w:t xml:space="preserve">0.156***</w:t>
-            </w:r>
-          </w:p>
-        </w:tc>
-        <w:tc>
-          <w:tcPr/>
-          <w:p>
-            <w:pPr>
-              <w:pStyle w:val="Compact"/>
-              <w:jc w:val="left"/>
-            </w:pPr>
-            <w:r>
-              <w:t xml:space="preserve">3.505**</w:t>
-            </w:r>
-          </w:p>
-        </w:tc>
-        <w:tc>
-          <w:tcPr/>
-          <w:p>
-            <w:pPr>
-              <w:pStyle w:val="Compact"/>
-              <w:jc w:val="left"/>
-            </w:pPr>
-            <w:r>
-              <w:t xml:space="preserve">5.30 (.005)</w:t>
-            </w:r>
-          </w:p>
-        </w:tc>
-        <w:tc>
-          <w:tcPr/>
-          <w:p>
-            <w:pPr>
-              <w:pStyle w:val="Compact"/>
-              <w:jc w:val="left"/>
-            </w:pPr>
-            <w:r>
-              <w:t xml:space="preserve">0.199</w:t>
+              <w:t xml:space="preserve">0.160***</w:t>
+            </w:r>
+          </w:p>
+        </w:tc>
+        <w:tc>
+          <w:tcPr/>
+          <w:p>
+            <w:pPr>
+              <w:pStyle w:val="Compact"/>
+              <w:jc w:val="left"/>
+            </w:pPr>
+            <w:r>
+              <w:t xml:space="preserve">3.600**</w:t>
+            </w:r>
+          </w:p>
+        </w:tc>
+        <w:tc>
+          <w:tcPr/>
+          <w:p>
+            <w:pPr>
+              <w:pStyle w:val="Compact"/>
+              <w:jc w:val="left"/>
+            </w:pPr>
+            <w:r>
+              <w:t xml:space="preserve">3.61 (.028)</w:t>
+            </w:r>
+          </w:p>
+        </w:tc>
+        <w:tc>
+          <w:tcPr/>
+          <w:p>
+            <w:pPr>
+              <w:pStyle w:val="Compact"/>
+              <w:jc w:val="left"/>
+            </w:pPr>
+            <w:r>
+              <w:t xml:space="preserve">0.202</w:t>
             </w:r>
           </w:p>
         </w:tc>
@@ -9514,19 +9607,19 @@
               <w:jc w:val="left"/>
             </w:pPr>
             <w:r>
-              <w:t xml:space="preserve">2.821</w:t>
-            </w:r>
-          </w:p>
-        </w:tc>
-        <w:tc>
-          <w:tcPr/>
-          <w:p>
-            <w:pPr>
-              <w:pStyle w:val="Compact"/>
-              <w:jc w:val="left"/>
-            </w:pPr>
-            <w:r>
-              <w:t xml:space="preserve">6.32 (.003)</w:t>
+              <w:t xml:space="preserve">1.987</w:t>
+            </w:r>
+          </w:p>
+        </w:tc>
+        <w:tc>
+          <w:tcPr/>
+          <w:p>
+            <w:pPr>
+              <w:pStyle w:val="Compact"/>
+              <w:jc w:val="left"/>
+            </w:pPr>
+            <w:r>
+              <w:t xml:space="preserve">4.54 (.014)</w:t>
             </w:r>
           </w:p>
         </w:tc>
@@ -9686,7 +9779,7 @@
     </w:p>
     <w:bookmarkEnd w:id="48"/>
     <w:bookmarkEnd w:id="49"/>
-    <w:bookmarkStart w:id="52" w:name="X735612638e4e736e4693e459c258977262c0dfc"/>
+    <w:bookmarkStart w:id="52" w:name="discussion"/>
     <w:p>
       <w:pPr>
         <w:pStyle w:val="Heading2"/>
@@ -9695,7 +9788,7 @@
         <w:t xml:space="preserve">5 Discussion</w:t>
       </w:r>
     </w:p>
-    <w:bookmarkStart w:id="50" w:name="X027b31c2d090a00917aa7291770680fd40b64cd"/>
+    <w:bookmarkStart w:id="50" w:name="theoretical-implications"/>
     <w:p>
       <w:pPr>
         <w:pStyle w:val="Heading3"/>
@@ -10009,7 +10102,7 @@
         <w:t xml:space="preserve"> </w:t>
       </w:r>
       <w:r>
-        <w:t xml:space="preserve">interfaces and transaction systems. The scale of Singapore's innovation</w:t>
+        <w:t xml:space="preserve">interfaces and transaction systems. The scale of Singapore’s innovation</w:t>
       </w:r>
       <w:r>
         <w:t xml:space="preserve"> </w:t>
@@ -10039,7 +10132,7 @@
         <w:t xml:space="preserve"> </w:t>
       </w:r>
       <w:r>
-        <w:t xml:space="preserve">Development Authority (IMDA, 2025), confirming that Singapore's</w:t>
+        <w:t xml:space="preserve">Development Authority (IMDA, 2025), confirming that Singapore’s</w:t>
       </w:r>
       <w:r>
         <w:t xml:space="preserve"> </w:t>
@@ -10163,7 +10256,7 @@
         <w:t xml:space="preserve"> </w:t>
       </w:r>
       <w:r>
-        <w:t xml:space="preserve">on FSTS² × DAI (β=+3.119, p=.005) implies that DAI's productivity</w:t>
+        <w:t xml:space="preserve">on FSTS² × DAI (β=+3.220, p=.020) implies that DAI’s productivity</w:t>
       </w:r>
       <w:r>
         <w:t xml:space="preserve"> </w:t>
@@ -10401,7 +10494,7 @@
         <w:t xml:space="preserve"> </w:t>
       </w:r>
       <w:r>
-        <w:t xml:space="preserve">the DAI construct used here. This paper's DAI combines website presence</w:t>
+        <w:t xml:space="preserve">the DAI construct used here. This paper’s DAI combines website presence</w:t>
       </w:r>
       <w:r>
         <w:t xml:space="preserve"> </w:t>
@@ -10437,13 +10530,13 @@
         <w:t xml:space="preserve"> </w:t>
       </w:r>
       <w:r>
-        <w:t xml:space="preserve">substantially (β drops from +3.119 to +1.552, joint F retained marginal</w:t>
-      </w:r>
-      <w:r>
-        <w:t xml:space="preserve"> </w:t>
-      </w:r>
-      <w:r>
-        <w:t xml:space="preserve">at 4.01, p = .019), and the item-swap falsification test indicates that</w:t>
+        <w:t xml:space="preserve">substantially (β drops from +3.220 to +1.348, joint F = 2.27, p = .104),</w:t>
+      </w:r>
+      <w:r>
+        <w:t xml:space="preserve"> </w:t>
+      </w:r>
+      <w:r>
+        <w:t xml:space="preserve">and the item-swap falsification test indicates that</w:t>
       </w:r>
       <w:r>
         <w:t xml:space="preserve"> </w:t>
@@ -10691,7 +10784,7 @@
         <w:t xml:space="preserve"> </w:t>
       </w:r>
       <w:r>
-        <w:t xml:space="preserve">assessments (World Bank, 2023), the WBES website indicator captures</w:t>
+        <w:t xml:space="preserve">assessments (World Bank, 2024), the WBES website indicator captures</w:t>
       </w:r>
       <w:r>
         <w:t xml:space="preserve"> </w:t>
@@ -10743,7 +10836,7 @@
       </w:r>
     </w:p>
     <w:bookmarkEnd w:id="50"/>
-    <w:bookmarkStart w:id="51" w:name="Xa4e692b259d9b803bab54ad026a7e8d888a5d2c"/>
+    <w:bookmarkStart w:id="51" w:name="managerial-implications"/>
     <w:p>
       <w:pPr>
         <w:pStyle w:val="Heading3"/>
@@ -10948,7 +11041,7 @@
     </w:p>
     <w:bookmarkEnd w:id="51"/>
     <w:bookmarkEnd w:id="52"/>
-    <w:bookmarkStart w:id="53" w:name="X6b297cc947e0db5526be369b1f0f4ddc67b2415"/>
+    <w:bookmarkStart w:id="53" w:name="conclusion"/>
     <w:p>
       <w:pPr>
         <w:pStyle w:val="Heading2"/>
@@ -11164,7 +11257,7 @@
       </w:r>
     </w:p>
     <w:bookmarkEnd w:id="53"/>
-    <w:bookmarkStart w:id="54" w:name="X422fdd10c3908fe492ea939b97371c73422dbba"/>
+    <w:bookmarkStart w:id="54" w:name="limitations-and-future-research"/>
     <w:p>
       <w:pPr>
         <w:pStyle w:val="Heading2"/>
@@ -11274,13 +11367,13 @@
         <w:t xml:space="preserve"> </w:t>
       </w:r>
       <w:r>
-        <w:t xml:space="preserve">its 95% bootstrap confidence interval is wide ([53%, 253%]) even</w:t>
-      </w:r>
-      <w:r>
-        <w:t xml:space="preserve"> </w:t>
-      </w:r>
-      <w:r>
-        <w:t xml:space="preserve">though an inverted-U shape is recovered in 96.3% of resamples. The same</w:t>
+        <w:t xml:space="preserve">its 95% bootstrap confidence interval is wide ([58%, 398%]) even</w:t>
+      </w:r>
+      <w:r>
+        <w:t xml:space="preserve"> </w:t>
+      </w:r>
+      <w:r>
+        <w:t xml:space="preserve">though an inverted-U shape is recovered in 94.9% of resamples. The same</w:t>
       </w:r>
       <w:r>
         <w:t xml:space="preserve"> </w:t>
@@ -11490,14 +11583,12 @@
         <w:t xml:space="preserve"> </w:t>
       </w:r>
       <w:hyperlink r:id="rId55">
-        <w:hyperlink r:id="rId55">
-          <w:r>
-            <w:rPr>
-              <w:rStyle w:val="Hyperlink"/>
-            </w:rPr>
-            <w:t xml:space="preserve">www.enterprisesurveys.org</w:t>
-          </w:r>
-        </w:hyperlink>
+        <w:r>
+          <w:rPr>
+            <w:rStyle w:val="Hyperlink"/>
+          </w:rPr>
+          <w:t xml:space="preserve">www.enterprisesurveys.org</w:t>
+        </w:r>
       </w:hyperlink>
       <w:r>
         <w:t xml:space="preserve">. Analysis</w:t>
@@ -12203,7 +12294,7 @@
         <w:t xml:space="preserve"> </w:t>
       </w:r>
       <w:r>
-        <w:t xml:space="preserve">or multi-stage theory of internationalization vs. the transaction cost</w:t>
+        <w:t xml:space="preserve">or multi-stage theory of internationalization vs. the transaction cost</w:t>
       </w:r>
       <w:r>
         <w:t xml:space="preserve"> </w:t>
@@ -13484,10 +13575,7 @@
     </w:p>
     <w:bookmarkEnd w:id="98"/>
     <w:bookmarkEnd w:id="99"/>
-    <w:sectPr>
-      <w:pgSz w:h="16838" w:w="11906"/>
-      <w:pgMar w:bottom="1417" w:left="1417" w:right="1417" w:top="1417"/>
-    </w:sectPr>
+    <w:sectPr/>
   </w:body>
 </w:document>
 </file>
@@ -13620,59 +13708,29 @@
   <w:style w:default="1" w:styleId="Normal" w:type="paragraph">
     <w:name w:val="Normal"/>
     <w:qFormat/>
-    <w:pPr>
-      <w:spacing w:line="276" w:lineRule="auto"/>
-      <w:jc w:val="both"/>
-    </w:pPr>
-    <w:rPr>
-      <w:rFonts w:ascii="Times New Roman" w:eastAsia="Times New Roman" w:hAnsi="Times New Roman"/>
-      <w:color w:val="000000"/>
-      <w:sz w:val="24"/>
-    </w:rPr>
   </w:style>
   <w:style w:styleId="BodyText" w:type="paragraph">
     <w:name w:val="Body Text"/>
     <w:basedOn w:val="Normal"/>
     <w:link w:val="BodyTextChar"/>
     <w:pPr>
-      <w:spacing w:after="180" w:before="180" w:line="276" w:lineRule="auto"/>
-      <w:jc w:val="both"/>
+      <w:spacing w:after="180" w:before="180"/>
     </w:pPr>
     <w:qFormat/>
-    <w:rPr>
-      <w:rFonts w:ascii="Times New Roman" w:eastAsia="Times New Roman" w:hAnsi="Times New Roman"/>
-      <w:color w:val="000000"/>
-      <w:sz w:val="24"/>
-    </w:rPr>
   </w:style>
   <w:style w:customStyle="1" w:styleId="FirstParagraph" w:type="paragraph">
     <w:name w:val="First Paragraph"/>
     <w:basedOn w:val="BodyText"/>
     <w:next w:val="BodyText"/>
     <w:qFormat/>
-    <w:pPr>
-      <w:spacing w:line="276" w:lineRule="auto"/>
-      <w:jc w:val="both"/>
-    </w:pPr>
-    <w:rPr>
-      <w:rFonts w:ascii="Times New Roman" w:eastAsia="Times New Roman" w:hAnsi="Times New Roman"/>
-      <w:color w:val="000000"/>
-      <w:sz w:val="24"/>
-    </w:rPr>
   </w:style>
   <w:style w:customStyle="1" w:styleId="Compact" w:type="paragraph">
     <w:name w:val="Compact"/>
     <w:basedOn w:val="BodyText"/>
     <w:qFormat/>
     <w:pPr>
-      <w:spacing w:after="36" w:before="36" w:line="276" w:lineRule="auto"/>
-      <w:jc w:val="both"/>
+      <w:spacing w:after="36" w:before="36"/>
     </w:pPr>
-    <w:rPr>
-      <w:rFonts w:ascii="Times New Roman" w:eastAsia="Times New Roman" w:hAnsi="Times New Roman"/>
-      <w:color w:val="000000"/>
-      <w:sz w:val="24"/>
-    </w:rPr>
   </w:style>
   <w:style w:styleId="Title" w:type="paragraph">
     <w:name w:val="Title"/>
@@ -13682,15 +13740,15 @@
     <w:pPr>
       <w:keepNext/>
       <w:keepLines/>
-      <w:spacing w:after="240" w:before="480" w:line="276" w:lineRule="auto"/>
-      <w:jc w:val="both"/>
+      <w:spacing w:after="240" w:before="480"/>
+      <w:jc w:val="center"/>
     </w:pPr>
     <w:rPr>
-      <w:rFonts w:ascii="Times New Roman" w:asciiTheme="majorHAnsi" w:cstheme="majorBidi" w:eastAsia="Times New Roman" w:eastAsiaTheme="majorEastAsia" w:hAnsi="Times New Roman" w:hAnsiTheme="majorHAnsi"/>
+      <w:rFonts w:asciiTheme="majorHAnsi" w:cstheme="majorBidi" w:eastAsiaTheme="majorEastAsia" w:hAnsiTheme="majorHAnsi"/>
       <w:b/>
       <w:bCs/>
-      <w:color w:val="000000"/>
-      <w:sz w:val="24"/>
+      <w:color w:themeColor="accent1" w:themeShade="B5" w:val="345A8A"/>
+      <w:sz w:val="36"/>
       <w:szCs w:val="36"/>
     </w:rPr>
   </w:style>
@@ -13702,13 +13760,11 @@
     <w:pPr>
       <w:keepNext/>
       <w:keepLines/>
-      <w:spacing w:after="240" w:before="240" w:line="276" w:lineRule="auto"/>
-      <w:jc w:val="both"/>
+      <w:spacing w:after="240" w:before="240"/>
+      <w:jc w:val="center"/>
     </w:pPr>
     <w:rPr>
-      <w:rFonts w:ascii="Times New Roman" w:eastAsia="Times New Roman" w:hAnsi="Times New Roman"/>
-      <w:color w:val="000000"/>
-      <w:sz w:val="24"/>
+      <w:sz w:val="30"/>
       <w:szCs w:val="30"/>
     </w:rPr>
   </w:style>
@@ -13719,14 +13775,8 @@
     <w:pPr>
       <w:keepNext/>
       <w:keepLines/>
-      <w:spacing w:line="276" w:lineRule="auto"/>
-      <w:jc w:val="both"/>
+      <w:jc w:val="center"/>
     </w:pPr>
-    <w:rPr>
-      <w:rFonts w:ascii="Times New Roman" w:eastAsia="Times New Roman" w:hAnsi="Times New Roman"/>
-      <w:color w:val="000000"/>
-      <w:sz w:val="24"/>
-    </w:rPr>
   </w:style>
   <w:style w:styleId="Date" w:type="paragraph">
     <w:name w:val="Date"/>
@@ -13735,14 +13785,8 @@
     <w:pPr>
       <w:keepNext/>
       <w:keepLines/>
-      <w:spacing w:line="276" w:lineRule="auto"/>
-      <w:jc w:val="both"/>
+      <w:jc w:val="center"/>
     </w:pPr>
-    <w:rPr>
-      <w:rFonts w:ascii="Times New Roman" w:eastAsia="Times New Roman" w:hAnsi="Times New Roman"/>
-      <w:color w:val="000000"/>
-      <w:sz w:val="24"/>
-    </w:rPr>
   </w:style>
   <w:style w:customStyle="1" w:styleId="AbstractTitle" w:type="paragraph">
     <w:name w:val="Abstract Title"/>
@@ -13752,15 +13796,15 @@
     <w:pPr>
       <w:keepNext/>
       <w:keepLines/>
-      <w:jc w:val="both"/>
-      <w:spacing w:after="0" w:before="300" w:line="276" w:lineRule="auto"/>
+      <w:jc w:val="center"/>
+      <w:spacing w:after="0" w:before="300"/>
     </w:pPr>
     <w:rPr>
-      <w:color w:val="000000"/>
-      <w:sz w:val="24"/>
+      <w:sz w:val="20"/>
       <w:szCs w:val="20"/>
-      <w:rFonts w:ascii="Times New Roman" w:eastAsia="Times New Roman" w:hAnsi="Times New Roman"/>
       <w:b/>
+      <w:color w:val="345A8A"/>
+      &gt;
     </w:rPr>
   </w:style>
   <w:style w:customStyle="1" w:styleId="Abstract" w:type="paragraph">
@@ -13771,13 +13815,10 @@
     <w:pPr>
       <w:keepNext/>
       <w:keepLines/>
-      <w:spacing w:after="300" w:before="100" w:line="276" w:lineRule="auto"/>
-      <w:jc w:val="both"/>
+      <w:spacing w:after="300" w:before="100"/>
     </w:pPr>
     <w:rPr>
-      <w:rFonts w:ascii="Times New Roman" w:eastAsia="Times New Roman" w:hAnsi="Times New Roman"/>
-      <w:color w:val="000000"/>
-      <w:sz w:val="24"/>
+      <w:sz w:val="20"/>
       <w:szCs w:val="20"/>
     </w:rPr>
   </w:style>
@@ -13786,15 +13827,8 @@
     <w:basedOn w:val="Normal"/>
     <w:next w:val="Bibliography"/>
     <w:qFormat/>
-    <w:pPr>
-      <w:spacing w:line="276" w:lineRule="auto"/>
-      <w:jc w:val="both"/>
-    </w:pPr>
-    <w:rPr>
-      <w:rFonts w:ascii="Times New Roman" w:eastAsia="Times New Roman" w:hAnsi="Times New Roman"/>
-      <w:color w:val="000000"/>
-      <w:sz w:val="24"/>
-    </w:rPr>
+    <w:pPr/>
+    <w:rPr/>
   </w:style>
   <w:style w:styleId="Heading1" w:type="paragraph">
     <w:name w:val="Heading 1"/>
@@ -13805,16 +13839,15 @@
     <w:pPr>
       <w:keepNext/>
       <w:keepLines/>
-      <w:spacing w:after="0" w:before="480" w:line="276" w:lineRule="auto"/>
-      <w:jc w:val="both"/>
+      <w:spacing w:after="0" w:before="480"/>
       <w:outlineLvl w:val="0"/>
     </w:pPr>
     <w:rPr>
-      <w:rFonts w:ascii="Times New Roman" w:asciiTheme="majorHAnsi" w:cstheme="majorBidi" w:eastAsia="Times New Roman" w:eastAsiaTheme="majorEastAsia" w:hAnsi="Times New Roman" w:hAnsiTheme="majorHAnsi"/>
+      <w:rFonts w:asciiTheme="majorHAnsi" w:cstheme="majorBidi" w:eastAsiaTheme="majorEastAsia" w:hAnsiTheme="majorHAnsi"/>
       <w:b/>
       <w:bCs/>
-      <w:color w:val="000000"/>
-      <w:sz w:val="24"/>
+      <w:color w:themeColor="accent1" w:val="4F81BD"/>
+      <w:sz w:val="32"/>
       <w:szCs w:val="32"/>
     </w:rPr>
   </w:style>
@@ -13828,16 +13861,15 @@
     <w:pPr>
       <w:keepNext/>
       <w:keepLines/>
-      <w:spacing w:after="0" w:before="200" w:line="276" w:lineRule="auto"/>
-      <w:jc w:val="both"/>
+      <w:spacing w:after="0" w:before="200"/>
       <w:outlineLvl w:val="1"/>
     </w:pPr>
     <w:rPr>
-      <w:rFonts w:ascii="Times New Roman" w:asciiTheme="majorHAnsi" w:cstheme="majorBidi" w:eastAsia="Times New Roman" w:eastAsiaTheme="majorEastAsia" w:hAnsi="Times New Roman" w:hAnsiTheme="majorHAnsi"/>
+      <w:rFonts w:asciiTheme="majorHAnsi" w:cstheme="majorBidi" w:eastAsiaTheme="majorEastAsia" w:hAnsiTheme="majorHAnsi"/>
       <w:b/>
       <w:bCs/>
-      <w:color w:val="000000"/>
-      <w:sz w:val="24"/>
+      <w:color w:themeColor="accent1" w:val="4F81BD"/>
+      <w:sz w:val="28"/>
       <w:szCs w:val="28"/>
     </w:rPr>
   </w:style>
@@ -13851,15 +13883,14 @@
     <w:pPr>
       <w:keepNext/>
       <w:keepLines/>
-      <w:spacing w:after="0" w:before="200" w:line="276" w:lineRule="auto"/>
-      <w:jc w:val="both"/>
+      <w:spacing w:after="0" w:before="200"/>
       <w:outlineLvl w:val="2"/>
     </w:pPr>
     <w:rPr>
-      <w:rFonts w:ascii="Times New Roman" w:asciiTheme="majorHAnsi" w:cstheme="majorBidi" w:eastAsia="Times New Roman" w:eastAsiaTheme="majorEastAsia" w:hAnsi="Times New Roman" w:hAnsiTheme="majorHAnsi"/>
+      <w:rFonts w:asciiTheme="majorHAnsi" w:cstheme="majorBidi" w:eastAsiaTheme="majorEastAsia" w:hAnsiTheme="majorHAnsi"/>
       <w:b/>
       <w:bCs/>
-      <w:color w:val="000000"/>
+      <w:color w:themeColor="accent1" w:val="4F81BD"/>
       <w:sz w:val="24"/>
       <w:szCs w:val="24"/>
     </w:rPr>
@@ -13874,15 +13905,14 @@
     <w:pPr>
       <w:keepNext/>
       <w:keepLines/>
-      <w:spacing w:after="0" w:before="200" w:line="276" w:lineRule="auto"/>
-      <w:jc w:val="both"/>
+      <w:spacing w:after="0" w:before="200"/>
       <w:outlineLvl w:val="3"/>
     </w:pPr>
     <w:rPr>
-      <w:rFonts w:ascii="Times New Roman" w:asciiTheme="majorHAnsi" w:cstheme="majorBidi" w:eastAsia="Times New Roman" w:eastAsiaTheme="majorEastAsia" w:hAnsi="Times New Roman" w:hAnsiTheme="majorHAnsi"/>
+      <w:rFonts w:asciiTheme="majorHAnsi" w:cstheme="majorBidi" w:eastAsiaTheme="majorEastAsia" w:hAnsiTheme="majorHAnsi"/>
       <w:i/>
       <w:bCs/>
-      <w:color w:val="000000"/>
+      <w:color w:themeColor="accent1" w:val="4F81BD"/>
       <w:sz w:val="24"/>
       <w:szCs w:val="24"/>
     </w:rPr>
@@ -13897,14 +13927,13 @@
     <w:pPr>
       <w:keepNext/>
       <w:keepLines/>
-      <w:spacing w:after="0" w:before="200" w:line="276" w:lineRule="auto"/>
-      <w:jc w:val="both"/>
+      <w:spacing w:after="0" w:before="200"/>
       <w:outlineLvl w:val="4"/>
     </w:pPr>
     <w:rPr>
-      <w:rFonts w:ascii="Times New Roman" w:asciiTheme="majorHAnsi" w:cstheme="majorBidi" w:eastAsia="Times New Roman" w:eastAsiaTheme="majorEastAsia" w:hAnsi="Times New Roman" w:hAnsiTheme="majorHAnsi"/>
+      <w:rFonts w:asciiTheme="majorHAnsi" w:cstheme="majorBidi" w:eastAsiaTheme="majorEastAsia" w:hAnsiTheme="majorHAnsi"/>
       <w:iCs/>
-      <w:color w:val="000000"/>
+      <w:color w:themeColor="accent1" w:val="4F81BD"/>
       <w:sz w:val="24"/>
       <w:szCs w:val="24"/>
     </w:rPr>
@@ -13919,13 +13948,12 @@
     <w:pPr>
       <w:keepNext/>
       <w:keepLines/>
-      <w:spacing w:after="0" w:before="200" w:line="276" w:lineRule="auto"/>
-      <w:jc w:val="both"/>
+      <w:spacing w:after="0" w:before="200"/>
       <w:outlineLvl w:val="5"/>
     </w:pPr>
     <w:rPr>
-      <w:rFonts w:ascii="Times New Roman" w:asciiTheme="majorHAnsi" w:cstheme="majorBidi" w:eastAsia="Times New Roman" w:eastAsiaTheme="majorEastAsia" w:hAnsi="Times New Roman" w:hAnsiTheme="majorHAnsi"/>
-      <w:color w:val="000000"/>
+      <w:rFonts w:asciiTheme="majorHAnsi" w:cstheme="majorBidi" w:eastAsiaTheme="majorEastAsia" w:hAnsiTheme="majorHAnsi"/>
+      <w:color w:themeColor="accent1" w:val="4F81BD"/>
       <w:sz w:val="24"/>
       <w:szCs w:val="24"/>
     </w:rPr>
@@ -13940,13 +13968,12 @@
     <w:pPr>
       <w:keepNext/>
       <w:keepLines/>
-      <w:spacing w:after="0" w:before="200" w:line="276" w:lineRule="auto"/>
-      <w:jc w:val="both"/>
+      <w:spacing w:after="0" w:before="200"/>
       <w:outlineLvl w:val="6"/>
     </w:pPr>
     <w:rPr>
-      <w:rFonts w:ascii="Times New Roman" w:asciiTheme="majorHAnsi" w:cstheme="majorBidi" w:eastAsia="Times New Roman" w:eastAsiaTheme="majorEastAsia" w:hAnsi="Times New Roman" w:hAnsiTheme="majorHAnsi"/>
-      <w:color w:val="000000"/>
+      <w:rFonts w:asciiTheme="majorHAnsi" w:cstheme="majorBidi" w:eastAsiaTheme="majorEastAsia" w:hAnsiTheme="majorHAnsi"/>
+      <w:color w:themeColor="accent1" w:val="4F81BD"/>
       <w:sz w:val="24"/>
       <w:szCs w:val="24"/>
     </w:rPr>
@@ -13961,13 +13988,12 @@
     <w:pPr>
       <w:keepNext/>
       <w:keepLines/>
-      <w:spacing w:after="0" w:before="200" w:line="276" w:lineRule="auto"/>
-      <w:jc w:val="both"/>
+      <w:spacing w:after="0" w:before="200"/>
       <w:outlineLvl w:val="7"/>
     </w:pPr>
     <w:rPr>
-      <w:rFonts w:ascii="Times New Roman" w:asciiTheme="majorHAnsi" w:cstheme="majorBidi" w:eastAsia="Times New Roman" w:eastAsiaTheme="majorEastAsia" w:hAnsi="Times New Roman" w:hAnsiTheme="majorHAnsi"/>
-      <w:color w:val="000000"/>
+      <w:rFonts w:asciiTheme="majorHAnsi" w:cstheme="majorBidi" w:eastAsiaTheme="majorEastAsia" w:hAnsiTheme="majorHAnsi"/>
+      <w:color w:themeColor="accent1" w:val="4F81BD"/>
       <w:sz w:val="24"/>
       <w:szCs w:val="24"/>
     </w:rPr>
@@ -13982,13 +14008,12 @@
     <w:pPr>
       <w:keepNext/>
       <w:keepLines/>
-      <w:spacing w:after="0" w:before="200" w:line="276" w:lineRule="auto"/>
-      <w:jc w:val="both"/>
+      <w:spacing w:after="0" w:before="200"/>
       <w:outlineLvl w:val="8"/>
     </w:pPr>
     <w:rPr>
-      <w:rFonts w:ascii="Times New Roman" w:asciiTheme="majorHAnsi" w:cstheme="majorBidi" w:eastAsia="Times New Roman" w:eastAsiaTheme="majorEastAsia" w:hAnsi="Times New Roman" w:hAnsiTheme="majorHAnsi"/>
-      <w:color w:val="000000"/>
+      <w:rFonts w:asciiTheme="majorHAnsi" w:cstheme="majorBidi" w:eastAsiaTheme="majorEastAsia" w:hAnsiTheme="majorHAnsi"/>
+      <w:color w:themeColor="accent1" w:val="4F81BD"/>
       <w:sz w:val="24"/>
       <w:szCs w:val="24"/>
     </w:rPr>
@@ -14001,15 +14026,9 @@
     <w:unhideWhenUsed/>
     <w:qFormat/>
     <w:pPr>
-      <w:spacing w:after="100" w:before="100" w:line="276" w:lineRule="auto"/>
+      <w:spacing w:after="100" w:before="100"/>
       <w:ind w:firstLine="0" w:left="480" w:right="480"/>
-      <w:jc w:val="both"/>
     </w:pPr>
-    <w:rPr>
-      <w:rFonts w:ascii="Times New Roman" w:eastAsia="Times New Roman" w:hAnsi="Times New Roman"/>
-      <w:color w:val="000000"/>
-      <w:sz w:val="24"/>
-    </w:rPr>
   </w:style>
   <w:style w:styleId="FootnoteText" w:type="paragraph">
     <w:name w:val="Footnote Text"/>
@@ -14018,25 +14037,11 @@
     <w:uiPriority w:val="9"/>
     <w:unhideWhenUsed/>
     <w:qFormat/>
-    <w:pPr>
-      <w:spacing w:line="276" w:lineRule="auto"/>
-      <w:jc w:val="both"/>
-    </w:pPr>
-    <w:rPr>
-      <w:rFonts w:ascii="Times New Roman" w:eastAsia="Times New Roman" w:hAnsi="Times New Roman"/>
-      <w:color w:val="000000"/>
-      <w:sz w:val="24"/>
-    </w:rPr>
   </w:style>
   <w:style w:default="1" w:styleId="DefaultParagraphFont" w:type="character">
     <w:name w:val="Default Paragraph Font"/>
     <w:semiHidden/>
     <w:unhideWhenUsed/>
-    <w:rPr>
-      <w:rFonts w:ascii="Times New Roman" w:eastAsia="Times New Roman" w:hAnsi="Times New Roman"/>
-      <w:color w:val="000000"/>
-      <w:sz w:val="24"/>
-    </w:rPr>
   </w:style>
   <w:style w:default="1" w:styleId="Table" w:type="table">
     <w:name w:val="Table"/>
@@ -14044,15 +14049,6 @@
     <w:semiHidden/>
     <w:unhideWhenUsed/>
     <w:qFormat/>
-    <w:pPr>
-      <w:spacing w:line="276" w:lineRule="auto"/>
-      <w:jc w:val="both"/>
-    </w:pPr>
-    <w:rPr>
-      <w:rFonts w:ascii="Times New Roman" w:eastAsia="Times New Roman" w:hAnsi="Times New Roman"/>
-      <w:color w:val="000000"/>
-      <w:sz w:val="24"/>
-    </w:rPr>
     <w:tblPr>
       <w:tblInd w:type="dxa" w:w="0"/>
       <w:tblCellMar>
@@ -14085,42 +14081,25 @@
     <w:pPr>
       <w:keepNext/>
       <w:keepLines/>
-      <w:spacing w:after="0" w:line="276" w:lineRule="auto"/>
-      <w:jc w:val="both"/>
+      <w:spacing w:after="0"/>
     </w:pPr>
     <w:rPr>
-      <w:rFonts w:ascii="Times New Roman" w:eastAsia="Times New Roman" w:hAnsi="Times New Roman"/>
       <w:b/>
-      <w:color w:val="000000"/>
-      <w:sz w:val="24"/>
     </w:rPr>
   </w:style>
   <w:style w:customStyle="1" w:styleId="Definition" w:type="paragraph">
     <w:name w:val="Definition"/>
     <w:basedOn w:val="Normal"/>
-    <w:pPr>
-      <w:spacing w:line="276" w:lineRule="auto"/>
-      <w:jc w:val="both"/>
-    </w:pPr>
-    <w:rPr>
-      <w:rFonts w:ascii="Times New Roman" w:eastAsia="Times New Roman" w:hAnsi="Times New Roman"/>
-      <w:color w:val="000000"/>
-      <w:sz w:val="24"/>
-    </w:rPr>
   </w:style>
   <w:style w:styleId="Caption" w:type="paragraph">
     <w:name w:val="Caption"/>
     <w:basedOn w:val="Normal"/>
     <w:link w:val="BodyTextChar"/>
     <w:pPr>
-      <w:spacing w:after="120" w:before="0" w:line="276" w:lineRule="auto"/>
-      <w:jc w:val="both"/>
+      <w:spacing w:after="120" w:before="0"/>
     </w:pPr>
     <w:rPr>
-      <w:rFonts w:ascii="Times New Roman" w:eastAsia="Times New Roman" w:hAnsi="Times New Roman"/>
       <w:i/>
-      <w:color w:val="000000"/>
-      <w:sz w:val="24"/>
     </w:rPr>
   </w:style>
   <w:style w:customStyle="1" w:styleId="TableCaption" w:type="paragraph">
@@ -14128,90 +14107,44 @@
     <w:basedOn w:val="Caption"/>
     <w:pPr>
       <w:keepNext/>
-      <w:spacing w:line="276" w:lineRule="auto"/>
-      <w:jc w:val="both"/>
     </w:pPr>
-    <w:rPr>
-      <w:rFonts w:ascii="Times New Roman" w:eastAsia="Times New Roman" w:hAnsi="Times New Roman"/>
-      <w:color w:val="000000"/>
-      <w:sz w:val="24"/>
-    </w:rPr>
   </w:style>
   <w:style w:customStyle="1" w:styleId="ImageCaption" w:type="paragraph">
     <w:name w:val="Image Caption"/>
     <w:basedOn w:val="Caption"/>
-    <w:pPr>
-      <w:spacing w:line="276" w:lineRule="auto"/>
-      <w:jc w:val="both"/>
-    </w:pPr>
-    <w:rPr>
-      <w:rFonts w:ascii="Times New Roman" w:eastAsia="Times New Roman" w:hAnsi="Times New Roman"/>
-      <w:color w:val="000000"/>
-      <w:sz w:val="24"/>
-    </w:rPr>
   </w:style>
   <w:style w:customStyle="1" w:styleId="Figure" w:type="paragraph">
     <w:name w:val="Figure"/>
     <w:basedOn w:val="Normal"/>
-    <w:pPr>
-      <w:spacing w:line="276" w:lineRule="auto"/>
-      <w:jc w:val="both"/>
-    </w:pPr>
-    <w:rPr>
-      <w:rFonts w:ascii="Times New Roman" w:eastAsia="Times New Roman" w:hAnsi="Times New Roman"/>
-      <w:color w:val="000000"/>
-      <w:sz w:val="24"/>
-    </w:rPr>
   </w:style>
   <w:style w:customStyle="1" w:styleId="CaptionedFigure" w:type="paragraph">
     <w:name w:val="Captioned Figure"/>
     <w:basedOn w:val="Figure"/>
     <w:pPr>
       <w:keepNext/>
-      <w:spacing w:line="276" w:lineRule="auto"/>
-      <w:jc w:val="both"/>
     </w:pPr>
-    <w:rPr>
-      <w:rFonts w:ascii="Times New Roman" w:eastAsia="Times New Roman" w:hAnsi="Times New Roman"/>
-      <w:color w:val="000000"/>
-      <w:sz w:val="24"/>
-    </w:rPr>
   </w:style>
   <w:style w:customStyle="1" w:styleId="BodyTextChar" w:type="character">
     <w:name w:val="Body Text Char"/>
     <w:basedOn w:val="DefaultParagraphFont"/>
     <w:link w:val="BodyText"/>
-    <w:rPr>
-      <w:rFonts w:ascii="Times New Roman" w:eastAsia="Times New Roman" w:hAnsi="Times New Roman"/>
-      <w:color w:val="000000"/>
-      <w:sz w:val="24"/>
-    </w:rPr>
   </w:style>
   <w:style w:customStyle="1" w:styleId="VerbatimChar" w:type="character">
     <w:name w:val="Verbatim Char"/>
     <w:basedOn w:val="BodyTextChar"/>
     <w:rPr>
-      <w:rFonts w:ascii="Times New Roman" w:eastAsia="Times New Roman" w:hAnsi="Times New Roman"/>
-      <w:color w:val="000000"/>
-      <w:sz w:val="24"/>
+      <w:rFonts w:ascii="Consolas" w:hAnsi="Consolas"/>
+      <w:sz w:val="22"/>
     </w:rPr>
   </w:style>
   <w:style w:customStyle="1" w:styleId="SectionNumber" w:type="character">
     <w:name w:val="Section Number"/>
     <w:basedOn w:val="BodyTextChar"/>
-    <w:rPr>
-      <w:rFonts w:ascii="Times New Roman" w:eastAsia="Times New Roman" w:hAnsi="Times New Roman"/>
-      <w:color w:val="000000"/>
-      <w:sz w:val="24"/>
-    </w:rPr>
   </w:style>
   <w:style w:styleId="FootnoteReference" w:type="character">
     <w:name w:val="Footnote Reference"/>
     <w:basedOn w:val="BodyTextChar"/>
     <w:rPr>
-      <w:rFonts w:ascii="Times New Roman" w:eastAsia="Times New Roman" w:hAnsi="Times New Roman"/>
-      <w:color w:val="000000"/>
-      <w:sz w:val="24"/>
       <w:vertAlign w:val="superscript"/>
     </w:rPr>
   </w:style>
@@ -14219,9 +14152,7 @@
     <w:name w:val="Hyperlink"/>
     <w:basedOn w:val="BodyTextChar"/>
     <w:rPr>
-      <w:rFonts w:ascii="Times New Roman" w:eastAsia="Times New Roman" w:hAnsi="Times New Roman"/>
-      <w:color w:val="000000"/>
-      <w:sz w:val="24"/>
+      <w:color w:themeColor="accent1" w:val="4F81BD"/>
     </w:rPr>
   </w:style>
   <w:style w:styleId="TOCHeading" w:type="paragraph">
@@ -14232,16 +14163,14 @@
     <w:unhideWhenUsed/>
     <w:qFormat/>
     <w:pPr>
-      <w:spacing w:before="240" w:line="276" w:lineRule="auto"/>
-      <w:jc w:val="both"/>
+      <w:spacing w:before="240" w:line="259" w:lineRule="auto"/>
       <w:outlineLvl w:val="9"/>
     </w:pPr>
     <w:rPr>
-      <w:rFonts w:ascii="Times New Roman" w:asciiTheme="majorHAnsi" w:cstheme="majorBidi" w:eastAsia="Times New Roman" w:eastAsiaTheme="majorEastAsia" w:hAnsi="Times New Roman" w:hAnsiTheme="majorHAnsi"/>
+      <w:rFonts w:asciiTheme="majorHAnsi" w:cstheme="majorBidi" w:eastAsiaTheme="majorEastAsia" w:hAnsiTheme="majorHAnsi"/>
       <w:b w:val="0"/>
       <w:bCs w:val="0"/>
-      <w:color w:val="000000"/>
-      <w:sz w:val="24"/>
+      <w:color w:themeColor="accent1" w:themeShade="BF" w:val="365F91"/>
     </w:rPr>
   </w:style>
   <w:style w:type="paragraph" w:customStyle="1" w:styleId="SourceCode">

</xml_diff>